<commit_message>
Finish UI design for some module. user #5, asset #4, request(create request) #1. gitignore backup for drawio and docx.
</commit_message>
<xml_diff>
--- a/design/permission-role.docx
+++ b/design/permission-role.docx
@@ -16,14 +16,14 @@
         </w:tblCellMar>
       </w:tblPr>
       <w:tblGrid>
-        <w:gridCol w:w="3445"/>
-        <w:gridCol w:w="399"/>
-        <w:gridCol w:w="404"/>
-        <w:gridCol w:w="402"/>
-        <w:gridCol w:w="404"/>
-        <w:gridCol w:w="2621"/>
-        <w:gridCol w:w="3516"/>
-        <w:gridCol w:w="3377"/>
+        <w:gridCol w:w="2732"/>
+        <w:gridCol w:w="450"/>
+        <w:gridCol w:w="450"/>
+        <w:gridCol w:w="450"/>
+        <w:gridCol w:w="450"/>
+        <w:gridCol w:w="2700"/>
+        <w:gridCol w:w="4500"/>
+        <w:gridCol w:w="2836"/>
       </w:tblGrid>
       <w:tr>
         <w:trPr>
@@ -31,7 +31,7 @@
         </w:trPr>
         <w:tc>
           <w:tcPr>
-            <w:tcW w:w="3445" w:type="dxa"/>
+            <w:tcW w:w="2732" w:type="dxa"/>
             <w:tcBorders>
               <w:top w:val="single" w:sz="2" w:space="0" w:color="000000"/>
               <w:left w:val="single" w:sz="2" w:space="0" w:color="000000"/>
@@ -61,7 +61,7 @@
         </w:tc>
         <w:tc>
           <w:tcPr>
-            <w:tcW w:w="399" w:type="dxa"/>
+            <w:tcW w:w="450" w:type="dxa"/>
             <w:tcBorders>
               <w:top w:val="single" w:sz="2" w:space="0" w:color="000000"/>
               <w:left w:val="single" w:sz="2" w:space="0" w:color="000000"/>
@@ -91,7 +91,7 @@
         </w:tc>
         <w:tc>
           <w:tcPr>
-            <w:tcW w:w="404" w:type="dxa"/>
+            <w:tcW w:w="450" w:type="dxa"/>
             <w:tcBorders>
               <w:top w:val="single" w:sz="2" w:space="0" w:color="000000"/>
               <w:left w:val="single" w:sz="2" w:space="0" w:color="000000"/>
@@ -121,7 +121,7 @@
         </w:tc>
         <w:tc>
           <w:tcPr>
-            <w:tcW w:w="402" w:type="dxa"/>
+            <w:tcW w:w="450" w:type="dxa"/>
             <w:tcBorders>
               <w:top w:val="single" w:sz="2" w:space="0" w:color="000000"/>
               <w:left w:val="single" w:sz="2" w:space="0" w:color="000000"/>
@@ -151,7 +151,7 @@
         </w:tc>
         <w:tc>
           <w:tcPr>
-            <w:tcW w:w="404" w:type="dxa"/>
+            <w:tcW w:w="450" w:type="dxa"/>
             <w:tcBorders>
               <w:top w:val="single" w:sz="2" w:space="0" w:color="000000"/>
               <w:left w:val="single" w:sz="2" w:space="0" w:color="000000"/>
@@ -181,7 +181,7 @@
         </w:tc>
         <w:tc>
           <w:tcPr>
-            <w:tcW w:w="2621" w:type="dxa"/>
+            <w:tcW w:w="2700" w:type="dxa"/>
             <w:tcBorders>
               <w:top w:val="single" w:sz="2" w:space="0" w:color="000000"/>
               <w:left w:val="single" w:sz="2" w:space="0" w:color="000000"/>
@@ -211,7 +211,7 @@
         </w:tc>
         <w:tc>
           <w:tcPr>
-            <w:tcW w:w="3516" w:type="dxa"/>
+            <w:tcW w:w="4500" w:type="dxa"/>
             <w:tcBorders>
               <w:top w:val="single" w:sz="2" w:space="0" w:color="000000"/>
               <w:left w:val="single" w:sz="2" w:space="0" w:color="000000"/>
@@ -241,7 +241,7 @@
         </w:tc>
         <w:tc>
           <w:tcPr>
-            <w:tcW w:w="3377" w:type="dxa"/>
+            <w:tcW w:w="2836" w:type="dxa"/>
             <w:tcBorders>
               <w:top w:val="single" w:sz="2" w:space="0" w:color="000000"/>
               <w:left w:val="single" w:sz="2" w:space="0" w:color="000000"/>
@@ -275,7 +275,7 @@
         <w:trPr/>
         <w:tc>
           <w:tcPr>
-            <w:tcW w:w="3445" w:type="dxa"/>
+            <w:tcW w:w="2732" w:type="dxa"/>
             <w:vMerge w:val="restart"/>
             <w:tcBorders>
               <w:left w:val="single" w:sz="2" w:space="0" w:color="000000"/>
@@ -298,7 +298,7 @@
         </w:tc>
         <w:tc>
           <w:tcPr>
-            <w:tcW w:w="399" w:type="dxa"/>
+            <w:tcW w:w="450" w:type="dxa"/>
             <w:vMerge w:val="restart"/>
             <w:tcBorders>
               <w:left w:val="single" w:sz="2" w:space="0" w:color="000000"/>
@@ -321,7 +321,7 @@
         </w:tc>
         <w:tc>
           <w:tcPr>
-            <w:tcW w:w="404" w:type="dxa"/>
+            <w:tcW w:w="450" w:type="dxa"/>
             <w:vMerge w:val="restart"/>
             <w:tcBorders>
               <w:left w:val="single" w:sz="2" w:space="0" w:color="000000"/>
@@ -344,7 +344,7 @@
         </w:tc>
         <w:tc>
           <w:tcPr>
-            <w:tcW w:w="402" w:type="dxa"/>
+            <w:tcW w:w="450" w:type="dxa"/>
             <w:vMerge w:val="restart"/>
             <w:tcBorders>
               <w:left w:val="single" w:sz="2" w:space="0" w:color="000000"/>
@@ -366,7 +366,7 @@
         </w:tc>
         <w:tc>
           <w:tcPr>
-            <w:tcW w:w="404" w:type="dxa"/>
+            <w:tcW w:w="450" w:type="dxa"/>
             <w:vMerge w:val="restart"/>
             <w:tcBorders>
               <w:left w:val="single" w:sz="2" w:space="0" w:color="000000"/>
@@ -388,7 +388,7 @@
         </w:tc>
         <w:tc>
           <w:tcPr>
-            <w:tcW w:w="2621" w:type="dxa"/>
+            <w:tcW w:w="2700" w:type="dxa"/>
             <w:vMerge w:val="restart"/>
             <w:tcBorders>
               <w:left w:val="single" w:sz="2" w:space="0" w:color="000000"/>
@@ -411,7 +411,7 @@
         </w:tc>
         <w:tc>
           <w:tcPr>
-            <w:tcW w:w="3516" w:type="dxa"/>
+            <w:tcW w:w="4500" w:type="dxa"/>
             <w:tcBorders>
               <w:left w:val="single" w:sz="2" w:space="0" w:color="000000"/>
               <w:bottom w:val="single" w:sz="2" w:space="0" w:color="000000"/>
@@ -433,7 +433,7 @@
         </w:tc>
         <w:tc>
           <w:tcPr>
-            <w:tcW w:w="3377" w:type="dxa"/>
+            <w:tcW w:w="2836" w:type="dxa"/>
             <w:vMerge w:val="restart"/>
             <w:tcBorders>
               <w:left w:val="single" w:sz="2" w:space="0" w:color="000000"/>
@@ -460,165 +460,161 @@
         <w:trPr/>
         <w:tc>
           <w:tcPr>
-            <w:tcW w:w="3445" w:type="dxa"/>
-            <w:vMerge w:val="continue"/>
-            <w:tcBorders>
-              <w:left w:val="single" w:sz="2" w:space="0" w:color="000000"/>
-              <w:bottom w:val="single" w:sz="2" w:space="0" w:color="000000"/>
-            </w:tcBorders>
-          </w:tcPr>
-          <w:p>
-            <w:pPr>
-              <w:pStyle w:val="TableContents"/>
-              <w:widowControl w:val="false"/>
-              <w:bidi w:val="0"/>
-              <w:jc w:val="left"/>
-              <w:rPr/>
-            </w:pPr>
-            <w:r>
-              <w:rPr/>
-            </w:r>
-          </w:p>
-        </w:tc>
-        <w:tc>
-          <w:tcPr>
-            <w:tcW w:w="399" w:type="dxa"/>
-            <w:vMerge w:val="continue"/>
-            <w:tcBorders>
-              <w:left w:val="single" w:sz="2" w:space="0" w:color="000000"/>
-              <w:bottom w:val="single" w:sz="2" w:space="0" w:color="000000"/>
-            </w:tcBorders>
-          </w:tcPr>
-          <w:p>
-            <w:pPr>
-              <w:pStyle w:val="TableContents"/>
-              <w:widowControl w:val="false"/>
-              <w:bidi w:val="0"/>
-              <w:jc w:val="center"/>
-              <w:rPr/>
-            </w:pPr>
-            <w:r>
-              <w:rPr/>
-            </w:r>
-          </w:p>
-        </w:tc>
-        <w:tc>
-          <w:tcPr>
-            <w:tcW w:w="404" w:type="dxa"/>
-            <w:vMerge w:val="continue"/>
-            <w:tcBorders>
-              <w:left w:val="single" w:sz="2" w:space="0" w:color="000000"/>
-              <w:bottom w:val="single" w:sz="2" w:space="0" w:color="000000"/>
-            </w:tcBorders>
-          </w:tcPr>
-          <w:p>
-            <w:pPr>
-              <w:pStyle w:val="TableContents"/>
-              <w:widowControl w:val="false"/>
-              <w:bidi w:val="0"/>
-              <w:jc w:val="center"/>
-              <w:rPr/>
-            </w:pPr>
-            <w:r>
-              <w:rPr/>
-            </w:r>
-          </w:p>
-        </w:tc>
-        <w:tc>
-          <w:tcPr>
-            <w:tcW w:w="402" w:type="dxa"/>
-            <w:vMerge w:val="continue"/>
-            <w:tcBorders>
-              <w:left w:val="single" w:sz="2" w:space="0" w:color="000000"/>
-              <w:bottom w:val="single" w:sz="2" w:space="0" w:color="000000"/>
-            </w:tcBorders>
-          </w:tcPr>
-          <w:p>
-            <w:pPr>
-              <w:pStyle w:val="TableContents"/>
-              <w:widowControl w:val="false"/>
-              <w:bidi w:val="0"/>
-              <w:jc w:val="center"/>
-              <w:rPr/>
-            </w:pPr>
-            <w:r>
-              <w:rPr/>
-            </w:r>
-          </w:p>
-        </w:tc>
-        <w:tc>
-          <w:tcPr>
-            <w:tcW w:w="404" w:type="dxa"/>
-            <w:vMerge w:val="continue"/>
-            <w:tcBorders>
-              <w:left w:val="single" w:sz="2" w:space="0" w:color="000000"/>
-              <w:bottom w:val="single" w:sz="2" w:space="0" w:color="000000"/>
-            </w:tcBorders>
-          </w:tcPr>
-          <w:p>
-            <w:pPr>
-              <w:pStyle w:val="TableContents"/>
-              <w:widowControl w:val="false"/>
-              <w:bidi w:val="0"/>
-              <w:jc w:val="center"/>
-              <w:rPr/>
-            </w:pPr>
-            <w:r>
-              <w:rPr/>
-            </w:r>
-          </w:p>
-        </w:tc>
-        <w:tc>
-          <w:tcPr>
-            <w:tcW w:w="2621" w:type="dxa"/>
-            <w:vMerge w:val="continue"/>
-            <w:tcBorders>
-              <w:left w:val="single" w:sz="2" w:space="0" w:color="000000"/>
-              <w:bottom w:val="single" w:sz="2" w:space="0" w:color="000000"/>
-            </w:tcBorders>
-          </w:tcPr>
-          <w:p>
-            <w:pPr>
-              <w:pStyle w:val="TableContents"/>
-              <w:widowControl w:val="false"/>
-              <w:bidi w:val="0"/>
-              <w:jc w:val="left"/>
-              <w:rPr/>
-            </w:pPr>
-            <w:r>
-              <w:rPr/>
-            </w:r>
-          </w:p>
-        </w:tc>
-        <w:tc>
-          <w:tcPr>
-            <w:tcW w:w="3516" w:type="dxa"/>
-            <w:tcBorders>
-              <w:left w:val="single" w:sz="2" w:space="0" w:color="000000"/>
-              <w:bottom w:val="single" w:sz="2" w:space="0" w:color="000000"/>
-            </w:tcBorders>
-          </w:tcPr>
-          <w:p>
-            <w:pPr>
-              <w:pStyle w:val="TableContents"/>
-              <w:widowControl w:val="false"/>
-              <w:bidi w:val="0"/>
-              <w:jc w:val="left"/>
-              <w:rPr/>
-            </w:pPr>
-            <w:r>
-              <w:rPr/>
-              <w:t>POST /</w:t>
-            </w:r>
-            <w:r>
-              <w:rPr/>
-              <w:t>users/create</w:t>
-            </w:r>
-          </w:p>
-        </w:tc>
-        <w:tc>
-          <w:tcPr>
-            <w:tcW w:w="3377" w:type="dxa"/>
+            <w:tcW w:w="2732" w:type="dxa"/>
+            <w:vMerge w:val="continue"/>
+            <w:tcBorders>
+              <w:left w:val="single" w:sz="2" w:space="0" w:color="000000"/>
+              <w:bottom w:val="single" w:sz="2" w:space="0" w:color="000000"/>
+            </w:tcBorders>
+          </w:tcPr>
+          <w:p>
+            <w:pPr>
+              <w:pStyle w:val="TableContents"/>
+              <w:widowControl w:val="false"/>
+              <w:bidi w:val="0"/>
+              <w:jc w:val="left"/>
+              <w:rPr/>
+            </w:pPr>
+            <w:r>
+              <w:rPr/>
+            </w:r>
+          </w:p>
+        </w:tc>
+        <w:tc>
+          <w:tcPr>
+            <w:tcW w:w="450" w:type="dxa"/>
+            <w:vMerge w:val="continue"/>
+            <w:tcBorders>
+              <w:left w:val="single" w:sz="2" w:space="0" w:color="000000"/>
+              <w:bottom w:val="single" w:sz="2" w:space="0" w:color="000000"/>
+            </w:tcBorders>
+          </w:tcPr>
+          <w:p>
+            <w:pPr>
+              <w:pStyle w:val="TableContents"/>
+              <w:widowControl w:val="false"/>
+              <w:bidi w:val="0"/>
+              <w:jc w:val="center"/>
+              <w:rPr/>
+            </w:pPr>
+            <w:r>
+              <w:rPr/>
+            </w:r>
+          </w:p>
+        </w:tc>
+        <w:tc>
+          <w:tcPr>
+            <w:tcW w:w="450" w:type="dxa"/>
+            <w:vMerge w:val="continue"/>
+            <w:tcBorders>
+              <w:left w:val="single" w:sz="2" w:space="0" w:color="000000"/>
+              <w:bottom w:val="single" w:sz="2" w:space="0" w:color="000000"/>
+            </w:tcBorders>
+          </w:tcPr>
+          <w:p>
+            <w:pPr>
+              <w:pStyle w:val="TableContents"/>
+              <w:widowControl w:val="false"/>
+              <w:bidi w:val="0"/>
+              <w:jc w:val="center"/>
+              <w:rPr/>
+            </w:pPr>
+            <w:r>
+              <w:rPr/>
+            </w:r>
+          </w:p>
+        </w:tc>
+        <w:tc>
+          <w:tcPr>
+            <w:tcW w:w="450" w:type="dxa"/>
+            <w:vMerge w:val="continue"/>
+            <w:tcBorders>
+              <w:left w:val="single" w:sz="2" w:space="0" w:color="000000"/>
+              <w:bottom w:val="single" w:sz="2" w:space="0" w:color="000000"/>
+            </w:tcBorders>
+          </w:tcPr>
+          <w:p>
+            <w:pPr>
+              <w:pStyle w:val="TableContents"/>
+              <w:widowControl w:val="false"/>
+              <w:bidi w:val="0"/>
+              <w:jc w:val="center"/>
+              <w:rPr/>
+            </w:pPr>
+            <w:r>
+              <w:rPr/>
+            </w:r>
+          </w:p>
+        </w:tc>
+        <w:tc>
+          <w:tcPr>
+            <w:tcW w:w="450" w:type="dxa"/>
+            <w:vMerge w:val="continue"/>
+            <w:tcBorders>
+              <w:left w:val="single" w:sz="2" w:space="0" w:color="000000"/>
+              <w:bottom w:val="single" w:sz="2" w:space="0" w:color="000000"/>
+            </w:tcBorders>
+          </w:tcPr>
+          <w:p>
+            <w:pPr>
+              <w:pStyle w:val="TableContents"/>
+              <w:widowControl w:val="false"/>
+              <w:bidi w:val="0"/>
+              <w:jc w:val="center"/>
+              <w:rPr/>
+            </w:pPr>
+            <w:r>
+              <w:rPr/>
+            </w:r>
+          </w:p>
+        </w:tc>
+        <w:tc>
+          <w:tcPr>
+            <w:tcW w:w="2700" w:type="dxa"/>
+            <w:vMerge w:val="continue"/>
+            <w:tcBorders>
+              <w:left w:val="single" w:sz="2" w:space="0" w:color="000000"/>
+              <w:bottom w:val="single" w:sz="2" w:space="0" w:color="000000"/>
+            </w:tcBorders>
+          </w:tcPr>
+          <w:p>
+            <w:pPr>
+              <w:pStyle w:val="TableContents"/>
+              <w:widowControl w:val="false"/>
+              <w:bidi w:val="0"/>
+              <w:jc w:val="left"/>
+              <w:rPr/>
+            </w:pPr>
+            <w:r>
+              <w:rPr/>
+            </w:r>
+          </w:p>
+        </w:tc>
+        <w:tc>
+          <w:tcPr>
+            <w:tcW w:w="4500" w:type="dxa"/>
+            <w:tcBorders>
+              <w:left w:val="single" w:sz="2" w:space="0" w:color="000000"/>
+              <w:bottom w:val="single" w:sz="2" w:space="0" w:color="000000"/>
+            </w:tcBorders>
+          </w:tcPr>
+          <w:p>
+            <w:pPr>
+              <w:pStyle w:val="TableContents"/>
+              <w:widowControl w:val="false"/>
+              <w:bidi w:val="0"/>
+              <w:jc w:val="left"/>
+              <w:rPr/>
+            </w:pPr>
+            <w:r>
+              <w:rPr/>
+              <w:t>POST /users/create</w:t>
+            </w:r>
+          </w:p>
+        </w:tc>
+        <w:tc>
+          <w:tcPr>
+            <w:tcW w:w="2836" w:type="dxa"/>
             <w:vMerge w:val="continue"/>
             <w:tcBorders>
               <w:left w:val="single" w:sz="2" w:space="0" w:color="000000"/>
@@ -644,7 +640,7 @@
         <w:trPr/>
         <w:tc>
           <w:tcPr>
-            <w:tcW w:w="3445" w:type="dxa"/>
+            <w:tcW w:w="2732" w:type="dxa"/>
             <w:tcBorders>
               <w:left w:val="single" w:sz="2" w:space="0" w:color="000000"/>
               <w:bottom w:val="single" w:sz="2" w:space="0" w:color="000000"/>
@@ -666,7 +662,7 @@
         </w:tc>
         <w:tc>
           <w:tcPr>
-            <w:tcW w:w="399" w:type="dxa"/>
+            <w:tcW w:w="450" w:type="dxa"/>
             <w:tcBorders>
               <w:left w:val="single" w:sz="2" w:space="0" w:color="000000"/>
               <w:bottom w:val="single" w:sz="2" w:space="0" w:color="000000"/>
@@ -688,7 +684,7 @@
         </w:tc>
         <w:tc>
           <w:tcPr>
-            <w:tcW w:w="404" w:type="dxa"/>
+            <w:tcW w:w="450" w:type="dxa"/>
             <w:tcBorders>
               <w:left w:val="single" w:sz="2" w:space="0" w:color="000000"/>
               <w:bottom w:val="single" w:sz="2" w:space="0" w:color="000000"/>
@@ -710,7 +706,7 @@
         </w:tc>
         <w:tc>
           <w:tcPr>
-            <w:tcW w:w="402" w:type="dxa"/>
+            <w:tcW w:w="450" w:type="dxa"/>
             <w:tcBorders>
               <w:left w:val="single" w:sz="2" w:space="0" w:color="000000"/>
               <w:bottom w:val="single" w:sz="2" w:space="0" w:color="000000"/>
@@ -732,28 +728,28 @@
         </w:tc>
         <w:tc>
           <w:tcPr>
-            <w:tcW w:w="404" w:type="dxa"/>
-            <w:tcBorders>
-              <w:left w:val="single" w:sz="2" w:space="0" w:color="000000"/>
-              <w:bottom w:val="single" w:sz="2" w:space="0" w:color="000000"/>
-            </w:tcBorders>
-          </w:tcPr>
-          <w:p>
-            <w:pPr>
-              <w:pStyle w:val="TableContents"/>
-              <w:widowControl w:val="false"/>
-              <w:bidi w:val="0"/>
-              <w:jc w:val="center"/>
-              <w:rPr/>
-            </w:pPr>
-            <w:r>
-              <w:rPr/>
-            </w:r>
-          </w:p>
-        </w:tc>
-        <w:tc>
-          <w:tcPr>
-            <w:tcW w:w="2621" w:type="dxa"/>
+            <w:tcW w:w="450" w:type="dxa"/>
+            <w:tcBorders>
+              <w:left w:val="single" w:sz="2" w:space="0" w:color="000000"/>
+              <w:bottom w:val="single" w:sz="2" w:space="0" w:color="000000"/>
+            </w:tcBorders>
+          </w:tcPr>
+          <w:p>
+            <w:pPr>
+              <w:pStyle w:val="TableContents"/>
+              <w:widowControl w:val="false"/>
+              <w:bidi w:val="0"/>
+              <w:jc w:val="center"/>
+              <w:rPr/>
+            </w:pPr>
+            <w:r>
+              <w:rPr/>
+            </w:r>
+          </w:p>
+        </w:tc>
+        <w:tc>
+          <w:tcPr>
+            <w:tcW w:w="2700" w:type="dxa"/>
             <w:tcBorders>
               <w:left w:val="single" w:sz="2" w:space="0" w:color="000000"/>
               <w:bottom w:val="single" w:sz="2" w:space="0" w:color="000000"/>
@@ -775,7 +771,7 @@
         </w:tc>
         <w:tc>
           <w:tcPr>
-            <w:tcW w:w="3516" w:type="dxa"/>
+            <w:tcW w:w="4500" w:type="dxa"/>
             <w:tcBorders>
               <w:left w:val="single" w:sz="2" w:space="0" w:color="000000"/>
               <w:bottom w:val="single" w:sz="2" w:space="0" w:color="000000"/>
@@ -797,7 +793,7 @@
         </w:tc>
         <w:tc>
           <w:tcPr>
-            <w:tcW w:w="3377" w:type="dxa"/>
+            <w:tcW w:w="2836" w:type="dxa"/>
             <w:vMerge w:val="continue"/>
             <w:tcBorders>
               <w:left w:val="single" w:sz="2" w:space="0" w:color="000000"/>
@@ -823,7 +819,7 @@
         <w:trPr/>
         <w:tc>
           <w:tcPr>
-            <w:tcW w:w="3445" w:type="dxa"/>
+            <w:tcW w:w="2732" w:type="dxa"/>
             <w:tcBorders>
               <w:left w:val="single" w:sz="2" w:space="0" w:color="000000"/>
               <w:bottom w:val="single" w:sz="2" w:space="0" w:color="000000"/>
@@ -845,7 +841,7 @@
         </w:tc>
         <w:tc>
           <w:tcPr>
-            <w:tcW w:w="399" w:type="dxa"/>
+            <w:tcW w:w="450" w:type="dxa"/>
             <w:tcBorders>
               <w:left w:val="single" w:sz="2" w:space="0" w:color="000000"/>
               <w:bottom w:val="single" w:sz="2" w:space="0" w:color="000000"/>
@@ -867,7 +863,7 @@
         </w:tc>
         <w:tc>
           <w:tcPr>
-            <w:tcW w:w="404" w:type="dxa"/>
+            <w:tcW w:w="450" w:type="dxa"/>
             <w:tcBorders>
               <w:left w:val="single" w:sz="2" w:space="0" w:color="000000"/>
               <w:bottom w:val="single" w:sz="2" w:space="0" w:color="000000"/>
@@ -889,49 +885,49 @@
         </w:tc>
         <w:tc>
           <w:tcPr>
-            <w:tcW w:w="402" w:type="dxa"/>
-            <w:tcBorders>
-              <w:left w:val="single" w:sz="2" w:space="0" w:color="000000"/>
-              <w:bottom w:val="single" w:sz="2" w:space="0" w:color="000000"/>
-            </w:tcBorders>
-          </w:tcPr>
-          <w:p>
-            <w:pPr>
-              <w:pStyle w:val="TableContents"/>
-              <w:widowControl w:val="false"/>
-              <w:bidi w:val="0"/>
-              <w:jc w:val="center"/>
-              <w:rPr/>
-            </w:pPr>
-            <w:r>
-              <w:rPr/>
-            </w:r>
-          </w:p>
-        </w:tc>
-        <w:tc>
-          <w:tcPr>
-            <w:tcW w:w="404" w:type="dxa"/>
-            <w:tcBorders>
-              <w:left w:val="single" w:sz="2" w:space="0" w:color="000000"/>
-              <w:bottom w:val="single" w:sz="2" w:space="0" w:color="000000"/>
-            </w:tcBorders>
-          </w:tcPr>
-          <w:p>
-            <w:pPr>
-              <w:pStyle w:val="TableContents"/>
-              <w:widowControl w:val="false"/>
-              <w:bidi w:val="0"/>
-              <w:jc w:val="center"/>
-              <w:rPr/>
-            </w:pPr>
-            <w:r>
-              <w:rPr/>
-            </w:r>
-          </w:p>
-        </w:tc>
-        <w:tc>
-          <w:tcPr>
-            <w:tcW w:w="2621" w:type="dxa"/>
+            <w:tcW w:w="450" w:type="dxa"/>
+            <w:tcBorders>
+              <w:left w:val="single" w:sz="2" w:space="0" w:color="000000"/>
+              <w:bottom w:val="single" w:sz="2" w:space="0" w:color="000000"/>
+            </w:tcBorders>
+          </w:tcPr>
+          <w:p>
+            <w:pPr>
+              <w:pStyle w:val="TableContents"/>
+              <w:widowControl w:val="false"/>
+              <w:bidi w:val="0"/>
+              <w:jc w:val="center"/>
+              <w:rPr/>
+            </w:pPr>
+            <w:r>
+              <w:rPr/>
+            </w:r>
+          </w:p>
+        </w:tc>
+        <w:tc>
+          <w:tcPr>
+            <w:tcW w:w="450" w:type="dxa"/>
+            <w:tcBorders>
+              <w:left w:val="single" w:sz="2" w:space="0" w:color="000000"/>
+              <w:bottom w:val="single" w:sz="2" w:space="0" w:color="000000"/>
+            </w:tcBorders>
+          </w:tcPr>
+          <w:p>
+            <w:pPr>
+              <w:pStyle w:val="TableContents"/>
+              <w:widowControl w:val="false"/>
+              <w:bidi w:val="0"/>
+              <w:jc w:val="center"/>
+              <w:rPr/>
+            </w:pPr>
+            <w:r>
+              <w:rPr/>
+            </w:r>
+          </w:p>
+        </w:tc>
+        <w:tc>
+          <w:tcPr>
+            <w:tcW w:w="2700" w:type="dxa"/>
             <w:tcBorders>
               <w:left w:val="single" w:sz="2" w:space="0" w:color="000000"/>
               <w:bottom w:val="single" w:sz="2" w:space="0" w:color="000000"/>
@@ -953,7 +949,7 @@
         </w:tc>
         <w:tc>
           <w:tcPr>
-            <w:tcW w:w="3516" w:type="dxa"/>
+            <w:tcW w:w="4500" w:type="dxa"/>
             <w:tcBorders>
               <w:left w:val="single" w:sz="2" w:space="0" w:color="000000"/>
               <w:bottom w:val="single" w:sz="2" w:space="0" w:color="000000"/>
@@ -975,7 +971,7 @@
         </w:tc>
         <w:tc>
           <w:tcPr>
-            <w:tcW w:w="3377" w:type="dxa"/>
+            <w:tcW w:w="2836" w:type="dxa"/>
             <w:vMerge w:val="continue"/>
             <w:tcBorders>
               <w:left w:val="single" w:sz="2" w:space="0" w:color="000000"/>
@@ -1001,12 +997,25 @@
         <w:trPr/>
         <w:tc>
           <w:tcPr>
-            <w:tcW w:w="3445" w:type="dxa"/>
-            <w:tcBorders>
-              <w:left w:val="single" w:sz="2" w:space="0" w:color="000000"/>
-              <w:bottom w:val="single" w:sz="2" w:space="0" w:color="000000"/>
-            </w:tcBorders>
-          </w:tcPr>
+            <w:tcW w:w="2732" w:type="dxa"/>
+            <w:vMerge w:val="restart"/>
+            <w:tcBorders>
+              <w:left w:val="single" w:sz="2" w:space="0" w:color="000000"/>
+              <w:bottom w:val="single" w:sz="2" w:space="0" w:color="000000"/>
+            </w:tcBorders>
+          </w:tcPr>
+          <w:p>
+            <w:pPr>
+              <w:pStyle w:val="TableContents"/>
+              <w:widowControl w:val="false"/>
+              <w:bidi w:val="0"/>
+              <w:jc w:val="left"/>
+              <w:rPr/>
+            </w:pPr>
+            <w:r>
+              <w:rPr/>
+            </w:r>
+          </w:p>
           <w:p>
             <w:pPr>
               <w:pStyle w:val="TableContents"/>
@@ -1023,12 +1032,25 @@
         </w:tc>
         <w:tc>
           <w:tcPr>
-            <w:tcW w:w="399" w:type="dxa"/>
-            <w:tcBorders>
-              <w:left w:val="single" w:sz="2" w:space="0" w:color="000000"/>
-              <w:bottom w:val="single" w:sz="2" w:space="0" w:color="000000"/>
-            </w:tcBorders>
-          </w:tcPr>
+            <w:tcW w:w="450" w:type="dxa"/>
+            <w:vMerge w:val="restart"/>
+            <w:tcBorders>
+              <w:left w:val="single" w:sz="2" w:space="0" w:color="000000"/>
+              <w:bottom w:val="single" w:sz="2" w:space="0" w:color="000000"/>
+            </w:tcBorders>
+          </w:tcPr>
+          <w:p>
+            <w:pPr>
+              <w:pStyle w:val="TableContents"/>
+              <w:widowControl w:val="false"/>
+              <w:bidi w:val="0"/>
+              <w:jc w:val="center"/>
+              <w:rPr/>
+            </w:pPr>
+            <w:r>
+              <w:rPr/>
+            </w:r>
+          </w:p>
           <w:p>
             <w:pPr>
               <w:pStyle w:val="TableContents"/>
@@ -1045,12 +1067,25 @@
         </w:tc>
         <w:tc>
           <w:tcPr>
-            <w:tcW w:w="404" w:type="dxa"/>
-            <w:tcBorders>
-              <w:left w:val="single" w:sz="2" w:space="0" w:color="000000"/>
-              <w:bottom w:val="single" w:sz="2" w:space="0" w:color="000000"/>
-            </w:tcBorders>
-          </w:tcPr>
+            <w:tcW w:w="450" w:type="dxa"/>
+            <w:vMerge w:val="restart"/>
+            <w:tcBorders>
+              <w:left w:val="single" w:sz="2" w:space="0" w:color="000000"/>
+              <w:bottom w:val="single" w:sz="2" w:space="0" w:color="000000"/>
+            </w:tcBorders>
+          </w:tcPr>
+          <w:p>
+            <w:pPr>
+              <w:pStyle w:val="TableContents"/>
+              <w:widowControl w:val="false"/>
+              <w:bidi w:val="0"/>
+              <w:jc w:val="center"/>
+              <w:rPr/>
+            </w:pPr>
+            <w:r>
+              <w:rPr/>
+            </w:r>
+          </w:p>
           <w:p>
             <w:pPr>
               <w:pStyle w:val="TableContents"/>
@@ -1067,54 +1102,70 @@
         </w:tc>
         <w:tc>
           <w:tcPr>
-            <w:tcW w:w="402" w:type="dxa"/>
-            <w:tcBorders>
-              <w:left w:val="single" w:sz="2" w:space="0" w:color="000000"/>
-              <w:bottom w:val="single" w:sz="2" w:space="0" w:color="000000"/>
-            </w:tcBorders>
-          </w:tcPr>
-          <w:p>
-            <w:pPr>
-              <w:pStyle w:val="TableContents"/>
-              <w:widowControl w:val="false"/>
-              <w:bidi w:val="0"/>
-              <w:jc w:val="center"/>
-              <w:rPr/>
-            </w:pPr>
-            <w:r>
-              <w:rPr/>
-            </w:r>
-          </w:p>
-        </w:tc>
-        <w:tc>
-          <w:tcPr>
-            <w:tcW w:w="404" w:type="dxa"/>
-            <w:tcBorders>
-              <w:left w:val="single" w:sz="2" w:space="0" w:color="000000"/>
-              <w:bottom w:val="single" w:sz="2" w:space="0" w:color="000000"/>
-            </w:tcBorders>
-          </w:tcPr>
-          <w:p>
-            <w:pPr>
-              <w:pStyle w:val="TableContents"/>
-              <w:widowControl w:val="false"/>
-              <w:bidi w:val="0"/>
-              <w:jc w:val="center"/>
-              <w:rPr/>
-            </w:pPr>
-            <w:r>
-              <w:rPr/>
-            </w:r>
-          </w:p>
-        </w:tc>
-        <w:tc>
-          <w:tcPr>
-            <w:tcW w:w="2621" w:type="dxa"/>
-            <w:tcBorders>
-              <w:left w:val="single" w:sz="2" w:space="0" w:color="000000"/>
-              <w:bottom w:val="single" w:sz="2" w:space="0" w:color="000000"/>
-            </w:tcBorders>
-          </w:tcPr>
+            <w:tcW w:w="450" w:type="dxa"/>
+            <w:vMerge w:val="restart"/>
+            <w:tcBorders>
+              <w:left w:val="single" w:sz="2" w:space="0" w:color="000000"/>
+              <w:bottom w:val="single" w:sz="2" w:space="0" w:color="000000"/>
+            </w:tcBorders>
+          </w:tcPr>
+          <w:p>
+            <w:pPr>
+              <w:pStyle w:val="TableContents"/>
+              <w:widowControl w:val="false"/>
+              <w:bidi w:val="0"/>
+              <w:jc w:val="center"/>
+              <w:rPr/>
+            </w:pPr>
+            <w:r>
+              <w:rPr/>
+            </w:r>
+          </w:p>
+        </w:tc>
+        <w:tc>
+          <w:tcPr>
+            <w:tcW w:w="450" w:type="dxa"/>
+            <w:vMerge w:val="restart"/>
+            <w:tcBorders>
+              <w:left w:val="single" w:sz="2" w:space="0" w:color="000000"/>
+              <w:bottom w:val="single" w:sz="2" w:space="0" w:color="000000"/>
+            </w:tcBorders>
+          </w:tcPr>
+          <w:p>
+            <w:pPr>
+              <w:pStyle w:val="TableContents"/>
+              <w:widowControl w:val="false"/>
+              <w:bidi w:val="0"/>
+              <w:jc w:val="center"/>
+              <w:rPr/>
+            </w:pPr>
+            <w:r>
+              <w:rPr/>
+            </w:r>
+          </w:p>
+        </w:tc>
+        <w:tc>
+          <w:tcPr>
+            <w:tcW w:w="2700" w:type="dxa"/>
+            <w:vMerge w:val="restart"/>
+            <w:tcBorders>
+              <w:left w:val="single" w:sz="2" w:space="0" w:color="000000"/>
+              <w:bottom w:val="single" w:sz="2" w:space="0" w:color="000000"/>
+            </w:tcBorders>
+          </w:tcPr>
+          <w:p>
+            <w:pPr>
+              <w:pStyle w:val="TableContents"/>
+              <w:widowControl w:val="false"/>
+              <w:bidi w:val="0"/>
+              <w:jc w:val="left"/>
+              <w:rPr/>
+            </w:pPr>
+            <w:r>
+              <w:rPr/>
+              <w:t>Update:users</w:t>
+            </w:r>
+          </w:p>
           <w:p>
             <w:pPr>
               <w:pStyle w:val="TableContents"/>
@@ -1131,50 +1182,29 @@
         </w:tc>
         <w:tc>
           <w:tcPr>
-            <w:tcW w:w="3516" w:type="dxa"/>
-            <w:tcBorders>
-              <w:left w:val="single" w:sz="2" w:space="0" w:color="000000"/>
-              <w:bottom w:val="single" w:sz="2" w:space="0" w:color="000000"/>
-            </w:tcBorders>
-          </w:tcPr>
-          <w:p>
-            <w:pPr>
-              <w:pStyle w:val="TableContents"/>
-              <w:widowControl w:val="false"/>
-              <w:bidi w:val="0"/>
-              <w:jc w:val="left"/>
-              <w:rPr/>
-            </w:pPr>
-            <w:r>
-              <w:rPr/>
-              <w:t>GET /users/:</w:t>
-            </w:r>
-            <w:r>
-              <w:rPr/>
-              <w:t>userid/update</w:t>
-            </w:r>
-          </w:p>
-          <w:p>
-            <w:pPr>
-              <w:pStyle w:val="TableContents"/>
-              <w:widowControl w:val="false"/>
-              <w:bidi w:val="0"/>
-              <w:jc w:val="left"/>
-              <w:rPr/>
-            </w:pPr>
-            <w:r>
-              <w:rPr/>
-              <w:t>POST /users/:userid/</w:t>
-            </w:r>
-            <w:r>
-              <w:rPr/>
-              <w:t>update</w:t>
-            </w:r>
-          </w:p>
-        </w:tc>
-        <w:tc>
-          <w:tcPr>
-            <w:tcW w:w="3377" w:type="dxa"/>
+            <w:tcW w:w="4500" w:type="dxa"/>
+            <w:tcBorders>
+              <w:left w:val="single" w:sz="2" w:space="0" w:color="000000"/>
+              <w:bottom w:val="single" w:sz="2" w:space="0" w:color="000000"/>
+            </w:tcBorders>
+          </w:tcPr>
+          <w:p>
+            <w:pPr>
+              <w:pStyle w:val="TableContents"/>
+              <w:widowControl w:val="false"/>
+              <w:bidi w:val="0"/>
+              <w:jc w:val="left"/>
+              <w:rPr/>
+            </w:pPr>
+            <w:r>
+              <w:rPr/>
+              <w:t>GET /users/:userid/update</w:t>
+            </w:r>
+          </w:p>
+        </w:tc>
+        <w:tc>
+          <w:tcPr>
+            <w:tcW w:w="2836" w:type="dxa"/>
             <w:vMerge w:val="continue"/>
             <w:tcBorders>
               <w:left w:val="single" w:sz="2" w:space="0" w:color="000000"/>
@@ -1200,7 +1230,187 @@
         <w:trPr/>
         <w:tc>
           <w:tcPr>
-            <w:tcW w:w="3445" w:type="dxa"/>
+            <w:tcW w:w="2732" w:type="dxa"/>
+            <w:vMerge w:val="continue"/>
+            <w:tcBorders>
+              <w:left w:val="single" w:sz="2" w:space="0" w:color="000000"/>
+              <w:bottom w:val="single" w:sz="2" w:space="0" w:color="000000"/>
+            </w:tcBorders>
+          </w:tcPr>
+          <w:p>
+            <w:pPr>
+              <w:pStyle w:val="TableContents"/>
+              <w:widowControl w:val="false"/>
+              <w:bidi w:val="0"/>
+              <w:jc w:val="left"/>
+              <w:rPr/>
+            </w:pPr>
+            <w:r>
+              <w:rPr/>
+            </w:r>
+          </w:p>
+        </w:tc>
+        <w:tc>
+          <w:tcPr>
+            <w:tcW w:w="450" w:type="dxa"/>
+            <w:vMerge w:val="continue"/>
+            <w:tcBorders>
+              <w:left w:val="single" w:sz="2" w:space="0" w:color="000000"/>
+              <w:bottom w:val="single" w:sz="2" w:space="0" w:color="000000"/>
+            </w:tcBorders>
+          </w:tcPr>
+          <w:p>
+            <w:pPr>
+              <w:pStyle w:val="TableContents"/>
+              <w:widowControl w:val="false"/>
+              <w:bidi w:val="0"/>
+              <w:jc w:val="center"/>
+              <w:rPr/>
+            </w:pPr>
+            <w:r>
+              <w:rPr/>
+            </w:r>
+          </w:p>
+        </w:tc>
+        <w:tc>
+          <w:tcPr>
+            <w:tcW w:w="450" w:type="dxa"/>
+            <w:vMerge w:val="continue"/>
+            <w:tcBorders>
+              <w:left w:val="single" w:sz="2" w:space="0" w:color="000000"/>
+              <w:bottom w:val="single" w:sz="2" w:space="0" w:color="000000"/>
+            </w:tcBorders>
+          </w:tcPr>
+          <w:p>
+            <w:pPr>
+              <w:pStyle w:val="TableContents"/>
+              <w:widowControl w:val="false"/>
+              <w:bidi w:val="0"/>
+              <w:jc w:val="center"/>
+              <w:rPr/>
+            </w:pPr>
+            <w:r>
+              <w:rPr/>
+            </w:r>
+          </w:p>
+        </w:tc>
+        <w:tc>
+          <w:tcPr>
+            <w:tcW w:w="450" w:type="dxa"/>
+            <w:vMerge w:val="continue"/>
+            <w:tcBorders>
+              <w:left w:val="single" w:sz="2" w:space="0" w:color="000000"/>
+              <w:bottom w:val="single" w:sz="2" w:space="0" w:color="000000"/>
+            </w:tcBorders>
+          </w:tcPr>
+          <w:p>
+            <w:pPr>
+              <w:pStyle w:val="TableContents"/>
+              <w:widowControl w:val="false"/>
+              <w:bidi w:val="0"/>
+              <w:jc w:val="center"/>
+              <w:rPr/>
+            </w:pPr>
+            <w:r>
+              <w:rPr/>
+            </w:r>
+          </w:p>
+        </w:tc>
+        <w:tc>
+          <w:tcPr>
+            <w:tcW w:w="450" w:type="dxa"/>
+            <w:vMerge w:val="continue"/>
+            <w:tcBorders>
+              <w:left w:val="single" w:sz="2" w:space="0" w:color="000000"/>
+              <w:bottom w:val="single" w:sz="2" w:space="0" w:color="000000"/>
+            </w:tcBorders>
+          </w:tcPr>
+          <w:p>
+            <w:pPr>
+              <w:pStyle w:val="TableContents"/>
+              <w:widowControl w:val="false"/>
+              <w:bidi w:val="0"/>
+              <w:jc w:val="center"/>
+              <w:rPr/>
+            </w:pPr>
+            <w:r>
+              <w:rPr/>
+            </w:r>
+          </w:p>
+        </w:tc>
+        <w:tc>
+          <w:tcPr>
+            <w:tcW w:w="2700" w:type="dxa"/>
+            <w:vMerge w:val="continue"/>
+            <w:tcBorders>
+              <w:left w:val="single" w:sz="2" w:space="0" w:color="000000"/>
+              <w:bottom w:val="single" w:sz="2" w:space="0" w:color="000000"/>
+            </w:tcBorders>
+          </w:tcPr>
+          <w:p>
+            <w:pPr>
+              <w:pStyle w:val="TableContents"/>
+              <w:widowControl w:val="false"/>
+              <w:bidi w:val="0"/>
+              <w:jc w:val="left"/>
+              <w:rPr/>
+            </w:pPr>
+            <w:r>
+              <w:rPr/>
+            </w:r>
+          </w:p>
+        </w:tc>
+        <w:tc>
+          <w:tcPr>
+            <w:tcW w:w="4500" w:type="dxa"/>
+            <w:tcBorders>
+              <w:left w:val="single" w:sz="2" w:space="0" w:color="000000"/>
+              <w:bottom w:val="single" w:sz="2" w:space="0" w:color="000000"/>
+            </w:tcBorders>
+          </w:tcPr>
+          <w:p>
+            <w:pPr>
+              <w:pStyle w:val="TableContents"/>
+              <w:widowControl w:val="false"/>
+              <w:bidi w:val="0"/>
+              <w:jc w:val="left"/>
+              <w:rPr/>
+            </w:pPr>
+            <w:r>
+              <w:rPr/>
+              <w:t>POST /users/:userid/update</w:t>
+            </w:r>
+          </w:p>
+        </w:tc>
+        <w:tc>
+          <w:tcPr>
+            <w:tcW w:w="2836" w:type="dxa"/>
+            <w:vMerge w:val="continue"/>
+            <w:tcBorders>
+              <w:left w:val="single" w:sz="2" w:space="0" w:color="000000"/>
+              <w:bottom w:val="single" w:sz="2" w:space="0" w:color="000000"/>
+              <w:right w:val="single" w:sz="2" w:space="0" w:color="000000"/>
+            </w:tcBorders>
+          </w:tcPr>
+          <w:p>
+            <w:pPr>
+              <w:pStyle w:val="TableContents"/>
+              <w:widowControl w:val="false"/>
+              <w:bidi w:val="0"/>
+              <w:jc w:val="left"/>
+              <w:rPr/>
+            </w:pPr>
+            <w:r>
+              <w:rPr/>
+            </w:r>
+          </w:p>
+        </w:tc>
+      </w:tr>
+      <w:tr>
+        <w:trPr/>
+        <w:tc>
+          <w:tcPr>
+            <w:tcW w:w="2732" w:type="dxa"/>
             <w:tcBorders>
               <w:left w:val="single" w:sz="2" w:space="0" w:color="000000"/>
               <w:bottom w:val="single" w:sz="2" w:space="0" w:color="000000"/>
@@ -1226,7 +1436,7 @@
         </w:tc>
         <w:tc>
           <w:tcPr>
-            <w:tcW w:w="399" w:type="dxa"/>
+            <w:tcW w:w="450" w:type="dxa"/>
             <w:tcBorders>
               <w:left w:val="single" w:sz="2" w:space="0" w:color="000000"/>
               <w:bottom w:val="single" w:sz="2" w:space="0" w:color="000000"/>
@@ -1248,7 +1458,7 @@
         </w:tc>
         <w:tc>
           <w:tcPr>
-            <w:tcW w:w="404" w:type="dxa"/>
+            <w:tcW w:w="450" w:type="dxa"/>
             <w:tcBorders>
               <w:left w:val="single" w:sz="2" w:space="0" w:color="000000"/>
               <w:bottom w:val="single" w:sz="2" w:space="0" w:color="000000"/>
@@ -1270,7 +1480,7 @@
         </w:tc>
         <w:tc>
           <w:tcPr>
-            <w:tcW w:w="402" w:type="dxa"/>
+            <w:tcW w:w="450" w:type="dxa"/>
             <w:tcBorders>
               <w:left w:val="single" w:sz="2" w:space="0" w:color="000000"/>
               <w:bottom w:val="single" w:sz="2" w:space="0" w:color="000000"/>
@@ -1292,7 +1502,7 @@
         </w:tc>
         <w:tc>
           <w:tcPr>
-            <w:tcW w:w="404" w:type="dxa"/>
+            <w:tcW w:w="450" w:type="dxa"/>
             <w:tcBorders>
               <w:left w:val="single" w:sz="2" w:space="0" w:color="000000"/>
               <w:bottom w:val="single" w:sz="2" w:space="0" w:color="000000"/>
@@ -1314,28 +1524,28 @@
         </w:tc>
         <w:tc>
           <w:tcPr>
-            <w:tcW w:w="2621" w:type="dxa"/>
-            <w:tcBorders>
-              <w:left w:val="single" w:sz="2" w:space="0" w:color="000000"/>
-              <w:bottom w:val="single" w:sz="2" w:space="0" w:color="000000"/>
-            </w:tcBorders>
-          </w:tcPr>
-          <w:p>
-            <w:pPr>
-              <w:pStyle w:val="TableContents"/>
-              <w:widowControl w:val="false"/>
-              <w:bidi w:val="0"/>
-              <w:jc w:val="left"/>
-              <w:rPr/>
-            </w:pPr>
-            <w:r>
-              <w:rPr/>
-            </w:r>
-          </w:p>
-        </w:tc>
-        <w:tc>
-          <w:tcPr>
-            <w:tcW w:w="3516" w:type="dxa"/>
+            <w:tcW w:w="2700" w:type="dxa"/>
+            <w:tcBorders>
+              <w:left w:val="single" w:sz="2" w:space="0" w:color="000000"/>
+              <w:bottom w:val="single" w:sz="2" w:space="0" w:color="000000"/>
+            </w:tcBorders>
+          </w:tcPr>
+          <w:p>
+            <w:pPr>
+              <w:pStyle w:val="TableContents"/>
+              <w:widowControl w:val="false"/>
+              <w:bidi w:val="0"/>
+              <w:jc w:val="left"/>
+              <w:rPr/>
+            </w:pPr>
+            <w:r>
+              <w:rPr/>
+            </w:r>
+          </w:p>
+        </w:tc>
+        <w:tc>
+          <w:tcPr>
+            <w:tcW w:w="4500" w:type="dxa"/>
             <w:tcBorders>
               <w:left w:val="single" w:sz="2" w:space="0" w:color="000000"/>
               <w:bottom w:val="single" w:sz="2" w:space="0" w:color="000000"/>
@@ -1357,7 +1567,7 @@
         </w:tc>
         <w:tc>
           <w:tcPr>
-            <w:tcW w:w="3377" w:type="dxa"/>
+            <w:tcW w:w="2836" w:type="dxa"/>
             <w:tcBorders>
               <w:left w:val="single" w:sz="2" w:space="0" w:color="000000"/>
               <w:bottom w:val="single" w:sz="2" w:space="0" w:color="000000"/>
@@ -1375,6 +1585,7 @@
             </w:pPr>
             <w:r>
               <w:rPr/>
+              <w:t>ProfileController</w:t>
             </w:r>
           </w:p>
         </w:tc>
@@ -1383,7 +1594,7 @@
         <w:trPr/>
         <w:tc>
           <w:tcPr>
-            <w:tcW w:w="3445" w:type="dxa"/>
+            <w:tcW w:w="2732" w:type="dxa"/>
             <w:vMerge w:val="restart"/>
             <w:tcBorders>
               <w:left w:val="single" w:sz="2" w:space="0" w:color="000000"/>
@@ -1406,7 +1617,7 @@
         </w:tc>
         <w:tc>
           <w:tcPr>
-            <w:tcW w:w="399" w:type="dxa"/>
+            <w:tcW w:w="450" w:type="dxa"/>
             <w:vMerge w:val="restart"/>
             <w:tcBorders>
               <w:left w:val="single" w:sz="2" w:space="0" w:color="000000"/>
@@ -1429,7 +1640,7 @@
         </w:tc>
         <w:tc>
           <w:tcPr>
-            <w:tcW w:w="404" w:type="dxa"/>
+            <w:tcW w:w="450" w:type="dxa"/>
             <w:vMerge w:val="restart"/>
             <w:tcBorders>
               <w:left w:val="single" w:sz="2" w:space="0" w:color="000000"/>
@@ -1452,7 +1663,7 @@
         </w:tc>
         <w:tc>
           <w:tcPr>
-            <w:tcW w:w="402" w:type="dxa"/>
+            <w:tcW w:w="450" w:type="dxa"/>
             <w:vMerge w:val="restart"/>
             <w:tcBorders>
               <w:left w:val="single" w:sz="2" w:space="0" w:color="000000"/>
@@ -1474,7 +1685,7 @@
         </w:tc>
         <w:tc>
           <w:tcPr>
-            <w:tcW w:w="404" w:type="dxa"/>
+            <w:tcW w:w="450" w:type="dxa"/>
             <w:vMerge w:val="restart"/>
             <w:tcBorders>
               <w:left w:val="single" w:sz="2" w:space="0" w:color="000000"/>
@@ -1496,7 +1707,7 @@
         </w:tc>
         <w:tc>
           <w:tcPr>
-            <w:tcW w:w="2621" w:type="dxa"/>
+            <w:tcW w:w="2700" w:type="dxa"/>
             <w:vMerge w:val="restart"/>
             <w:tcBorders>
               <w:left w:val="single" w:sz="2" w:space="0" w:color="000000"/>
@@ -1519,7 +1730,7 @@
         </w:tc>
         <w:tc>
           <w:tcPr>
-            <w:tcW w:w="3516" w:type="dxa"/>
+            <w:tcW w:w="4500" w:type="dxa"/>
             <w:tcBorders>
               <w:left w:val="single" w:sz="2" w:space="0" w:color="000000"/>
               <w:bottom w:val="single" w:sz="2" w:space="0" w:color="000000"/>
@@ -1541,7 +1752,7 @@
         </w:tc>
         <w:tc>
           <w:tcPr>
-            <w:tcW w:w="3377" w:type="dxa"/>
+            <w:tcW w:w="2836" w:type="dxa"/>
             <w:vMerge w:val="restart"/>
             <w:tcBorders>
               <w:left w:val="single" w:sz="2" w:space="0" w:color="000000"/>
@@ -1568,139 +1779,139 @@
         <w:trPr/>
         <w:tc>
           <w:tcPr>
-            <w:tcW w:w="3445" w:type="dxa"/>
-            <w:vMerge w:val="continue"/>
-            <w:tcBorders>
-              <w:left w:val="single" w:sz="2" w:space="0" w:color="000000"/>
-              <w:bottom w:val="single" w:sz="2" w:space="0" w:color="000000"/>
-            </w:tcBorders>
-          </w:tcPr>
-          <w:p>
-            <w:pPr>
-              <w:pStyle w:val="TableContents"/>
-              <w:widowControl w:val="false"/>
-              <w:bidi w:val="0"/>
-              <w:jc w:val="left"/>
-              <w:rPr/>
-            </w:pPr>
-            <w:r>
-              <w:rPr/>
-            </w:r>
-          </w:p>
-        </w:tc>
-        <w:tc>
-          <w:tcPr>
-            <w:tcW w:w="399" w:type="dxa"/>
-            <w:vMerge w:val="continue"/>
-            <w:tcBorders>
-              <w:left w:val="single" w:sz="2" w:space="0" w:color="000000"/>
-              <w:bottom w:val="single" w:sz="2" w:space="0" w:color="000000"/>
-            </w:tcBorders>
-          </w:tcPr>
-          <w:p>
-            <w:pPr>
-              <w:pStyle w:val="TableContents"/>
-              <w:widowControl w:val="false"/>
-              <w:bidi w:val="0"/>
-              <w:jc w:val="center"/>
-              <w:rPr/>
-            </w:pPr>
-            <w:r>
-              <w:rPr/>
-            </w:r>
-          </w:p>
-        </w:tc>
-        <w:tc>
-          <w:tcPr>
-            <w:tcW w:w="404" w:type="dxa"/>
-            <w:vMerge w:val="continue"/>
-            <w:tcBorders>
-              <w:left w:val="single" w:sz="2" w:space="0" w:color="000000"/>
-              <w:bottom w:val="single" w:sz="2" w:space="0" w:color="000000"/>
-            </w:tcBorders>
-          </w:tcPr>
-          <w:p>
-            <w:pPr>
-              <w:pStyle w:val="TableContents"/>
-              <w:widowControl w:val="false"/>
-              <w:bidi w:val="0"/>
-              <w:jc w:val="center"/>
-              <w:rPr/>
-            </w:pPr>
-            <w:r>
-              <w:rPr/>
-            </w:r>
-          </w:p>
-        </w:tc>
-        <w:tc>
-          <w:tcPr>
-            <w:tcW w:w="402" w:type="dxa"/>
-            <w:vMerge w:val="continue"/>
-            <w:tcBorders>
-              <w:left w:val="single" w:sz="2" w:space="0" w:color="000000"/>
-              <w:bottom w:val="single" w:sz="2" w:space="0" w:color="000000"/>
-            </w:tcBorders>
-          </w:tcPr>
-          <w:p>
-            <w:pPr>
-              <w:pStyle w:val="TableContents"/>
-              <w:widowControl w:val="false"/>
-              <w:bidi w:val="0"/>
-              <w:jc w:val="center"/>
-              <w:rPr/>
-            </w:pPr>
-            <w:r>
-              <w:rPr/>
-            </w:r>
-          </w:p>
-        </w:tc>
-        <w:tc>
-          <w:tcPr>
-            <w:tcW w:w="404" w:type="dxa"/>
-            <w:vMerge w:val="continue"/>
-            <w:tcBorders>
-              <w:left w:val="single" w:sz="2" w:space="0" w:color="000000"/>
-              <w:bottom w:val="single" w:sz="2" w:space="0" w:color="000000"/>
-            </w:tcBorders>
-          </w:tcPr>
-          <w:p>
-            <w:pPr>
-              <w:pStyle w:val="TableContents"/>
-              <w:widowControl w:val="false"/>
-              <w:bidi w:val="0"/>
-              <w:jc w:val="center"/>
-              <w:rPr/>
-            </w:pPr>
-            <w:r>
-              <w:rPr/>
-            </w:r>
-          </w:p>
-        </w:tc>
-        <w:tc>
-          <w:tcPr>
-            <w:tcW w:w="2621" w:type="dxa"/>
-            <w:vMerge w:val="continue"/>
-            <w:tcBorders>
-              <w:left w:val="single" w:sz="2" w:space="0" w:color="000000"/>
-              <w:bottom w:val="single" w:sz="2" w:space="0" w:color="000000"/>
-            </w:tcBorders>
-          </w:tcPr>
-          <w:p>
-            <w:pPr>
-              <w:pStyle w:val="TableContents"/>
-              <w:widowControl w:val="false"/>
-              <w:bidi w:val="0"/>
-              <w:jc w:val="left"/>
-              <w:rPr/>
-            </w:pPr>
-            <w:r>
-              <w:rPr/>
-            </w:r>
-          </w:p>
-        </w:tc>
-        <w:tc>
-          <w:tcPr>
-            <w:tcW w:w="3516" w:type="dxa"/>
+            <w:tcW w:w="2732" w:type="dxa"/>
+            <w:vMerge w:val="continue"/>
+            <w:tcBorders>
+              <w:left w:val="single" w:sz="2" w:space="0" w:color="000000"/>
+              <w:bottom w:val="single" w:sz="2" w:space="0" w:color="000000"/>
+            </w:tcBorders>
+          </w:tcPr>
+          <w:p>
+            <w:pPr>
+              <w:pStyle w:val="TableContents"/>
+              <w:widowControl w:val="false"/>
+              <w:bidi w:val="0"/>
+              <w:jc w:val="left"/>
+              <w:rPr/>
+            </w:pPr>
+            <w:r>
+              <w:rPr/>
+            </w:r>
+          </w:p>
+        </w:tc>
+        <w:tc>
+          <w:tcPr>
+            <w:tcW w:w="450" w:type="dxa"/>
+            <w:vMerge w:val="continue"/>
+            <w:tcBorders>
+              <w:left w:val="single" w:sz="2" w:space="0" w:color="000000"/>
+              <w:bottom w:val="single" w:sz="2" w:space="0" w:color="000000"/>
+            </w:tcBorders>
+          </w:tcPr>
+          <w:p>
+            <w:pPr>
+              <w:pStyle w:val="TableContents"/>
+              <w:widowControl w:val="false"/>
+              <w:bidi w:val="0"/>
+              <w:jc w:val="center"/>
+              <w:rPr/>
+            </w:pPr>
+            <w:r>
+              <w:rPr/>
+            </w:r>
+          </w:p>
+        </w:tc>
+        <w:tc>
+          <w:tcPr>
+            <w:tcW w:w="450" w:type="dxa"/>
+            <w:vMerge w:val="continue"/>
+            <w:tcBorders>
+              <w:left w:val="single" w:sz="2" w:space="0" w:color="000000"/>
+              <w:bottom w:val="single" w:sz="2" w:space="0" w:color="000000"/>
+            </w:tcBorders>
+          </w:tcPr>
+          <w:p>
+            <w:pPr>
+              <w:pStyle w:val="TableContents"/>
+              <w:widowControl w:val="false"/>
+              <w:bidi w:val="0"/>
+              <w:jc w:val="center"/>
+              <w:rPr/>
+            </w:pPr>
+            <w:r>
+              <w:rPr/>
+            </w:r>
+          </w:p>
+        </w:tc>
+        <w:tc>
+          <w:tcPr>
+            <w:tcW w:w="450" w:type="dxa"/>
+            <w:vMerge w:val="continue"/>
+            <w:tcBorders>
+              <w:left w:val="single" w:sz="2" w:space="0" w:color="000000"/>
+              <w:bottom w:val="single" w:sz="2" w:space="0" w:color="000000"/>
+            </w:tcBorders>
+          </w:tcPr>
+          <w:p>
+            <w:pPr>
+              <w:pStyle w:val="TableContents"/>
+              <w:widowControl w:val="false"/>
+              <w:bidi w:val="0"/>
+              <w:jc w:val="center"/>
+              <w:rPr/>
+            </w:pPr>
+            <w:r>
+              <w:rPr/>
+            </w:r>
+          </w:p>
+        </w:tc>
+        <w:tc>
+          <w:tcPr>
+            <w:tcW w:w="450" w:type="dxa"/>
+            <w:vMerge w:val="continue"/>
+            <w:tcBorders>
+              <w:left w:val="single" w:sz="2" w:space="0" w:color="000000"/>
+              <w:bottom w:val="single" w:sz="2" w:space="0" w:color="000000"/>
+            </w:tcBorders>
+          </w:tcPr>
+          <w:p>
+            <w:pPr>
+              <w:pStyle w:val="TableContents"/>
+              <w:widowControl w:val="false"/>
+              <w:bidi w:val="0"/>
+              <w:jc w:val="center"/>
+              <w:rPr/>
+            </w:pPr>
+            <w:r>
+              <w:rPr/>
+            </w:r>
+          </w:p>
+        </w:tc>
+        <w:tc>
+          <w:tcPr>
+            <w:tcW w:w="2700" w:type="dxa"/>
+            <w:vMerge w:val="continue"/>
+            <w:tcBorders>
+              <w:left w:val="single" w:sz="2" w:space="0" w:color="000000"/>
+              <w:bottom w:val="single" w:sz="2" w:space="0" w:color="000000"/>
+            </w:tcBorders>
+          </w:tcPr>
+          <w:p>
+            <w:pPr>
+              <w:pStyle w:val="TableContents"/>
+              <w:widowControl w:val="false"/>
+              <w:bidi w:val="0"/>
+              <w:jc w:val="left"/>
+              <w:rPr/>
+            </w:pPr>
+            <w:r>
+              <w:rPr/>
+            </w:r>
+          </w:p>
+        </w:tc>
+        <w:tc>
+          <w:tcPr>
+            <w:tcW w:w="4500" w:type="dxa"/>
             <w:tcBorders>
               <w:left w:val="single" w:sz="2" w:space="0" w:color="000000"/>
               <w:bottom w:val="single" w:sz="2" w:space="0" w:color="000000"/>
@@ -1722,7 +1933,7 @@
         </w:tc>
         <w:tc>
           <w:tcPr>
-            <w:tcW w:w="3377" w:type="dxa"/>
+            <w:tcW w:w="2836" w:type="dxa"/>
             <w:vMerge w:val="continue"/>
             <w:tcBorders>
               <w:left w:val="single" w:sz="2" w:space="0" w:color="000000"/>
@@ -1748,7 +1959,7 @@
         <w:trPr/>
         <w:tc>
           <w:tcPr>
-            <w:tcW w:w="3445" w:type="dxa"/>
+            <w:tcW w:w="2732" w:type="dxa"/>
             <w:tcBorders>
               <w:left w:val="single" w:sz="2" w:space="0" w:color="000000"/>
               <w:bottom w:val="single" w:sz="2" w:space="0" w:color="000000"/>
@@ -1770,7 +1981,7 @@
         </w:tc>
         <w:tc>
           <w:tcPr>
-            <w:tcW w:w="399" w:type="dxa"/>
+            <w:tcW w:w="450" w:type="dxa"/>
             <w:tcBorders>
               <w:left w:val="single" w:sz="2" w:space="0" w:color="000000"/>
               <w:bottom w:val="single" w:sz="2" w:space="0" w:color="000000"/>
@@ -1792,7 +2003,7 @@
         </w:tc>
         <w:tc>
           <w:tcPr>
-            <w:tcW w:w="404" w:type="dxa"/>
+            <w:tcW w:w="450" w:type="dxa"/>
             <w:tcBorders>
               <w:left w:val="single" w:sz="2" w:space="0" w:color="000000"/>
               <w:bottom w:val="single" w:sz="2" w:space="0" w:color="000000"/>
@@ -1814,49 +2025,49 @@
         </w:tc>
         <w:tc>
           <w:tcPr>
-            <w:tcW w:w="402" w:type="dxa"/>
-            <w:tcBorders>
-              <w:left w:val="single" w:sz="2" w:space="0" w:color="000000"/>
-              <w:bottom w:val="single" w:sz="2" w:space="0" w:color="000000"/>
-            </w:tcBorders>
-          </w:tcPr>
-          <w:p>
-            <w:pPr>
-              <w:pStyle w:val="TableContents"/>
-              <w:widowControl w:val="false"/>
-              <w:bidi w:val="0"/>
-              <w:jc w:val="center"/>
-              <w:rPr/>
-            </w:pPr>
-            <w:r>
-              <w:rPr/>
-            </w:r>
-          </w:p>
-        </w:tc>
-        <w:tc>
-          <w:tcPr>
-            <w:tcW w:w="404" w:type="dxa"/>
-            <w:tcBorders>
-              <w:left w:val="single" w:sz="2" w:space="0" w:color="000000"/>
-              <w:bottom w:val="single" w:sz="2" w:space="0" w:color="000000"/>
-            </w:tcBorders>
-          </w:tcPr>
-          <w:p>
-            <w:pPr>
-              <w:pStyle w:val="TableContents"/>
-              <w:widowControl w:val="false"/>
-              <w:bidi w:val="0"/>
-              <w:jc w:val="center"/>
-              <w:rPr/>
-            </w:pPr>
-            <w:r>
-              <w:rPr/>
-            </w:r>
-          </w:p>
-        </w:tc>
-        <w:tc>
-          <w:tcPr>
-            <w:tcW w:w="2621" w:type="dxa"/>
+            <w:tcW w:w="450" w:type="dxa"/>
+            <w:tcBorders>
+              <w:left w:val="single" w:sz="2" w:space="0" w:color="000000"/>
+              <w:bottom w:val="single" w:sz="2" w:space="0" w:color="000000"/>
+            </w:tcBorders>
+          </w:tcPr>
+          <w:p>
+            <w:pPr>
+              <w:pStyle w:val="TableContents"/>
+              <w:widowControl w:val="false"/>
+              <w:bidi w:val="0"/>
+              <w:jc w:val="center"/>
+              <w:rPr/>
+            </w:pPr>
+            <w:r>
+              <w:rPr/>
+            </w:r>
+          </w:p>
+        </w:tc>
+        <w:tc>
+          <w:tcPr>
+            <w:tcW w:w="450" w:type="dxa"/>
+            <w:tcBorders>
+              <w:left w:val="single" w:sz="2" w:space="0" w:color="000000"/>
+              <w:bottom w:val="single" w:sz="2" w:space="0" w:color="000000"/>
+            </w:tcBorders>
+          </w:tcPr>
+          <w:p>
+            <w:pPr>
+              <w:pStyle w:val="TableContents"/>
+              <w:widowControl w:val="false"/>
+              <w:bidi w:val="0"/>
+              <w:jc w:val="center"/>
+              <w:rPr/>
+            </w:pPr>
+            <w:r>
+              <w:rPr/>
+            </w:r>
+          </w:p>
+        </w:tc>
+        <w:tc>
+          <w:tcPr>
+            <w:tcW w:w="2700" w:type="dxa"/>
             <w:tcBorders>
               <w:left w:val="single" w:sz="2" w:space="0" w:color="000000"/>
               <w:bottom w:val="single" w:sz="2" w:space="0" w:color="000000"/>
@@ -1878,7 +2089,7 @@
         </w:tc>
         <w:tc>
           <w:tcPr>
-            <w:tcW w:w="3516" w:type="dxa"/>
+            <w:tcW w:w="4500" w:type="dxa"/>
             <w:tcBorders>
               <w:left w:val="single" w:sz="2" w:space="0" w:color="000000"/>
               <w:bottom w:val="single" w:sz="2" w:space="0" w:color="000000"/>
@@ -1900,7 +2111,7 @@
         </w:tc>
         <w:tc>
           <w:tcPr>
-            <w:tcW w:w="3377" w:type="dxa"/>
+            <w:tcW w:w="2836" w:type="dxa"/>
             <w:vMerge w:val="continue"/>
             <w:tcBorders>
               <w:left w:val="single" w:sz="2" w:space="0" w:color="000000"/>
@@ -1926,7 +2137,7 @@
         <w:trPr/>
         <w:tc>
           <w:tcPr>
-            <w:tcW w:w="3445" w:type="dxa"/>
+            <w:tcW w:w="2732" w:type="dxa"/>
             <w:tcBorders>
               <w:left w:val="single" w:sz="2" w:space="0" w:color="000000"/>
               <w:bottom w:val="single" w:sz="2" w:space="0" w:color="000000"/>
@@ -1948,7 +2159,7 @@
         </w:tc>
         <w:tc>
           <w:tcPr>
-            <w:tcW w:w="399" w:type="dxa"/>
+            <w:tcW w:w="450" w:type="dxa"/>
             <w:tcBorders>
               <w:left w:val="single" w:sz="2" w:space="0" w:color="000000"/>
               <w:bottom w:val="single" w:sz="2" w:space="0" w:color="000000"/>
@@ -1970,7 +2181,7 @@
         </w:tc>
         <w:tc>
           <w:tcPr>
-            <w:tcW w:w="404" w:type="dxa"/>
+            <w:tcW w:w="450" w:type="dxa"/>
             <w:tcBorders>
               <w:left w:val="single" w:sz="2" w:space="0" w:color="000000"/>
               <w:bottom w:val="single" w:sz="2" w:space="0" w:color="000000"/>
@@ -1992,49 +2203,49 @@
         </w:tc>
         <w:tc>
           <w:tcPr>
-            <w:tcW w:w="402" w:type="dxa"/>
-            <w:tcBorders>
-              <w:left w:val="single" w:sz="2" w:space="0" w:color="000000"/>
-              <w:bottom w:val="single" w:sz="2" w:space="0" w:color="000000"/>
-            </w:tcBorders>
-          </w:tcPr>
-          <w:p>
-            <w:pPr>
-              <w:pStyle w:val="TableContents"/>
-              <w:widowControl w:val="false"/>
-              <w:bidi w:val="0"/>
-              <w:jc w:val="center"/>
-              <w:rPr/>
-            </w:pPr>
-            <w:r>
-              <w:rPr/>
-            </w:r>
-          </w:p>
-        </w:tc>
-        <w:tc>
-          <w:tcPr>
-            <w:tcW w:w="404" w:type="dxa"/>
-            <w:tcBorders>
-              <w:left w:val="single" w:sz="2" w:space="0" w:color="000000"/>
-              <w:bottom w:val="single" w:sz="2" w:space="0" w:color="000000"/>
-            </w:tcBorders>
-          </w:tcPr>
-          <w:p>
-            <w:pPr>
-              <w:pStyle w:val="TableContents"/>
-              <w:widowControl w:val="false"/>
-              <w:bidi w:val="0"/>
-              <w:jc w:val="center"/>
-              <w:rPr/>
-            </w:pPr>
-            <w:r>
-              <w:rPr/>
-            </w:r>
-          </w:p>
-        </w:tc>
-        <w:tc>
-          <w:tcPr>
-            <w:tcW w:w="2621" w:type="dxa"/>
+            <w:tcW w:w="450" w:type="dxa"/>
+            <w:tcBorders>
+              <w:left w:val="single" w:sz="2" w:space="0" w:color="000000"/>
+              <w:bottom w:val="single" w:sz="2" w:space="0" w:color="000000"/>
+            </w:tcBorders>
+          </w:tcPr>
+          <w:p>
+            <w:pPr>
+              <w:pStyle w:val="TableContents"/>
+              <w:widowControl w:val="false"/>
+              <w:bidi w:val="0"/>
+              <w:jc w:val="center"/>
+              <w:rPr/>
+            </w:pPr>
+            <w:r>
+              <w:rPr/>
+            </w:r>
+          </w:p>
+        </w:tc>
+        <w:tc>
+          <w:tcPr>
+            <w:tcW w:w="450" w:type="dxa"/>
+            <w:tcBorders>
+              <w:left w:val="single" w:sz="2" w:space="0" w:color="000000"/>
+              <w:bottom w:val="single" w:sz="2" w:space="0" w:color="000000"/>
+            </w:tcBorders>
+          </w:tcPr>
+          <w:p>
+            <w:pPr>
+              <w:pStyle w:val="TableContents"/>
+              <w:widowControl w:val="false"/>
+              <w:bidi w:val="0"/>
+              <w:jc w:val="center"/>
+              <w:rPr/>
+            </w:pPr>
+            <w:r>
+              <w:rPr/>
+            </w:r>
+          </w:p>
+        </w:tc>
+        <w:tc>
+          <w:tcPr>
+            <w:tcW w:w="2700" w:type="dxa"/>
             <w:tcBorders>
               <w:left w:val="single" w:sz="2" w:space="0" w:color="000000"/>
               <w:bottom w:val="single" w:sz="2" w:space="0" w:color="000000"/>
@@ -2056,7 +2267,7 @@
         </w:tc>
         <w:tc>
           <w:tcPr>
-            <w:tcW w:w="3516" w:type="dxa"/>
+            <w:tcW w:w="4500" w:type="dxa"/>
             <w:tcBorders>
               <w:left w:val="single" w:sz="2" w:space="0" w:color="000000"/>
               <w:bottom w:val="single" w:sz="2" w:space="0" w:color="000000"/>
@@ -2078,7 +2289,7 @@
         </w:tc>
         <w:tc>
           <w:tcPr>
-            <w:tcW w:w="3377" w:type="dxa"/>
+            <w:tcW w:w="2836" w:type="dxa"/>
             <w:vMerge w:val="continue"/>
             <w:tcBorders>
               <w:left w:val="single" w:sz="2" w:space="0" w:color="000000"/>
@@ -2104,7 +2315,7 @@
         <w:trPr/>
         <w:tc>
           <w:tcPr>
-            <w:tcW w:w="3445" w:type="dxa"/>
+            <w:tcW w:w="2732" w:type="dxa"/>
             <w:vMerge w:val="restart"/>
             <w:tcBorders>
               <w:left w:val="single" w:sz="2" w:space="0" w:color="000000"/>
@@ -2127,7 +2338,7 @@
         </w:tc>
         <w:tc>
           <w:tcPr>
-            <w:tcW w:w="399" w:type="dxa"/>
+            <w:tcW w:w="450" w:type="dxa"/>
             <w:vMerge w:val="restart"/>
             <w:tcBorders>
               <w:left w:val="single" w:sz="2" w:space="0" w:color="000000"/>
@@ -2150,7 +2361,7 @@
         </w:tc>
         <w:tc>
           <w:tcPr>
-            <w:tcW w:w="404" w:type="dxa"/>
+            <w:tcW w:w="450" w:type="dxa"/>
             <w:vMerge w:val="restart"/>
             <w:tcBorders>
               <w:left w:val="single" w:sz="2" w:space="0" w:color="000000"/>
@@ -2173,7 +2384,7 @@
         </w:tc>
         <w:tc>
           <w:tcPr>
-            <w:tcW w:w="402" w:type="dxa"/>
+            <w:tcW w:w="450" w:type="dxa"/>
             <w:vMerge w:val="restart"/>
             <w:tcBorders>
               <w:left w:val="single" w:sz="2" w:space="0" w:color="000000"/>
@@ -2195,7 +2406,7 @@
         </w:tc>
         <w:tc>
           <w:tcPr>
-            <w:tcW w:w="404" w:type="dxa"/>
+            <w:tcW w:w="450" w:type="dxa"/>
             <w:vMerge w:val="restart"/>
             <w:tcBorders>
               <w:left w:val="single" w:sz="2" w:space="0" w:color="000000"/>
@@ -2217,7 +2428,7 @@
         </w:tc>
         <w:tc>
           <w:tcPr>
-            <w:tcW w:w="2621" w:type="dxa"/>
+            <w:tcW w:w="2700" w:type="dxa"/>
             <w:vMerge w:val="restart"/>
             <w:tcBorders>
               <w:left w:val="single" w:sz="2" w:space="0" w:color="000000"/>
@@ -2240,7 +2451,7 @@
         </w:tc>
         <w:tc>
           <w:tcPr>
-            <w:tcW w:w="3516" w:type="dxa"/>
+            <w:tcW w:w="4500" w:type="dxa"/>
             <w:tcBorders>
               <w:left w:val="single" w:sz="2" w:space="0" w:color="000000"/>
               <w:bottom w:val="single" w:sz="2" w:space="0" w:color="000000"/>
@@ -2262,7 +2473,7 @@
         </w:tc>
         <w:tc>
           <w:tcPr>
-            <w:tcW w:w="3377" w:type="dxa"/>
+            <w:tcW w:w="2836" w:type="dxa"/>
             <w:vMerge w:val="continue"/>
             <w:tcBorders>
               <w:left w:val="single" w:sz="2" w:space="0" w:color="000000"/>
@@ -2288,139 +2499,139 @@
         <w:trPr/>
         <w:tc>
           <w:tcPr>
-            <w:tcW w:w="3445" w:type="dxa"/>
-            <w:vMerge w:val="continue"/>
-            <w:tcBorders>
-              <w:left w:val="single" w:sz="2" w:space="0" w:color="000000"/>
-              <w:bottom w:val="single" w:sz="2" w:space="0" w:color="000000"/>
-            </w:tcBorders>
-          </w:tcPr>
-          <w:p>
-            <w:pPr>
-              <w:pStyle w:val="TableContents"/>
-              <w:widowControl w:val="false"/>
-              <w:bidi w:val="0"/>
-              <w:jc w:val="left"/>
-              <w:rPr/>
-            </w:pPr>
-            <w:r>
-              <w:rPr/>
-            </w:r>
-          </w:p>
-        </w:tc>
-        <w:tc>
-          <w:tcPr>
-            <w:tcW w:w="399" w:type="dxa"/>
-            <w:vMerge w:val="continue"/>
-            <w:tcBorders>
-              <w:left w:val="single" w:sz="2" w:space="0" w:color="000000"/>
-              <w:bottom w:val="single" w:sz="2" w:space="0" w:color="000000"/>
-            </w:tcBorders>
-          </w:tcPr>
-          <w:p>
-            <w:pPr>
-              <w:pStyle w:val="TableContents"/>
-              <w:widowControl w:val="false"/>
-              <w:bidi w:val="0"/>
-              <w:jc w:val="center"/>
-              <w:rPr/>
-            </w:pPr>
-            <w:r>
-              <w:rPr/>
-            </w:r>
-          </w:p>
-        </w:tc>
-        <w:tc>
-          <w:tcPr>
-            <w:tcW w:w="404" w:type="dxa"/>
-            <w:vMerge w:val="continue"/>
-            <w:tcBorders>
-              <w:left w:val="single" w:sz="2" w:space="0" w:color="000000"/>
-              <w:bottom w:val="single" w:sz="2" w:space="0" w:color="000000"/>
-            </w:tcBorders>
-          </w:tcPr>
-          <w:p>
-            <w:pPr>
-              <w:pStyle w:val="TableContents"/>
-              <w:widowControl w:val="false"/>
-              <w:bidi w:val="0"/>
-              <w:jc w:val="center"/>
-              <w:rPr/>
-            </w:pPr>
-            <w:r>
-              <w:rPr/>
-            </w:r>
-          </w:p>
-        </w:tc>
-        <w:tc>
-          <w:tcPr>
-            <w:tcW w:w="402" w:type="dxa"/>
-            <w:vMerge w:val="continue"/>
-            <w:tcBorders>
-              <w:left w:val="single" w:sz="2" w:space="0" w:color="000000"/>
-              <w:bottom w:val="single" w:sz="2" w:space="0" w:color="000000"/>
-            </w:tcBorders>
-          </w:tcPr>
-          <w:p>
-            <w:pPr>
-              <w:pStyle w:val="TableContents"/>
-              <w:widowControl w:val="false"/>
-              <w:bidi w:val="0"/>
-              <w:jc w:val="center"/>
-              <w:rPr/>
-            </w:pPr>
-            <w:r>
-              <w:rPr/>
-            </w:r>
-          </w:p>
-        </w:tc>
-        <w:tc>
-          <w:tcPr>
-            <w:tcW w:w="404" w:type="dxa"/>
-            <w:vMerge w:val="continue"/>
-            <w:tcBorders>
-              <w:left w:val="single" w:sz="2" w:space="0" w:color="000000"/>
-              <w:bottom w:val="single" w:sz="2" w:space="0" w:color="000000"/>
-            </w:tcBorders>
-          </w:tcPr>
-          <w:p>
-            <w:pPr>
-              <w:pStyle w:val="TableContents"/>
-              <w:widowControl w:val="false"/>
-              <w:bidi w:val="0"/>
-              <w:jc w:val="center"/>
-              <w:rPr/>
-            </w:pPr>
-            <w:r>
-              <w:rPr/>
-            </w:r>
-          </w:p>
-        </w:tc>
-        <w:tc>
-          <w:tcPr>
-            <w:tcW w:w="2621" w:type="dxa"/>
-            <w:vMerge w:val="continue"/>
-            <w:tcBorders>
-              <w:left w:val="single" w:sz="2" w:space="0" w:color="000000"/>
-              <w:bottom w:val="single" w:sz="2" w:space="0" w:color="000000"/>
-            </w:tcBorders>
-          </w:tcPr>
-          <w:p>
-            <w:pPr>
-              <w:pStyle w:val="TableContents"/>
-              <w:widowControl w:val="false"/>
-              <w:bidi w:val="0"/>
-              <w:jc w:val="left"/>
-              <w:rPr/>
-            </w:pPr>
-            <w:r>
-              <w:rPr/>
-            </w:r>
-          </w:p>
-        </w:tc>
-        <w:tc>
-          <w:tcPr>
-            <w:tcW w:w="3516" w:type="dxa"/>
+            <w:tcW w:w="2732" w:type="dxa"/>
+            <w:vMerge w:val="continue"/>
+            <w:tcBorders>
+              <w:left w:val="single" w:sz="2" w:space="0" w:color="000000"/>
+              <w:bottom w:val="single" w:sz="2" w:space="0" w:color="000000"/>
+            </w:tcBorders>
+          </w:tcPr>
+          <w:p>
+            <w:pPr>
+              <w:pStyle w:val="TableContents"/>
+              <w:widowControl w:val="false"/>
+              <w:bidi w:val="0"/>
+              <w:jc w:val="left"/>
+              <w:rPr/>
+            </w:pPr>
+            <w:r>
+              <w:rPr/>
+            </w:r>
+          </w:p>
+        </w:tc>
+        <w:tc>
+          <w:tcPr>
+            <w:tcW w:w="450" w:type="dxa"/>
+            <w:vMerge w:val="continue"/>
+            <w:tcBorders>
+              <w:left w:val="single" w:sz="2" w:space="0" w:color="000000"/>
+              <w:bottom w:val="single" w:sz="2" w:space="0" w:color="000000"/>
+            </w:tcBorders>
+          </w:tcPr>
+          <w:p>
+            <w:pPr>
+              <w:pStyle w:val="TableContents"/>
+              <w:widowControl w:val="false"/>
+              <w:bidi w:val="0"/>
+              <w:jc w:val="center"/>
+              <w:rPr/>
+            </w:pPr>
+            <w:r>
+              <w:rPr/>
+            </w:r>
+          </w:p>
+        </w:tc>
+        <w:tc>
+          <w:tcPr>
+            <w:tcW w:w="450" w:type="dxa"/>
+            <w:vMerge w:val="continue"/>
+            <w:tcBorders>
+              <w:left w:val="single" w:sz="2" w:space="0" w:color="000000"/>
+              <w:bottom w:val="single" w:sz="2" w:space="0" w:color="000000"/>
+            </w:tcBorders>
+          </w:tcPr>
+          <w:p>
+            <w:pPr>
+              <w:pStyle w:val="TableContents"/>
+              <w:widowControl w:val="false"/>
+              <w:bidi w:val="0"/>
+              <w:jc w:val="center"/>
+              <w:rPr/>
+            </w:pPr>
+            <w:r>
+              <w:rPr/>
+            </w:r>
+          </w:p>
+        </w:tc>
+        <w:tc>
+          <w:tcPr>
+            <w:tcW w:w="450" w:type="dxa"/>
+            <w:vMerge w:val="continue"/>
+            <w:tcBorders>
+              <w:left w:val="single" w:sz="2" w:space="0" w:color="000000"/>
+              <w:bottom w:val="single" w:sz="2" w:space="0" w:color="000000"/>
+            </w:tcBorders>
+          </w:tcPr>
+          <w:p>
+            <w:pPr>
+              <w:pStyle w:val="TableContents"/>
+              <w:widowControl w:val="false"/>
+              <w:bidi w:val="0"/>
+              <w:jc w:val="center"/>
+              <w:rPr/>
+            </w:pPr>
+            <w:r>
+              <w:rPr/>
+            </w:r>
+          </w:p>
+        </w:tc>
+        <w:tc>
+          <w:tcPr>
+            <w:tcW w:w="450" w:type="dxa"/>
+            <w:vMerge w:val="continue"/>
+            <w:tcBorders>
+              <w:left w:val="single" w:sz="2" w:space="0" w:color="000000"/>
+              <w:bottom w:val="single" w:sz="2" w:space="0" w:color="000000"/>
+            </w:tcBorders>
+          </w:tcPr>
+          <w:p>
+            <w:pPr>
+              <w:pStyle w:val="TableContents"/>
+              <w:widowControl w:val="false"/>
+              <w:bidi w:val="0"/>
+              <w:jc w:val="center"/>
+              <w:rPr/>
+            </w:pPr>
+            <w:r>
+              <w:rPr/>
+            </w:r>
+          </w:p>
+        </w:tc>
+        <w:tc>
+          <w:tcPr>
+            <w:tcW w:w="2700" w:type="dxa"/>
+            <w:vMerge w:val="continue"/>
+            <w:tcBorders>
+              <w:left w:val="single" w:sz="2" w:space="0" w:color="000000"/>
+              <w:bottom w:val="single" w:sz="2" w:space="0" w:color="000000"/>
+            </w:tcBorders>
+          </w:tcPr>
+          <w:p>
+            <w:pPr>
+              <w:pStyle w:val="TableContents"/>
+              <w:widowControl w:val="false"/>
+              <w:bidi w:val="0"/>
+              <w:jc w:val="left"/>
+              <w:rPr/>
+            </w:pPr>
+            <w:r>
+              <w:rPr/>
+            </w:r>
+          </w:p>
+        </w:tc>
+        <w:tc>
+          <w:tcPr>
+            <w:tcW w:w="4500" w:type="dxa"/>
             <w:tcBorders>
               <w:left w:val="single" w:sz="2" w:space="0" w:color="000000"/>
               <w:bottom w:val="single" w:sz="2" w:space="0" w:color="000000"/>
@@ -2442,7 +2653,7 @@
         </w:tc>
         <w:tc>
           <w:tcPr>
-            <w:tcW w:w="3377" w:type="dxa"/>
+            <w:tcW w:w="2836" w:type="dxa"/>
             <w:vMerge w:val="continue"/>
             <w:tcBorders>
               <w:left w:val="single" w:sz="2" w:space="0" w:color="000000"/>
@@ -2468,7 +2679,7 @@
         <w:trPr/>
         <w:tc>
           <w:tcPr>
-            <w:tcW w:w="3445" w:type="dxa"/>
+            <w:tcW w:w="2732" w:type="dxa"/>
             <w:tcBorders>
               <w:left w:val="single" w:sz="2" w:space="0" w:color="000000"/>
               <w:bottom w:val="single" w:sz="2" w:space="0" w:color="000000"/>
@@ -2490,70 +2701,70 @@
         </w:tc>
         <w:tc>
           <w:tcPr>
-            <w:tcW w:w="399" w:type="dxa"/>
-            <w:tcBorders>
-              <w:left w:val="single" w:sz="2" w:space="0" w:color="000000"/>
-              <w:bottom w:val="single" w:sz="2" w:space="0" w:color="000000"/>
-            </w:tcBorders>
-          </w:tcPr>
-          <w:p>
-            <w:pPr>
-              <w:pStyle w:val="TableContents"/>
-              <w:widowControl w:val="false"/>
-              <w:bidi w:val="0"/>
-              <w:jc w:val="center"/>
-              <w:rPr/>
-            </w:pPr>
-            <w:r>
-              <w:rPr/>
-            </w:r>
-          </w:p>
-        </w:tc>
-        <w:tc>
-          <w:tcPr>
-            <w:tcW w:w="404" w:type="dxa"/>
-            <w:tcBorders>
-              <w:left w:val="single" w:sz="2" w:space="0" w:color="000000"/>
-              <w:bottom w:val="single" w:sz="2" w:space="0" w:color="000000"/>
-            </w:tcBorders>
-          </w:tcPr>
-          <w:p>
-            <w:pPr>
-              <w:pStyle w:val="TableContents"/>
-              <w:widowControl w:val="false"/>
-              <w:bidi w:val="0"/>
-              <w:jc w:val="center"/>
-              <w:rPr/>
-            </w:pPr>
-            <w:r>
-              <w:rPr/>
-            </w:r>
-          </w:p>
-        </w:tc>
-        <w:tc>
-          <w:tcPr>
-            <w:tcW w:w="402" w:type="dxa"/>
-            <w:tcBorders>
-              <w:left w:val="single" w:sz="2" w:space="0" w:color="000000"/>
-              <w:bottom w:val="single" w:sz="2" w:space="0" w:color="000000"/>
-            </w:tcBorders>
-          </w:tcPr>
-          <w:p>
-            <w:pPr>
-              <w:pStyle w:val="TableContents"/>
-              <w:widowControl w:val="false"/>
-              <w:bidi w:val="0"/>
-              <w:jc w:val="center"/>
-              <w:rPr/>
-            </w:pPr>
-            <w:r>
-              <w:rPr/>
-            </w:r>
-          </w:p>
-        </w:tc>
-        <w:tc>
-          <w:tcPr>
-            <w:tcW w:w="404" w:type="dxa"/>
+            <w:tcW w:w="450" w:type="dxa"/>
+            <w:tcBorders>
+              <w:left w:val="single" w:sz="2" w:space="0" w:color="000000"/>
+              <w:bottom w:val="single" w:sz="2" w:space="0" w:color="000000"/>
+            </w:tcBorders>
+          </w:tcPr>
+          <w:p>
+            <w:pPr>
+              <w:pStyle w:val="TableContents"/>
+              <w:widowControl w:val="false"/>
+              <w:bidi w:val="0"/>
+              <w:jc w:val="center"/>
+              <w:rPr/>
+            </w:pPr>
+            <w:r>
+              <w:rPr/>
+            </w:r>
+          </w:p>
+        </w:tc>
+        <w:tc>
+          <w:tcPr>
+            <w:tcW w:w="450" w:type="dxa"/>
+            <w:tcBorders>
+              <w:left w:val="single" w:sz="2" w:space="0" w:color="000000"/>
+              <w:bottom w:val="single" w:sz="2" w:space="0" w:color="000000"/>
+            </w:tcBorders>
+          </w:tcPr>
+          <w:p>
+            <w:pPr>
+              <w:pStyle w:val="TableContents"/>
+              <w:widowControl w:val="false"/>
+              <w:bidi w:val="0"/>
+              <w:jc w:val="center"/>
+              <w:rPr/>
+            </w:pPr>
+            <w:r>
+              <w:rPr/>
+            </w:r>
+          </w:p>
+        </w:tc>
+        <w:tc>
+          <w:tcPr>
+            <w:tcW w:w="450" w:type="dxa"/>
+            <w:tcBorders>
+              <w:left w:val="single" w:sz="2" w:space="0" w:color="000000"/>
+              <w:bottom w:val="single" w:sz="2" w:space="0" w:color="000000"/>
+            </w:tcBorders>
+          </w:tcPr>
+          <w:p>
+            <w:pPr>
+              <w:pStyle w:val="TableContents"/>
+              <w:widowControl w:val="false"/>
+              <w:bidi w:val="0"/>
+              <w:jc w:val="center"/>
+              <w:rPr/>
+            </w:pPr>
+            <w:r>
+              <w:rPr/>
+            </w:r>
+          </w:p>
+        </w:tc>
+        <w:tc>
+          <w:tcPr>
+            <w:tcW w:w="450" w:type="dxa"/>
             <w:tcBorders>
               <w:left w:val="single" w:sz="2" w:space="0" w:color="000000"/>
               <w:bottom w:val="single" w:sz="2" w:space="0" w:color="000000"/>
@@ -2575,7 +2786,7 @@
         </w:tc>
         <w:tc>
           <w:tcPr>
-            <w:tcW w:w="2621" w:type="dxa"/>
+            <w:tcW w:w="2700" w:type="dxa"/>
             <w:tcBorders>
               <w:left w:val="single" w:sz="2" w:space="0" w:color="000000"/>
               <w:bottom w:val="single" w:sz="2" w:space="0" w:color="000000"/>
@@ -2597,7 +2808,7 @@
         </w:tc>
         <w:tc>
           <w:tcPr>
-            <w:tcW w:w="3516" w:type="dxa"/>
+            <w:tcW w:w="4500" w:type="dxa"/>
             <w:tcBorders>
               <w:left w:val="single" w:sz="2" w:space="0" w:color="000000"/>
               <w:bottom w:val="single" w:sz="2" w:space="0" w:color="000000"/>
@@ -2632,7 +2843,7 @@
         </w:tc>
         <w:tc>
           <w:tcPr>
-            <w:tcW w:w="3377" w:type="dxa"/>
+            <w:tcW w:w="2836" w:type="dxa"/>
             <w:vMerge w:val="restart"/>
             <w:tcBorders>
               <w:left w:val="single" w:sz="2" w:space="0" w:color="000000"/>
@@ -2659,7 +2870,7 @@
         <w:trPr/>
         <w:tc>
           <w:tcPr>
-            <w:tcW w:w="3445" w:type="dxa"/>
+            <w:tcW w:w="2732" w:type="dxa"/>
             <w:tcBorders>
               <w:left w:val="single" w:sz="2" w:space="0" w:color="000000"/>
               <w:bottom w:val="single" w:sz="2" w:space="0" w:color="000000"/>
@@ -2681,7 +2892,7 @@
         </w:tc>
         <w:tc>
           <w:tcPr>
-            <w:tcW w:w="399" w:type="dxa"/>
+            <w:tcW w:w="450" w:type="dxa"/>
             <w:tcBorders>
               <w:left w:val="single" w:sz="2" w:space="0" w:color="000000"/>
               <w:bottom w:val="single" w:sz="2" w:space="0" w:color="000000"/>
@@ -2703,7 +2914,7 @@
         </w:tc>
         <w:tc>
           <w:tcPr>
-            <w:tcW w:w="404" w:type="dxa"/>
+            <w:tcW w:w="450" w:type="dxa"/>
             <w:tcBorders>
               <w:left w:val="single" w:sz="2" w:space="0" w:color="000000"/>
               <w:bottom w:val="single" w:sz="2" w:space="0" w:color="000000"/>
@@ -2725,7 +2936,7 @@
         </w:tc>
         <w:tc>
           <w:tcPr>
-            <w:tcW w:w="402" w:type="dxa"/>
+            <w:tcW w:w="450" w:type="dxa"/>
             <w:tcBorders>
               <w:left w:val="single" w:sz="2" w:space="0" w:color="000000"/>
               <w:bottom w:val="single" w:sz="2" w:space="0" w:color="000000"/>
@@ -2747,28 +2958,28 @@
         </w:tc>
         <w:tc>
           <w:tcPr>
-            <w:tcW w:w="404" w:type="dxa"/>
-            <w:tcBorders>
-              <w:left w:val="single" w:sz="2" w:space="0" w:color="000000"/>
-              <w:bottom w:val="single" w:sz="2" w:space="0" w:color="000000"/>
-            </w:tcBorders>
-          </w:tcPr>
-          <w:p>
-            <w:pPr>
-              <w:pStyle w:val="TableContents"/>
-              <w:widowControl w:val="false"/>
-              <w:bidi w:val="0"/>
-              <w:jc w:val="center"/>
-              <w:rPr/>
-            </w:pPr>
-            <w:r>
-              <w:rPr/>
-            </w:r>
-          </w:p>
-        </w:tc>
-        <w:tc>
-          <w:tcPr>
-            <w:tcW w:w="2621" w:type="dxa"/>
+            <w:tcW w:w="450" w:type="dxa"/>
+            <w:tcBorders>
+              <w:left w:val="single" w:sz="2" w:space="0" w:color="000000"/>
+              <w:bottom w:val="single" w:sz="2" w:space="0" w:color="000000"/>
+            </w:tcBorders>
+          </w:tcPr>
+          <w:p>
+            <w:pPr>
+              <w:pStyle w:val="TableContents"/>
+              <w:widowControl w:val="false"/>
+              <w:bidi w:val="0"/>
+              <w:jc w:val="center"/>
+              <w:rPr/>
+            </w:pPr>
+            <w:r>
+              <w:rPr/>
+            </w:r>
+          </w:p>
+        </w:tc>
+        <w:tc>
+          <w:tcPr>
+            <w:tcW w:w="2700" w:type="dxa"/>
             <w:tcBorders>
               <w:left w:val="single" w:sz="2" w:space="0" w:color="000000"/>
               <w:bottom w:val="single" w:sz="2" w:space="0" w:color="000000"/>
@@ -2790,7 +3001,7 @@
         </w:tc>
         <w:tc>
           <w:tcPr>
-            <w:tcW w:w="3516" w:type="dxa"/>
+            <w:tcW w:w="4500" w:type="dxa"/>
             <w:tcBorders>
               <w:left w:val="single" w:sz="2" w:space="0" w:color="000000"/>
               <w:bottom w:val="single" w:sz="2" w:space="0" w:color="000000"/>
@@ -2812,7 +3023,7 @@
         </w:tc>
         <w:tc>
           <w:tcPr>
-            <w:tcW w:w="3377" w:type="dxa"/>
+            <w:tcW w:w="2836" w:type="dxa"/>
             <w:vMerge w:val="continue"/>
             <w:tcBorders>
               <w:left w:val="single" w:sz="2" w:space="0" w:color="000000"/>
@@ -2838,7 +3049,7 @@
         <w:trPr/>
         <w:tc>
           <w:tcPr>
-            <w:tcW w:w="3445" w:type="dxa"/>
+            <w:tcW w:w="2732" w:type="dxa"/>
             <w:tcBorders>
               <w:left w:val="single" w:sz="2" w:space="0" w:color="000000"/>
               <w:bottom w:val="single" w:sz="2" w:space="0" w:color="000000"/>
@@ -2860,7 +3071,7 @@
         </w:tc>
         <w:tc>
           <w:tcPr>
-            <w:tcW w:w="399" w:type="dxa"/>
+            <w:tcW w:w="450" w:type="dxa"/>
             <w:tcBorders>
               <w:left w:val="single" w:sz="2" w:space="0" w:color="000000"/>
               <w:bottom w:val="single" w:sz="2" w:space="0" w:color="000000"/>
@@ -2882,7 +3093,7 @@
         </w:tc>
         <w:tc>
           <w:tcPr>
-            <w:tcW w:w="404" w:type="dxa"/>
+            <w:tcW w:w="450" w:type="dxa"/>
             <w:tcBorders>
               <w:left w:val="single" w:sz="2" w:space="0" w:color="000000"/>
               <w:bottom w:val="single" w:sz="2" w:space="0" w:color="000000"/>
@@ -2904,49 +3115,49 @@
         </w:tc>
         <w:tc>
           <w:tcPr>
-            <w:tcW w:w="402" w:type="dxa"/>
-            <w:tcBorders>
-              <w:left w:val="single" w:sz="2" w:space="0" w:color="000000"/>
-              <w:bottom w:val="single" w:sz="2" w:space="0" w:color="000000"/>
-            </w:tcBorders>
-          </w:tcPr>
-          <w:p>
-            <w:pPr>
-              <w:pStyle w:val="TableContents"/>
-              <w:widowControl w:val="false"/>
-              <w:bidi w:val="0"/>
-              <w:jc w:val="center"/>
-              <w:rPr/>
-            </w:pPr>
-            <w:r>
-              <w:rPr/>
-            </w:r>
-          </w:p>
-        </w:tc>
-        <w:tc>
-          <w:tcPr>
-            <w:tcW w:w="404" w:type="dxa"/>
-            <w:tcBorders>
-              <w:left w:val="single" w:sz="2" w:space="0" w:color="000000"/>
-              <w:bottom w:val="single" w:sz="2" w:space="0" w:color="000000"/>
-            </w:tcBorders>
-          </w:tcPr>
-          <w:p>
-            <w:pPr>
-              <w:pStyle w:val="TableContents"/>
-              <w:widowControl w:val="false"/>
-              <w:bidi w:val="0"/>
-              <w:jc w:val="center"/>
-              <w:rPr/>
-            </w:pPr>
-            <w:r>
-              <w:rPr/>
-            </w:r>
-          </w:p>
-        </w:tc>
-        <w:tc>
-          <w:tcPr>
-            <w:tcW w:w="2621" w:type="dxa"/>
+            <w:tcW w:w="450" w:type="dxa"/>
+            <w:tcBorders>
+              <w:left w:val="single" w:sz="2" w:space="0" w:color="000000"/>
+              <w:bottom w:val="single" w:sz="2" w:space="0" w:color="000000"/>
+            </w:tcBorders>
+          </w:tcPr>
+          <w:p>
+            <w:pPr>
+              <w:pStyle w:val="TableContents"/>
+              <w:widowControl w:val="false"/>
+              <w:bidi w:val="0"/>
+              <w:jc w:val="center"/>
+              <w:rPr/>
+            </w:pPr>
+            <w:r>
+              <w:rPr/>
+            </w:r>
+          </w:p>
+        </w:tc>
+        <w:tc>
+          <w:tcPr>
+            <w:tcW w:w="450" w:type="dxa"/>
+            <w:tcBorders>
+              <w:left w:val="single" w:sz="2" w:space="0" w:color="000000"/>
+              <w:bottom w:val="single" w:sz="2" w:space="0" w:color="000000"/>
+            </w:tcBorders>
+          </w:tcPr>
+          <w:p>
+            <w:pPr>
+              <w:pStyle w:val="TableContents"/>
+              <w:widowControl w:val="false"/>
+              <w:bidi w:val="0"/>
+              <w:jc w:val="center"/>
+              <w:rPr/>
+            </w:pPr>
+            <w:r>
+              <w:rPr/>
+            </w:r>
+          </w:p>
+        </w:tc>
+        <w:tc>
+          <w:tcPr>
+            <w:tcW w:w="2700" w:type="dxa"/>
             <w:tcBorders>
               <w:left w:val="single" w:sz="2" w:space="0" w:color="000000"/>
               <w:bottom w:val="single" w:sz="2" w:space="0" w:color="000000"/>
@@ -2968,7 +3179,7 @@
         </w:tc>
         <w:tc>
           <w:tcPr>
-            <w:tcW w:w="3516" w:type="dxa"/>
+            <w:tcW w:w="4500" w:type="dxa"/>
             <w:tcBorders>
               <w:left w:val="single" w:sz="2" w:space="0" w:color="000000"/>
               <w:bottom w:val="single" w:sz="2" w:space="0" w:color="000000"/>
@@ -2990,7 +3201,7 @@
         </w:tc>
         <w:tc>
           <w:tcPr>
-            <w:tcW w:w="3377" w:type="dxa"/>
+            <w:tcW w:w="2836" w:type="dxa"/>
             <w:vMerge w:val="continue"/>
             <w:tcBorders>
               <w:left w:val="single" w:sz="2" w:space="0" w:color="000000"/>
@@ -3016,7 +3227,7 @@
         <w:trPr/>
         <w:tc>
           <w:tcPr>
-            <w:tcW w:w="3445" w:type="dxa"/>
+            <w:tcW w:w="2732" w:type="dxa"/>
             <w:vMerge w:val="restart"/>
             <w:tcBorders>
               <w:left w:val="single" w:sz="2" w:space="0" w:color="000000"/>
@@ -3039,7 +3250,7 @@
         </w:tc>
         <w:tc>
           <w:tcPr>
-            <w:tcW w:w="399" w:type="dxa"/>
+            <w:tcW w:w="450" w:type="dxa"/>
             <w:vMerge w:val="restart"/>
             <w:tcBorders>
               <w:left w:val="single" w:sz="2" w:space="0" w:color="000000"/>
@@ -3061,7 +3272,7 @@
         </w:tc>
         <w:tc>
           <w:tcPr>
-            <w:tcW w:w="404" w:type="dxa"/>
+            <w:tcW w:w="450" w:type="dxa"/>
             <w:vMerge w:val="restart"/>
             <w:tcBorders>
               <w:left w:val="single" w:sz="2" w:space="0" w:color="000000"/>
@@ -3083,7 +3294,7 @@
         </w:tc>
         <w:tc>
           <w:tcPr>
-            <w:tcW w:w="402" w:type="dxa"/>
+            <w:tcW w:w="450" w:type="dxa"/>
             <w:vMerge w:val="restart"/>
             <w:tcBorders>
               <w:left w:val="single" w:sz="2" w:space="0" w:color="000000"/>
@@ -3106,7 +3317,7 @@
         </w:tc>
         <w:tc>
           <w:tcPr>
-            <w:tcW w:w="404" w:type="dxa"/>
+            <w:tcW w:w="450" w:type="dxa"/>
             <w:vMerge w:val="restart"/>
             <w:tcBorders>
               <w:left w:val="single" w:sz="2" w:space="0" w:color="000000"/>
@@ -3128,7 +3339,7 @@
         </w:tc>
         <w:tc>
           <w:tcPr>
-            <w:tcW w:w="2621" w:type="dxa"/>
+            <w:tcW w:w="2700" w:type="dxa"/>
             <w:vMerge w:val="restart"/>
             <w:tcBorders>
               <w:left w:val="single" w:sz="2" w:space="0" w:color="000000"/>
@@ -3151,7 +3362,7 @@
         </w:tc>
         <w:tc>
           <w:tcPr>
-            <w:tcW w:w="3516" w:type="dxa"/>
+            <w:tcW w:w="4500" w:type="dxa"/>
             <w:tcBorders>
               <w:left w:val="single" w:sz="2" w:space="0" w:color="000000"/>
               <w:bottom w:val="single" w:sz="2" w:space="0" w:color="000000"/>
@@ -3173,7 +3384,7 @@
         </w:tc>
         <w:tc>
           <w:tcPr>
-            <w:tcW w:w="3377" w:type="dxa"/>
+            <w:tcW w:w="2836" w:type="dxa"/>
             <w:vMerge w:val="continue"/>
             <w:tcBorders>
               <w:left w:val="single" w:sz="2" w:space="0" w:color="000000"/>
@@ -3199,139 +3410,139 @@
         <w:trPr/>
         <w:tc>
           <w:tcPr>
-            <w:tcW w:w="3445" w:type="dxa"/>
-            <w:vMerge w:val="continue"/>
-            <w:tcBorders>
-              <w:left w:val="single" w:sz="2" w:space="0" w:color="000000"/>
-              <w:bottom w:val="single" w:sz="2" w:space="0" w:color="000000"/>
-            </w:tcBorders>
-          </w:tcPr>
-          <w:p>
-            <w:pPr>
-              <w:pStyle w:val="TableContents"/>
-              <w:widowControl w:val="false"/>
-              <w:bidi w:val="0"/>
-              <w:jc w:val="left"/>
-              <w:rPr/>
-            </w:pPr>
-            <w:r>
-              <w:rPr/>
-            </w:r>
-          </w:p>
-        </w:tc>
-        <w:tc>
-          <w:tcPr>
-            <w:tcW w:w="399" w:type="dxa"/>
-            <w:vMerge w:val="continue"/>
-            <w:tcBorders>
-              <w:left w:val="single" w:sz="2" w:space="0" w:color="000000"/>
-              <w:bottom w:val="single" w:sz="2" w:space="0" w:color="000000"/>
-            </w:tcBorders>
-          </w:tcPr>
-          <w:p>
-            <w:pPr>
-              <w:pStyle w:val="TableContents"/>
-              <w:widowControl w:val="false"/>
-              <w:bidi w:val="0"/>
-              <w:jc w:val="center"/>
-              <w:rPr/>
-            </w:pPr>
-            <w:r>
-              <w:rPr/>
-            </w:r>
-          </w:p>
-        </w:tc>
-        <w:tc>
-          <w:tcPr>
-            <w:tcW w:w="404" w:type="dxa"/>
-            <w:vMerge w:val="continue"/>
-            <w:tcBorders>
-              <w:left w:val="single" w:sz="2" w:space="0" w:color="000000"/>
-              <w:bottom w:val="single" w:sz="2" w:space="0" w:color="000000"/>
-            </w:tcBorders>
-          </w:tcPr>
-          <w:p>
-            <w:pPr>
-              <w:pStyle w:val="TableContents"/>
-              <w:widowControl w:val="false"/>
-              <w:bidi w:val="0"/>
-              <w:jc w:val="center"/>
-              <w:rPr/>
-            </w:pPr>
-            <w:r>
-              <w:rPr/>
-            </w:r>
-          </w:p>
-        </w:tc>
-        <w:tc>
-          <w:tcPr>
-            <w:tcW w:w="402" w:type="dxa"/>
-            <w:vMerge w:val="continue"/>
-            <w:tcBorders>
-              <w:left w:val="single" w:sz="2" w:space="0" w:color="000000"/>
-              <w:bottom w:val="single" w:sz="2" w:space="0" w:color="000000"/>
-            </w:tcBorders>
-          </w:tcPr>
-          <w:p>
-            <w:pPr>
-              <w:pStyle w:val="TableContents"/>
-              <w:widowControl w:val="false"/>
-              <w:bidi w:val="0"/>
-              <w:jc w:val="center"/>
-              <w:rPr/>
-            </w:pPr>
-            <w:r>
-              <w:rPr/>
-            </w:r>
-          </w:p>
-        </w:tc>
-        <w:tc>
-          <w:tcPr>
-            <w:tcW w:w="404" w:type="dxa"/>
-            <w:vMerge w:val="continue"/>
-            <w:tcBorders>
-              <w:left w:val="single" w:sz="2" w:space="0" w:color="000000"/>
-              <w:bottom w:val="single" w:sz="2" w:space="0" w:color="000000"/>
-            </w:tcBorders>
-          </w:tcPr>
-          <w:p>
-            <w:pPr>
-              <w:pStyle w:val="TableContents"/>
-              <w:widowControl w:val="false"/>
-              <w:bidi w:val="0"/>
-              <w:jc w:val="center"/>
-              <w:rPr/>
-            </w:pPr>
-            <w:r>
-              <w:rPr/>
-            </w:r>
-          </w:p>
-        </w:tc>
-        <w:tc>
-          <w:tcPr>
-            <w:tcW w:w="2621" w:type="dxa"/>
-            <w:vMerge w:val="continue"/>
-            <w:tcBorders>
-              <w:left w:val="single" w:sz="2" w:space="0" w:color="000000"/>
-              <w:bottom w:val="single" w:sz="2" w:space="0" w:color="000000"/>
-            </w:tcBorders>
-          </w:tcPr>
-          <w:p>
-            <w:pPr>
-              <w:pStyle w:val="TableContents"/>
-              <w:widowControl w:val="false"/>
-              <w:bidi w:val="0"/>
-              <w:jc w:val="left"/>
-              <w:rPr/>
-            </w:pPr>
-            <w:r>
-              <w:rPr/>
-            </w:r>
-          </w:p>
-        </w:tc>
-        <w:tc>
-          <w:tcPr>
-            <w:tcW w:w="3516" w:type="dxa"/>
+            <w:tcW w:w="2732" w:type="dxa"/>
+            <w:vMerge w:val="continue"/>
+            <w:tcBorders>
+              <w:left w:val="single" w:sz="2" w:space="0" w:color="000000"/>
+              <w:bottom w:val="single" w:sz="2" w:space="0" w:color="000000"/>
+            </w:tcBorders>
+          </w:tcPr>
+          <w:p>
+            <w:pPr>
+              <w:pStyle w:val="TableContents"/>
+              <w:widowControl w:val="false"/>
+              <w:bidi w:val="0"/>
+              <w:jc w:val="left"/>
+              <w:rPr/>
+            </w:pPr>
+            <w:r>
+              <w:rPr/>
+            </w:r>
+          </w:p>
+        </w:tc>
+        <w:tc>
+          <w:tcPr>
+            <w:tcW w:w="450" w:type="dxa"/>
+            <w:vMerge w:val="continue"/>
+            <w:tcBorders>
+              <w:left w:val="single" w:sz="2" w:space="0" w:color="000000"/>
+              <w:bottom w:val="single" w:sz="2" w:space="0" w:color="000000"/>
+            </w:tcBorders>
+          </w:tcPr>
+          <w:p>
+            <w:pPr>
+              <w:pStyle w:val="TableContents"/>
+              <w:widowControl w:val="false"/>
+              <w:bidi w:val="0"/>
+              <w:jc w:val="center"/>
+              <w:rPr/>
+            </w:pPr>
+            <w:r>
+              <w:rPr/>
+            </w:r>
+          </w:p>
+        </w:tc>
+        <w:tc>
+          <w:tcPr>
+            <w:tcW w:w="450" w:type="dxa"/>
+            <w:vMerge w:val="continue"/>
+            <w:tcBorders>
+              <w:left w:val="single" w:sz="2" w:space="0" w:color="000000"/>
+              <w:bottom w:val="single" w:sz="2" w:space="0" w:color="000000"/>
+            </w:tcBorders>
+          </w:tcPr>
+          <w:p>
+            <w:pPr>
+              <w:pStyle w:val="TableContents"/>
+              <w:widowControl w:val="false"/>
+              <w:bidi w:val="0"/>
+              <w:jc w:val="center"/>
+              <w:rPr/>
+            </w:pPr>
+            <w:r>
+              <w:rPr/>
+            </w:r>
+          </w:p>
+        </w:tc>
+        <w:tc>
+          <w:tcPr>
+            <w:tcW w:w="450" w:type="dxa"/>
+            <w:vMerge w:val="continue"/>
+            <w:tcBorders>
+              <w:left w:val="single" w:sz="2" w:space="0" w:color="000000"/>
+              <w:bottom w:val="single" w:sz="2" w:space="0" w:color="000000"/>
+            </w:tcBorders>
+          </w:tcPr>
+          <w:p>
+            <w:pPr>
+              <w:pStyle w:val="TableContents"/>
+              <w:widowControl w:val="false"/>
+              <w:bidi w:val="0"/>
+              <w:jc w:val="center"/>
+              <w:rPr/>
+            </w:pPr>
+            <w:r>
+              <w:rPr/>
+            </w:r>
+          </w:p>
+        </w:tc>
+        <w:tc>
+          <w:tcPr>
+            <w:tcW w:w="450" w:type="dxa"/>
+            <w:vMerge w:val="continue"/>
+            <w:tcBorders>
+              <w:left w:val="single" w:sz="2" w:space="0" w:color="000000"/>
+              <w:bottom w:val="single" w:sz="2" w:space="0" w:color="000000"/>
+            </w:tcBorders>
+          </w:tcPr>
+          <w:p>
+            <w:pPr>
+              <w:pStyle w:val="TableContents"/>
+              <w:widowControl w:val="false"/>
+              <w:bidi w:val="0"/>
+              <w:jc w:val="center"/>
+              <w:rPr/>
+            </w:pPr>
+            <w:r>
+              <w:rPr/>
+            </w:r>
+          </w:p>
+        </w:tc>
+        <w:tc>
+          <w:tcPr>
+            <w:tcW w:w="2700" w:type="dxa"/>
+            <w:vMerge w:val="continue"/>
+            <w:tcBorders>
+              <w:left w:val="single" w:sz="2" w:space="0" w:color="000000"/>
+              <w:bottom w:val="single" w:sz="2" w:space="0" w:color="000000"/>
+            </w:tcBorders>
+          </w:tcPr>
+          <w:p>
+            <w:pPr>
+              <w:pStyle w:val="TableContents"/>
+              <w:widowControl w:val="false"/>
+              <w:bidi w:val="0"/>
+              <w:jc w:val="left"/>
+              <w:rPr/>
+            </w:pPr>
+            <w:r>
+              <w:rPr/>
+            </w:r>
+          </w:p>
+        </w:tc>
+        <w:tc>
+          <w:tcPr>
+            <w:tcW w:w="4500" w:type="dxa"/>
             <w:tcBorders>
               <w:left w:val="single" w:sz="2" w:space="0" w:color="000000"/>
               <w:bottom w:val="single" w:sz="2" w:space="0" w:color="000000"/>
@@ -3353,7 +3564,7 @@
         </w:tc>
         <w:tc>
           <w:tcPr>
-            <w:tcW w:w="3377" w:type="dxa"/>
+            <w:tcW w:w="2836" w:type="dxa"/>
             <w:vMerge w:val="continue"/>
             <w:tcBorders>
               <w:left w:val="single" w:sz="2" w:space="0" w:color="000000"/>
@@ -3379,7 +3590,7 @@
         <w:trPr/>
         <w:tc>
           <w:tcPr>
-            <w:tcW w:w="3445" w:type="dxa"/>
+            <w:tcW w:w="2732" w:type="dxa"/>
             <w:vMerge w:val="restart"/>
             <w:tcBorders>
               <w:left w:val="single" w:sz="2" w:space="0" w:color="000000"/>
@@ -3402,7 +3613,7 @@
         </w:tc>
         <w:tc>
           <w:tcPr>
-            <w:tcW w:w="399" w:type="dxa"/>
+            <w:tcW w:w="450" w:type="dxa"/>
             <w:vMerge w:val="restart"/>
             <w:tcBorders>
               <w:left w:val="single" w:sz="2" w:space="0" w:color="000000"/>
@@ -3425,7 +3636,7 @@
         </w:tc>
         <w:tc>
           <w:tcPr>
-            <w:tcW w:w="404" w:type="dxa"/>
+            <w:tcW w:w="450" w:type="dxa"/>
             <w:vMerge w:val="restart"/>
             <w:tcBorders>
               <w:left w:val="single" w:sz="2" w:space="0" w:color="000000"/>
@@ -3448,7 +3659,7 @@
         </w:tc>
         <w:tc>
           <w:tcPr>
-            <w:tcW w:w="402" w:type="dxa"/>
+            <w:tcW w:w="450" w:type="dxa"/>
             <w:vMerge w:val="restart"/>
             <w:tcBorders>
               <w:left w:val="single" w:sz="2" w:space="0" w:color="000000"/>
@@ -3470,7 +3681,7 @@
         </w:tc>
         <w:tc>
           <w:tcPr>
-            <w:tcW w:w="404" w:type="dxa"/>
+            <w:tcW w:w="450" w:type="dxa"/>
             <w:vMerge w:val="restart"/>
             <w:tcBorders>
               <w:left w:val="single" w:sz="2" w:space="0" w:color="000000"/>
@@ -3492,7 +3703,7 @@
         </w:tc>
         <w:tc>
           <w:tcPr>
-            <w:tcW w:w="2621" w:type="dxa"/>
+            <w:tcW w:w="2700" w:type="dxa"/>
             <w:vMerge w:val="restart"/>
             <w:tcBorders>
               <w:left w:val="single" w:sz="2" w:space="0" w:color="000000"/>
@@ -3515,7 +3726,7 @@
         </w:tc>
         <w:tc>
           <w:tcPr>
-            <w:tcW w:w="3516" w:type="dxa"/>
+            <w:tcW w:w="4500" w:type="dxa"/>
             <w:tcBorders>
               <w:left w:val="single" w:sz="2" w:space="0" w:color="000000"/>
               <w:bottom w:val="single" w:sz="2" w:space="0" w:color="000000"/>
@@ -3537,7 +3748,7 @@
         </w:tc>
         <w:tc>
           <w:tcPr>
-            <w:tcW w:w="3377" w:type="dxa"/>
+            <w:tcW w:w="2836" w:type="dxa"/>
             <w:vMerge w:val="continue"/>
             <w:tcBorders>
               <w:left w:val="single" w:sz="2" w:space="0" w:color="000000"/>
@@ -3563,139 +3774,139 @@
         <w:trPr/>
         <w:tc>
           <w:tcPr>
-            <w:tcW w:w="3445" w:type="dxa"/>
-            <w:vMerge w:val="continue"/>
-            <w:tcBorders>
-              <w:left w:val="single" w:sz="2" w:space="0" w:color="000000"/>
-              <w:bottom w:val="single" w:sz="2" w:space="0" w:color="000000"/>
-            </w:tcBorders>
-          </w:tcPr>
-          <w:p>
-            <w:pPr>
-              <w:pStyle w:val="TableContents"/>
-              <w:widowControl w:val="false"/>
-              <w:bidi w:val="0"/>
-              <w:jc w:val="left"/>
-              <w:rPr/>
-            </w:pPr>
-            <w:r>
-              <w:rPr/>
-            </w:r>
-          </w:p>
-        </w:tc>
-        <w:tc>
-          <w:tcPr>
-            <w:tcW w:w="399" w:type="dxa"/>
-            <w:vMerge w:val="continue"/>
-            <w:tcBorders>
-              <w:left w:val="single" w:sz="2" w:space="0" w:color="000000"/>
-              <w:bottom w:val="single" w:sz="2" w:space="0" w:color="000000"/>
-            </w:tcBorders>
-          </w:tcPr>
-          <w:p>
-            <w:pPr>
-              <w:pStyle w:val="TableContents"/>
-              <w:widowControl w:val="false"/>
-              <w:bidi w:val="0"/>
-              <w:jc w:val="center"/>
-              <w:rPr/>
-            </w:pPr>
-            <w:r>
-              <w:rPr/>
-            </w:r>
-          </w:p>
-        </w:tc>
-        <w:tc>
-          <w:tcPr>
-            <w:tcW w:w="404" w:type="dxa"/>
-            <w:vMerge w:val="continue"/>
-            <w:tcBorders>
-              <w:left w:val="single" w:sz="2" w:space="0" w:color="000000"/>
-              <w:bottom w:val="single" w:sz="2" w:space="0" w:color="000000"/>
-            </w:tcBorders>
-          </w:tcPr>
-          <w:p>
-            <w:pPr>
-              <w:pStyle w:val="TableContents"/>
-              <w:widowControl w:val="false"/>
-              <w:bidi w:val="0"/>
-              <w:jc w:val="center"/>
-              <w:rPr/>
-            </w:pPr>
-            <w:r>
-              <w:rPr/>
-            </w:r>
-          </w:p>
-        </w:tc>
-        <w:tc>
-          <w:tcPr>
-            <w:tcW w:w="402" w:type="dxa"/>
-            <w:vMerge w:val="continue"/>
-            <w:tcBorders>
-              <w:left w:val="single" w:sz="2" w:space="0" w:color="000000"/>
-              <w:bottom w:val="single" w:sz="2" w:space="0" w:color="000000"/>
-            </w:tcBorders>
-          </w:tcPr>
-          <w:p>
-            <w:pPr>
-              <w:pStyle w:val="TableContents"/>
-              <w:widowControl w:val="false"/>
-              <w:bidi w:val="0"/>
-              <w:jc w:val="center"/>
-              <w:rPr/>
-            </w:pPr>
-            <w:r>
-              <w:rPr/>
-            </w:r>
-          </w:p>
-        </w:tc>
-        <w:tc>
-          <w:tcPr>
-            <w:tcW w:w="404" w:type="dxa"/>
-            <w:vMerge w:val="continue"/>
-            <w:tcBorders>
-              <w:left w:val="single" w:sz="2" w:space="0" w:color="000000"/>
-              <w:bottom w:val="single" w:sz="2" w:space="0" w:color="000000"/>
-            </w:tcBorders>
-          </w:tcPr>
-          <w:p>
-            <w:pPr>
-              <w:pStyle w:val="TableContents"/>
-              <w:widowControl w:val="false"/>
-              <w:bidi w:val="0"/>
-              <w:jc w:val="center"/>
-              <w:rPr/>
-            </w:pPr>
-            <w:r>
-              <w:rPr/>
-            </w:r>
-          </w:p>
-        </w:tc>
-        <w:tc>
-          <w:tcPr>
-            <w:tcW w:w="2621" w:type="dxa"/>
-            <w:vMerge w:val="continue"/>
-            <w:tcBorders>
-              <w:left w:val="single" w:sz="2" w:space="0" w:color="000000"/>
-              <w:bottom w:val="single" w:sz="2" w:space="0" w:color="000000"/>
-            </w:tcBorders>
-          </w:tcPr>
-          <w:p>
-            <w:pPr>
-              <w:pStyle w:val="TableContents"/>
-              <w:widowControl w:val="false"/>
-              <w:bidi w:val="0"/>
-              <w:jc w:val="left"/>
-              <w:rPr/>
-            </w:pPr>
-            <w:r>
-              <w:rPr/>
-            </w:r>
-          </w:p>
-        </w:tc>
-        <w:tc>
-          <w:tcPr>
-            <w:tcW w:w="3516" w:type="dxa"/>
+            <w:tcW w:w="2732" w:type="dxa"/>
+            <w:vMerge w:val="continue"/>
+            <w:tcBorders>
+              <w:left w:val="single" w:sz="2" w:space="0" w:color="000000"/>
+              <w:bottom w:val="single" w:sz="2" w:space="0" w:color="000000"/>
+            </w:tcBorders>
+          </w:tcPr>
+          <w:p>
+            <w:pPr>
+              <w:pStyle w:val="TableContents"/>
+              <w:widowControl w:val="false"/>
+              <w:bidi w:val="0"/>
+              <w:jc w:val="left"/>
+              <w:rPr/>
+            </w:pPr>
+            <w:r>
+              <w:rPr/>
+            </w:r>
+          </w:p>
+        </w:tc>
+        <w:tc>
+          <w:tcPr>
+            <w:tcW w:w="450" w:type="dxa"/>
+            <w:vMerge w:val="continue"/>
+            <w:tcBorders>
+              <w:left w:val="single" w:sz="2" w:space="0" w:color="000000"/>
+              <w:bottom w:val="single" w:sz="2" w:space="0" w:color="000000"/>
+            </w:tcBorders>
+          </w:tcPr>
+          <w:p>
+            <w:pPr>
+              <w:pStyle w:val="TableContents"/>
+              <w:widowControl w:val="false"/>
+              <w:bidi w:val="0"/>
+              <w:jc w:val="center"/>
+              <w:rPr/>
+            </w:pPr>
+            <w:r>
+              <w:rPr/>
+            </w:r>
+          </w:p>
+        </w:tc>
+        <w:tc>
+          <w:tcPr>
+            <w:tcW w:w="450" w:type="dxa"/>
+            <w:vMerge w:val="continue"/>
+            <w:tcBorders>
+              <w:left w:val="single" w:sz="2" w:space="0" w:color="000000"/>
+              <w:bottom w:val="single" w:sz="2" w:space="0" w:color="000000"/>
+            </w:tcBorders>
+          </w:tcPr>
+          <w:p>
+            <w:pPr>
+              <w:pStyle w:val="TableContents"/>
+              <w:widowControl w:val="false"/>
+              <w:bidi w:val="0"/>
+              <w:jc w:val="center"/>
+              <w:rPr/>
+            </w:pPr>
+            <w:r>
+              <w:rPr/>
+            </w:r>
+          </w:p>
+        </w:tc>
+        <w:tc>
+          <w:tcPr>
+            <w:tcW w:w="450" w:type="dxa"/>
+            <w:vMerge w:val="continue"/>
+            <w:tcBorders>
+              <w:left w:val="single" w:sz="2" w:space="0" w:color="000000"/>
+              <w:bottom w:val="single" w:sz="2" w:space="0" w:color="000000"/>
+            </w:tcBorders>
+          </w:tcPr>
+          <w:p>
+            <w:pPr>
+              <w:pStyle w:val="TableContents"/>
+              <w:widowControl w:val="false"/>
+              <w:bidi w:val="0"/>
+              <w:jc w:val="center"/>
+              <w:rPr/>
+            </w:pPr>
+            <w:r>
+              <w:rPr/>
+            </w:r>
+          </w:p>
+        </w:tc>
+        <w:tc>
+          <w:tcPr>
+            <w:tcW w:w="450" w:type="dxa"/>
+            <w:vMerge w:val="continue"/>
+            <w:tcBorders>
+              <w:left w:val="single" w:sz="2" w:space="0" w:color="000000"/>
+              <w:bottom w:val="single" w:sz="2" w:space="0" w:color="000000"/>
+            </w:tcBorders>
+          </w:tcPr>
+          <w:p>
+            <w:pPr>
+              <w:pStyle w:val="TableContents"/>
+              <w:widowControl w:val="false"/>
+              <w:bidi w:val="0"/>
+              <w:jc w:val="center"/>
+              <w:rPr/>
+            </w:pPr>
+            <w:r>
+              <w:rPr/>
+            </w:r>
+          </w:p>
+        </w:tc>
+        <w:tc>
+          <w:tcPr>
+            <w:tcW w:w="2700" w:type="dxa"/>
+            <w:vMerge w:val="continue"/>
+            <w:tcBorders>
+              <w:left w:val="single" w:sz="2" w:space="0" w:color="000000"/>
+              <w:bottom w:val="single" w:sz="2" w:space="0" w:color="000000"/>
+            </w:tcBorders>
+          </w:tcPr>
+          <w:p>
+            <w:pPr>
+              <w:pStyle w:val="TableContents"/>
+              <w:widowControl w:val="false"/>
+              <w:bidi w:val="0"/>
+              <w:jc w:val="left"/>
+              <w:rPr/>
+            </w:pPr>
+            <w:r>
+              <w:rPr/>
+            </w:r>
+          </w:p>
+        </w:tc>
+        <w:tc>
+          <w:tcPr>
+            <w:tcW w:w="4500" w:type="dxa"/>
             <w:tcBorders>
               <w:left w:val="single" w:sz="2" w:space="0" w:color="000000"/>
               <w:bottom w:val="single" w:sz="2" w:space="0" w:color="000000"/>
@@ -3717,7 +3928,7 @@
         </w:tc>
         <w:tc>
           <w:tcPr>
-            <w:tcW w:w="3377" w:type="dxa"/>
+            <w:tcW w:w="2836" w:type="dxa"/>
             <w:vMerge w:val="continue"/>
             <w:tcBorders>
               <w:left w:val="single" w:sz="2" w:space="0" w:color="000000"/>
@@ -3743,7 +3954,7 @@
         <w:trPr/>
         <w:tc>
           <w:tcPr>
-            <w:tcW w:w="3445" w:type="dxa"/>
+            <w:tcW w:w="2732" w:type="dxa"/>
             <w:vMerge w:val="restart"/>
             <w:tcBorders>
               <w:left w:val="single" w:sz="2" w:space="0" w:color="000000"/>
@@ -3766,7 +3977,7 @@
         </w:tc>
         <w:tc>
           <w:tcPr>
-            <w:tcW w:w="399" w:type="dxa"/>
+            <w:tcW w:w="450" w:type="dxa"/>
             <w:vMerge w:val="restart"/>
             <w:tcBorders>
               <w:left w:val="single" w:sz="2" w:space="0" w:color="000000"/>
@@ -3789,7 +4000,7 @@
         </w:tc>
         <w:tc>
           <w:tcPr>
-            <w:tcW w:w="404" w:type="dxa"/>
+            <w:tcW w:w="450" w:type="dxa"/>
             <w:vMerge w:val="restart"/>
             <w:tcBorders>
               <w:left w:val="single" w:sz="2" w:space="0" w:color="000000"/>
@@ -3812,7 +4023,7 @@
         </w:tc>
         <w:tc>
           <w:tcPr>
-            <w:tcW w:w="402" w:type="dxa"/>
+            <w:tcW w:w="450" w:type="dxa"/>
             <w:vMerge w:val="restart"/>
             <w:tcBorders>
               <w:left w:val="single" w:sz="2" w:space="0" w:color="000000"/>
@@ -3834,7 +4045,7 @@
         </w:tc>
         <w:tc>
           <w:tcPr>
-            <w:tcW w:w="404" w:type="dxa"/>
+            <w:tcW w:w="450" w:type="dxa"/>
             <w:vMerge w:val="restart"/>
             <w:tcBorders>
               <w:left w:val="single" w:sz="2" w:space="0" w:color="000000"/>
@@ -3856,7 +4067,7 @@
         </w:tc>
         <w:tc>
           <w:tcPr>
-            <w:tcW w:w="2621" w:type="dxa"/>
+            <w:tcW w:w="2700" w:type="dxa"/>
             <w:vMerge w:val="restart"/>
             <w:tcBorders>
               <w:left w:val="single" w:sz="2" w:space="0" w:color="000000"/>
@@ -3873,35 +4084,47 @@
             </w:pPr>
             <w:r>
               <w:rPr/>
-              <w:t>Update:transactions</w:t>
-            </w:r>
-          </w:p>
-        </w:tc>
-        <w:tc>
-          <w:tcPr>
-            <w:tcW w:w="3516" w:type="dxa"/>
-            <w:tcBorders>
-              <w:left w:val="single" w:sz="2" w:space="0" w:color="000000"/>
-              <w:bottom w:val="single" w:sz="2" w:space="0" w:color="000000"/>
-            </w:tcBorders>
-          </w:tcPr>
-          <w:p>
-            <w:pPr>
-              <w:pStyle w:val="TableContents"/>
-              <w:widowControl w:val="false"/>
-              <w:bidi w:val="0"/>
-              <w:jc w:val="left"/>
-              <w:rPr/>
-            </w:pPr>
-            <w:r>
-              <w:rPr/>
-              <w:t>GET /transactions/:assetid/in</w:t>
-            </w:r>
-          </w:p>
-        </w:tc>
-        <w:tc>
-          <w:tcPr>
-            <w:tcW w:w="3377" w:type="dxa"/>
+              <w:t>create</w:t>
+            </w:r>
+            <w:r>
+              <w:rPr/>
+              <w:t>:transactions</w:t>
+            </w:r>
+          </w:p>
+        </w:tc>
+        <w:tc>
+          <w:tcPr>
+            <w:tcW w:w="4500" w:type="dxa"/>
+            <w:tcBorders>
+              <w:left w:val="single" w:sz="2" w:space="0" w:color="000000"/>
+              <w:bottom w:val="single" w:sz="2" w:space="0" w:color="000000"/>
+            </w:tcBorders>
+          </w:tcPr>
+          <w:p>
+            <w:pPr>
+              <w:pStyle w:val="TableContents"/>
+              <w:widowControl w:val="false"/>
+              <w:bidi w:val="0"/>
+              <w:jc w:val="left"/>
+              <w:rPr/>
+            </w:pPr>
+            <w:r>
+              <w:rPr/>
+              <w:t>GET /transactions/:</w:t>
+            </w:r>
+            <w:r>
+              <w:rPr/>
+              <w:t>requestid</w:t>
+            </w:r>
+            <w:r>
+              <w:rPr/>
+              <w:t>/in</w:t>
+            </w:r>
+          </w:p>
+        </w:tc>
+        <w:tc>
+          <w:tcPr>
+            <w:tcW w:w="2836" w:type="dxa"/>
             <w:vMerge w:val="restart"/>
             <w:tcBorders>
               <w:left w:val="single" w:sz="2" w:space="0" w:color="000000"/>
@@ -3928,161 +4151,169 @@
         <w:trPr/>
         <w:tc>
           <w:tcPr>
-            <w:tcW w:w="3445" w:type="dxa"/>
-            <w:vMerge w:val="continue"/>
-            <w:tcBorders>
-              <w:left w:val="single" w:sz="2" w:space="0" w:color="000000"/>
-              <w:bottom w:val="single" w:sz="2" w:space="0" w:color="000000"/>
-            </w:tcBorders>
-          </w:tcPr>
-          <w:p>
-            <w:pPr>
-              <w:pStyle w:val="TableContents"/>
-              <w:widowControl w:val="false"/>
-              <w:bidi w:val="0"/>
-              <w:jc w:val="left"/>
-              <w:rPr/>
-            </w:pPr>
-            <w:r>
-              <w:rPr/>
-            </w:r>
-          </w:p>
-        </w:tc>
-        <w:tc>
-          <w:tcPr>
-            <w:tcW w:w="399" w:type="dxa"/>
-            <w:vMerge w:val="continue"/>
-            <w:tcBorders>
-              <w:left w:val="single" w:sz="2" w:space="0" w:color="000000"/>
-              <w:bottom w:val="single" w:sz="2" w:space="0" w:color="000000"/>
-            </w:tcBorders>
-          </w:tcPr>
-          <w:p>
-            <w:pPr>
-              <w:pStyle w:val="TableContents"/>
-              <w:widowControl w:val="false"/>
-              <w:bidi w:val="0"/>
-              <w:jc w:val="center"/>
-              <w:rPr/>
-            </w:pPr>
-            <w:r>
-              <w:rPr/>
-            </w:r>
-          </w:p>
-        </w:tc>
-        <w:tc>
-          <w:tcPr>
-            <w:tcW w:w="404" w:type="dxa"/>
-            <w:vMerge w:val="continue"/>
-            <w:tcBorders>
-              <w:left w:val="single" w:sz="2" w:space="0" w:color="000000"/>
-              <w:bottom w:val="single" w:sz="2" w:space="0" w:color="000000"/>
-            </w:tcBorders>
-          </w:tcPr>
-          <w:p>
-            <w:pPr>
-              <w:pStyle w:val="TableContents"/>
-              <w:widowControl w:val="false"/>
-              <w:bidi w:val="0"/>
-              <w:jc w:val="center"/>
-              <w:rPr/>
-            </w:pPr>
-            <w:r>
-              <w:rPr/>
-            </w:r>
-          </w:p>
-        </w:tc>
-        <w:tc>
-          <w:tcPr>
-            <w:tcW w:w="402" w:type="dxa"/>
-            <w:vMerge w:val="continue"/>
-            <w:tcBorders>
-              <w:left w:val="single" w:sz="2" w:space="0" w:color="000000"/>
-              <w:bottom w:val="single" w:sz="2" w:space="0" w:color="000000"/>
-            </w:tcBorders>
-          </w:tcPr>
-          <w:p>
-            <w:pPr>
-              <w:pStyle w:val="TableContents"/>
-              <w:widowControl w:val="false"/>
-              <w:bidi w:val="0"/>
-              <w:jc w:val="center"/>
-              <w:rPr/>
-            </w:pPr>
-            <w:r>
-              <w:rPr/>
-            </w:r>
-          </w:p>
-        </w:tc>
-        <w:tc>
-          <w:tcPr>
-            <w:tcW w:w="404" w:type="dxa"/>
-            <w:vMerge w:val="continue"/>
-            <w:tcBorders>
-              <w:left w:val="single" w:sz="2" w:space="0" w:color="000000"/>
-              <w:bottom w:val="single" w:sz="2" w:space="0" w:color="000000"/>
-            </w:tcBorders>
-          </w:tcPr>
-          <w:p>
-            <w:pPr>
-              <w:pStyle w:val="TableContents"/>
-              <w:widowControl w:val="false"/>
-              <w:bidi w:val="0"/>
-              <w:jc w:val="center"/>
-              <w:rPr/>
-            </w:pPr>
-            <w:r>
-              <w:rPr/>
-            </w:r>
-          </w:p>
-        </w:tc>
-        <w:tc>
-          <w:tcPr>
-            <w:tcW w:w="2621" w:type="dxa"/>
-            <w:vMerge w:val="continue"/>
-            <w:tcBorders>
-              <w:left w:val="single" w:sz="2" w:space="0" w:color="000000"/>
-              <w:bottom w:val="single" w:sz="2" w:space="0" w:color="000000"/>
-            </w:tcBorders>
-          </w:tcPr>
-          <w:p>
-            <w:pPr>
-              <w:pStyle w:val="TableContents"/>
-              <w:widowControl w:val="false"/>
-              <w:bidi w:val="0"/>
-              <w:jc w:val="left"/>
-              <w:rPr/>
-            </w:pPr>
-            <w:r>
-              <w:rPr/>
-            </w:r>
-          </w:p>
-        </w:tc>
-        <w:tc>
-          <w:tcPr>
-            <w:tcW w:w="3516" w:type="dxa"/>
-            <w:tcBorders>
-              <w:left w:val="single" w:sz="2" w:space="0" w:color="000000"/>
-              <w:bottom w:val="single" w:sz="2" w:space="0" w:color="000000"/>
-            </w:tcBorders>
-          </w:tcPr>
-          <w:p>
-            <w:pPr>
-              <w:pStyle w:val="TableContents"/>
-              <w:widowControl w:val="false"/>
-              <w:bidi w:val="0"/>
-              <w:jc w:val="left"/>
-              <w:rPr/>
-            </w:pPr>
-            <w:r>
-              <w:rPr/>
-              <w:t>GET /transactions/:assetid/out</w:t>
-            </w:r>
-          </w:p>
-        </w:tc>
-        <w:tc>
-          <w:tcPr>
-            <w:tcW w:w="3377" w:type="dxa"/>
+            <w:tcW w:w="2732" w:type="dxa"/>
+            <w:vMerge w:val="continue"/>
+            <w:tcBorders>
+              <w:left w:val="single" w:sz="2" w:space="0" w:color="000000"/>
+              <w:bottom w:val="single" w:sz="2" w:space="0" w:color="000000"/>
+            </w:tcBorders>
+          </w:tcPr>
+          <w:p>
+            <w:pPr>
+              <w:pStyle w:val="TableContents"/>
+              <w:widowControl w:val="false"/>
+              <w:bidi w:val="0"/>
+              <w:jc w:val="left"/>
+              <w:rPr/>
+            </w:pPr>
+            <w:r>
+              <w:rPr/>
+            </w:r>
+          </w:p>
+        </w:tc>
+        <w:tc>
+          <w:tcPr>
+            <w:tcW w:w="450" w:type="dxa"/>
+            <w:vMerge w:val="continue"/>
+            <w:tcBorders>
+              <w:left w:val="single" w:sz="2" w:space="0" w:color="000000"/>
+              <w:bottom w:val="single" w:sz="2" w:space="0" w:color="000000"/>
+            </w:tcBorders>
+          </w:tcPr>
+          <w:p>
+            <w:pPr>
+              <w:pStyle w:val="TableContents"/>
+              <w:widowControl w:val="false"/>
+              <w:bidi w:val="0"/>
+              <w:jc w:val="center"/>
+              <w:rPr/>
+            </w:pPr>
+            <w:r>
+              <w:rPr/>
+            </w:r>
+          </w:p>
+        </w:tc>
+        <w:tc>
+          <w:tcPr>
+            <w:tcW w:w="450" w:type="dxa"/>
+            <w:vMerge w:val="continue"/>
+            <w:tcBorders>
+              <w:left w:val="single" w:sz="2" w:space="0" w:color="000000"/>
+              <w:bottom w:val="single" w:sz="2" w:space="0" w:color="000000"/>
+            </w:tcBorders>
+          </w:tcPr>
+          <w:p>
+            <w:pPr>
+              <w:pStyle w:val="TableContents"/>
+              <w:widowControl w:val="false"/>
+              <w:bidi w:val="0"/>
+              <w:jc w:val="center"/>
+              <w:rPr/>
+            </w:pPr>
+            <w:r>
+              <w:rPr/>
+            </w:r>
+          </w:p>
+        </w:tc>
+        <w:tc>
+          <w:tcPr>
+            <w:tcW w:w="450" w:type="dxa"/>
+            <w:vMerge w:val="continue"/>
+            <w:tcBorders>
+              <w:left w:val="single" w:sz="2" w:space="0" w:color="000000"/>
+              <w:bottom w:val="single" w:sz="2" w:space="0" w:color="000000"/>
+            </w:tcBorders>
+          </w:tcPr>
+          <w:p>
+            <w:pPr>
+              <w:pStyle w:val="TableContents"/>
+              <w:widowControl w:val="false"/>
+              <w:bidi w:val="0"/>
+              <w:jc w:val="center"/>
+              <w:rPr/>
+            </w:pPr>
+            <w:r>
+              <w:rPr/>
+            </w:r>
+          </w:p>
+        </w:tc>
+        <w:tc>
+          <w:tcPr>
+            <w:tcW w:w="450" w:type="dxa"/>
+            <w:vMerge w:val="continue"/>
+            <w:tcBorders>
+              <w:left w:val="single" w:sz="2" w:space="0" w:color="000000"/>
+              <w:bottom w:val="single" w:sz="2" w:space="0" w:color="000000"/>
+            </w:tcBorders>
+          </w:tcPr>
+          <w:p>
+            <w:pPr>
+              <w:pStyle w:val="TableContents"/>
+              <w:widowControl w:val="false"/>
+              <w:bidi w:val="0"/>
+              <w:jc w:val="center"/>
+              <w:rPr/>
+            </w:pPr>
+            <w:r>
+              <w:rPr/>
+            </w:r>
+          </w:p>
+        </w:tc>
+        <w:tc>
+          <w:tcPr>
+            <w:tcW w:w="2700" w:type="dxa"/>
+            <w:vMerge w:val="continue"/>
+            <w:tcBorders>
+              <w:left w:val="single" w:sz="2" w:space="0" w:color="000000"/>
+              <w:bottom w:val="single" w:sz="2" w:space="0" w:color="000000"/>
+            </w:tcBorders>
+          </w:tcPr>
+          <w:p>
+            <w:pPr>
+              <w:pStyle w:val="TableContents"/>
+              <w:widowControl w:val="false"/>
+              <w:bidi w:val="0"/>
+              <w:jc w:val="left"/>
+              <w:rPr/>
+            </w:pPr>
+            <w:r>
+              <w:rPr/>
+            </w:r>
+          </w:p>
+        </w:tc>
+        <w:tc>
+          <w:tcPr>
+            <w:tcW w:w="4500" w:type="dxa"/>
+            <w:tcBorders>
+              <w:left w:val="single" w:sz="2" w:space="0" w:color="000000"/>
+              <w:bottom w:val="single" w:sz="2" w:space="0" w:color="000000"/>
+            </w:tcBorders>
+          </w:tcPr>
+          <w:p>
+            <w:pPr>
+              <w:pStyle w:val="TableContents"/>
+              <w:widowControl w:val="false"/>
+              <w:bidi w:val="0"/>
+              <w:jc w:val="left"/>
+              <w:rPr/>
+            </w:pPr>
+            <w:r>
+              <w:rPr/>
+              <w:t>GET /transactions/:</w:t>
+            </w:r>
+            <w:r>
+              <w:rPr/>
+              <w:t>requestid</w:t>
+            </w:r>
+            <w:r>
+              <w:rPr/>
+              <w:t>/out</w:t>
+            </w:r>
+          </w:p>
+        </w:tc>
+        <w:tc>
+          <w:tcPr>
+            <w:tcW w:w="2836" w:type="dxa"/>
             <w:vMerge w:val="continue"/>
             <w:tcBorders>
               <w:left w:val="single" w:sz="2" w:space="0" w:color="000000"/>
@@ -4108,161 +4339,165 @@
         <w:trPr/>
         <w:tc>
           <w:tcPr>
-            <w:tcW w:w="3445" w:type="dxa"/>
-            <w:vMerge w:val="continue"/>
-            <w:tcBorders>
-              <w:left w:val="single" w:sz="2" w:space="0" w:color="000000"/>
-              <w:bottom w:val="single" w:sz="2" w:space="0" w:color="000000"/>
-            </w:tcBorders>
-          </w:tcPr>
-          <w:p>
-            <w:pPr>
-              <w:pStyle w:val="TableContents"/>
-              <w:widowControl w:val="false"/>
-              <w:bidi w:val="0"/>
-              <w:jc w:val="left"/>
-              <w:rPr/>
-            </w:pPr>
-            <w:r>
-              <w:rPr/>
-            </w:r>
-          </w:p>
-        </w:tc>
-        <w:tc>
-          <w:tcPr>
-            <w:tcW w:w="399" w:type="dxa"/>
-            <w:vMerge w:val="continue"/>
-            <w:tcBorders>
-              <w:left w:val="single" w:sz="2" w:space="0" w:color="000000"/>
-              <w:bottom w:val="single" w:sz="2" w:space="0" w:color="000000"/>
-            </w:tcBorders>
-          </w:tcPr>
-          <w:p>
-            <w:pPr>
-              <w:pStyle w:val="TableContents"/>
-              <w:widowControl w:val="false"/>
-              <w:bidi w:val="0"/>
-              <w:jc w:val="center"/>
-              <w:rPr/>
-            </w:pPr>
-            <w:r>
-              <w:rPr/>
-            </w:r>
-          </w:p>
-        </w:tc>
-        <w:tc>
-          <w:tcPr>
-            <w:tcW w:w="404" w:type="dxa"/>
-            <w:vMerge w:val="continue"/>
-            <w:tcBorders>
-              <w:left w:val="single" w:sz="2" w:space="0" w:color="000000"/>
-              <w:bottom w:val="single" w:sz="2" w:space="0" w:color="000000"/>
-            </w:tcBorders>
-          </w:tcPr>
-          <w:p>
-            <w:pPr>
-              <w:pStyle w:val="TableContents"/>
-              <w:widowControl w:val="false"/>
-              <w:bidi w:val="0"/>
-              <w:jc w:val="center"/>
-              <w:rPr/>
-            </w:pPr>
-            <w:r>
-              <w:rPr/>
-            </w:r>
-          </w:p>
-        </w:tc>
-        <w:tc>
-          <w:tcPr>
-            <w:tcW w:w="402" w:type="dxa"/>
-            <w:vMerge w:val="continue"/>
-            <w:tcBorders>
-              <w:left w:val="single" w:sz="2" w:space="0" w:color="000000"/>
-              <w:bottom w:val="single" w:sz="2" w:space="0" w:color="000000"/>
-            </w:tcBorders>
-          </w:tcPr>
-          <w:p>
-            <w:pPr>
-              <w:pStyle w:val="TableContents"/>
-              <w:widowControl w:val="false"/>
-              <w:bidi w:val="0"/>
-              <w:jc w:val="center"/>
-              <w:rPr/>
-            </w:pPr>
-            <w:r>
-              <w:rPr/>
-            </w:r>
-          </w:p>
-        </w:tc>
-        <w:tc>
-          <w:tcPr>
-            <w:tcW w:w="404" w:type="dxa"/>
-            <w:vMerge w:val="continue"/>
-            <w:tcBorders>
-              <w:left w:val="single" w:sz="2" w:space="0" w:color="000000"/>
-              <w:bottom w:val="single" w:sz="2" w:space="0" w:color="000000"/>
-            </w:tcBorders>
-          </w:tcPr>
-          <w:p>
-            <w:pPr>
-              <w:pStyle w:val="TableContents"/>
-              <w:widowControl w:val="false"/>
-              <w:bidi w:val="0"/>
-              <w:jc w:val="center"/>
-              <w:rPr/>
-            </w:pPr>
-            <w:r>
-              <w:rPr/>
-            </w:r>
-          </w:p>
-        </w:tc>
-        <w:tc>
-          <w:tcPr>
-            <w:tcW w:w="2621" w:type="dxa"/>
-            <w:vMerge w:val="continue"/>
-            <w:tcBorders>
-              <w:left w:val="single" w:sz="2" w:space="0" w:color="000000"/>
-              <w:bottom w:val="single" w:sz="2" w:space="0" w:color="000000"/>
-            </w:tcBorders>
-          </w:tcPr>
-          <w:p>
-            <w:pPr>
-              <w:pStyle w:val="TableContents"/>
-              <w:widowControl w:val="false"/>
-              <w:bidi w:val="0"/>
-              <w:jc w:val="left"/>
-              <w:rPr/>
-            </w:pPr>
-            <w:r>
-              <w:rPr/>
-            </w:r>
-          </w:p>
-        </w:tc>
-        <w:tc>
-          <w:tcPr>
-            <w:tcW w:w="3516" w:type="dxa"/>
-            <w:tcBorders>
-              <w:left w:val="single" w:sz="2" w:space="0" w:color="000000"/>
-              <w:bottom w:val="single" w:sz="2" w:space="0" w:color="000000"/>
-            </w:tcBorders>
-          </w:tcPr>
-          <w:p>
-            <w:pPr>
-              <w:pStyle w:val="TableContents"/>
-              <w:widowControl w:val="false"/>
-              <w:bidi w:val="0"/>
-              <w:jc w:val="left"/>
-              <w:rPr/>
-            </w:pPr>
-            <w:r>
-              <w:rPr/>
-              <w:t>POST /transactions/:assetid</w:t>
-            </w:r>
-          </w:p>
-        </w:tc>
-        <w:tc>
-          <w:tcPr>
-            <w:tcW w:w="3377" w:type="dxa"/>
+            <w:tcW w:w="2732" w:type="dxa"/>
+            <w:vMerge w:val="continue"/>
+            <w:tcBorders>
+              <w:left w:val="single" w:sz="2" w:space="0" w:color="000000"/>
+              <w:bottom w:val="single" w:sz="2" w:space="0" w:color="000000"/>
+            </w:tcBorders>
+          </w:tcPr>
+          <w:p>
+            <w:pPr>
+              <w:pStyle w:val="TableContents"/>
+              <w:widowControl w:val="false"/>
+              <w:bidi w:val="0"/>
+              <w:jc w:val="left"/>
+              <w:rPr/>
+            </w:pPr>
+            <w:r>
+              <w:rPr/>
+            </w:r>
+          </w:p>
+        </w:tc>
+        <w:tc>
+          <w:tcPr>
+            <w:tcW w:w="450" w:type="dxa"/>
+            <w:vMerge w:val="continue"/>
+            <w:tcBorders>
+              <w:left w:val="single" w:sz="2" w:space="0" w:color="000000"/>
+              <w:bottom w:val="single" w:sz="2" w:space="0" w:color="000000"/>
+            </w:tcBorders>
+          </w:tcPr>
+          <w:p>
+            <w:pPr>
+              <w:pStyle w:val="TableContents"/>
+              <w:widowControl w:val="false"/>
+              <w:bidi w:val="0"/>
+              <w:jc w:val="center"/>
+              <w:rPr/>
+            </w:pPr>
+            <w:r>
+              <w:rPr/>
+            </w:r>
+          </w:p>
+        </w:tc>
+        <w:tc>
+          <w:tcPr>
+            <w:tcW w:w="450" w:type="dxa"/>
+            <w:vMerge w:val="continue"/>
+            <w:tcBorders>
+              <w:left w:val="single" w:sz="2" w:space="0" w:color="000000"/>
+              <w:bottom w:val="single" w:sz="2" w:space="0" w:color="000000"/>
+            </w:tcBorders>
+          </w:tcPr>
+          <w:p>
+            <w:pPr>
+              <w:pStyle w:val="TableContents"/>
+              <w:widowControl w:val="false"/>
+              <w:bidi w:val="0"/>
+              <w:jc w:val="center"/>
+              <w:rPr/>
+            </w:pPr>
+            <w:r>
+              <w:rPr/>
+            </w:r>
+          </w:p>
+        </w:tc>
+        <w:tc>
+          <w:tcPr>
+            <w:tcW w:w="450" w:type="dxa"/>
+            <w:vMerge w:val="continue"/>
+            <w:tcBorders>
+              <w:left w:val="single" w:sz="2" w:space="0" w:color="000000"/>
+              <w:bottom w:val="single" w:sz="2" w:space="0" w:color="000000"/>
+            </w:tcBorders>
+          </w:tcPr>
+          <w:p>
+            <w:pPr>
+              <w:pStyle w:val="TableContents"/>
+              <w:widowControl w:val="false"/>
+              <w:bidi w:val="0"/>
+              <w:jc w:val="center"/>
+              <w:rPr/>
+            </w:pPr>
+            <w:r>
+              <w:rPr/>
+            </w:r>
+          </w:p>
+        </w:tc>
+        <w:tc>
+          <w:tcPr>
+            <w:tcW w:w="450" w:type="dxa"/>
+            <w:vMerge w:val="continue"/>
+            <w:tcBorders>
+              <w:left w:val="single" w:sz="2" w:space="0" w:color="000000"/>
+              <w:bottom w:val="single" w:sz="2" w:space="0" w:color="000000"/>
+            </w:tcBorders>
+          </w:tcPr>
+          <w:p>
+            <w:pPr>
+              <w:pStyle w:val="TableContents"/>
+              <w:widowControl w:val="false"/>
+              <w:bidi w:val="0"/>
+              <w:jc w:val="center"/>
+              <w:rPr/>
+            </w:pPr>
+            <w:r>
+              <w:rPr/>
+            </w:r>
+          </w:p>
+        </w:tc>
+        <w:tc>
+          <w:tcPr>
+            <w:tcW w:w="2700" w:type="dxa"/>
+            <w:vMerge w:val="continue"/>
+            <w:tcBorders>
+              <w:left w:val="single" w:sz="2" w:space="0" w:color="000000"/>
+              <w:bottom w:val="single" w:sz="2" w:space="0" w:color="000000"/>
+            </w:tcBorders>
+          </w:tcPr>
+          <w:p>
+            <w:pPr>
+              <w:pStyle w:val="TableContents"/>
+              <w:widowControl w:val="false"/>
+              <w:bidi w:val="0"/>
+              <w:jc w:val="left"/>
+              <w:rPr/>
+            </w:pPr>
+            <w:r>
+              <w:rPr/>
+            </w:r>
+          </w:p>
+        </w:tc>
+        <w:tc>
+          <w:tcPr>
+            <w:tcW w:w="4500" w:type="dxa"/>
+            <w:tcBorders>
+              <w:left w:val="single" w:sz="2" w:space="0" w:color="000000"/>
+              <w:bottom w:val="single" w:sz="2" w:space="0" w:color="000000"/>
+            </w:tcBorders>
+          </w:tcPr>
+          <w:p>
+            <w:pPr>
+              <w:pStyle w:val="TableContents"/>
+              <w:widowControl w:val="false"/>
+              <w:bidi w:val="0"/>
+              <w:jc w:val="left"/>
+              <w:rPr/>
+            </w:pPr>
+            <w:r>
+              <w:rPr/>
+              <w:t>POST /transactions/:</w:t>
+            </w:r>
+            <w:r>
+              <w:rPr/>
+              <w:t>requestid</w:t>
+            </w:r>
+          </w:p>
+        </w:tc>
+        <w:tc>
+          <w:tcPr>
+            <w:tcW w:w="2836" w:type="dxa"/>
             <w:vMerge w:val="continue"/>
             <w:tcBorders>
               <w:left w:val="single" w:sz="2" w:space="0" w:color="000000"/>
@@ -4288,29 +4523,31 @@
         <w:trPr/>
         <w:tc>
           <w:tcPr>
-            <w:tcW w:w="3445" w:type="dxa"/>
-            <w:tcBorders>
-              <w:left w:val="single" w:sz="2" w:space="0" w:color="000000"/>
-              <w:bottom w:val="single" w:sz="2" w:space="0" w:color="000000"/>
-            </w:tcBorders>
-          </w:tcPr>
-          <w:p>
-            <w:pPr>
-              <w:pStyle w:val="TableContents"/>
-              <w:widowControl w:val="false"/>
-              <w:bidi w:val="0"/>
-              <w:jc w:val="left"/>
-              <w:rPr/>
-            </w:pPr>
-            <w:r>
-              <w:rPr/>
-              <w:t>View Transaction</w:t>
-            </w:r>
-          </w:p>
-        </w:tc>
-        <w:tc>
-          <w:tcPr>
-            <w:tcW w:w="399" w:type="dxa"/>
+            <w:tcW w:w="2732" w:type="dxa"/>
+            <w:vMerge w:val="restart"/>
+            <w:tcBorders>
+              <w:left w:val="single" w:sz="2" w:space="0" w:color="000000"/>
+              <w:bottom w:val="single" w:sz="2" w:space="0" w:color="000000"/>
+            </w:tcBorders>
+          </w:tcPr>
+          <w:p>
+            <w:pPr>
+              <w:pStyle w:val="TableContents"/>
+              <w:widowControl w:val="false"/>
+              <w:bidi w:val="0"/>
+              <w:jc w:val="left"/>
+              <w:rPr/>
+            </w:pPr>
+            <w:r>
+              <w:rPr/>
+              <w:t>Update Transaction</w:t>
+            </w:r>
+          </w:p>
+        </w:tc>
+        <w:tc>
+          <w:tcPr>
+            <w:tcW w:w="450" w:type="dxa"/>
+            <w:vMerge w:val="restart"/>
             <w:tcBorders>
               <w:left w:val="single" w:sz="2" w:space="0" w:color="000000"/>
               <w:bottom w:val="single" w:sz="2" w:space="0" w:color="000000"/>
@@ -4332,115 +4569,118 @@
         </w:tc>
         <w:tc>
           <w:tcPr>
-            <w:tcW w:w="404" w:type="dxa"/>
-            <w:tcBorders>
-              <w:left w:val="single" w:sz="2" w:space="0" w:color="000000"/>
-              <w:bottom w:val="single" w:sz="2" w:space="0" w:color="000000"/>
-            </w:tcBorders>
-          </w:tcPr>
-          <w:p>
-            <w:pPr>
-              <w:pStyle w:val="TableContents"/>
-              <w:widowControl w:val="false"/>
-              <w:bidi w:val="0"/>
-              <w:jc w:val="center"/>
-              <w:rPr/>
-            </w:pPr>
-            <w:r>
-              <w:rPr/>
-              <w:t>X</w:t>
-            </w:r>
-          </w:p>
-        </w:tc>
-        <w:tc>
-          <w:tcPr>
-            <w:tcW w:w="402" w:type="dxa"/>
-            <w:tcBorders>
-              <w:left w:val="single" w:sz="2" w:space="0" w:color="000000"/>
-              <w:bottom w:val="single" w:sz="2" w:space="0" w:color="000000"/>
-            </w:tcBorders>
-          </w:tcPr>
-          <w:p>
-            <w:pPr>
-              <w:pStyle w:val="TableContents"/>
-              <w:widowControl w:val="false"/>
-              <w:bidi w:val="0"/>
-              <w:jc w:val="center"/>
-              <w:rPr/>
-            </w:pPr>
-            <w:r>
-              <w:rPr/>
-            </w:r>
-          </w:p>
-        </w:tc>
-        <w:tc>
-          <w:tcPr>
-            <w:tcW w:w="404" w:type="dxa"/>
-            <w:tcBorders>
-              <w:left w:val="single" w:sz="2" w:space="0" w:color="000000"/>
-              <w:bottom w:val="single" w:sz="2" w:space="0" w:color="000000"/>
-            </w:tcBorders>
-          </w:tcPr>
-          <w:p>
-            <w:pPr>
-              <w:pStyle w:val="TableContents"/>
-              <w:widowControl w:val="false"/>
-              <w:bidi w:val="0"/>
-              <w:jc w:val="center"/>
-              <w:rPr/>
-            </w:pPr>
-            <w:r>
-              <w:rPr/>
-            </w:r>
-          </w:p>
-        </w:tc>
-        <w:tc>
-          <w:tcPr>
-            <w:tcW w:w="2621" w:type="dxa"/>
-            <w:tcBorders>
-              <w:left w:val="single" w:sz="2" w:space="0" w:color="000000"/>
-              <w:bottom w:val="single" w:sz="2" w:space="0" w:color="000000"/>
-            </w:tcBorders>
-          </w:tcPr>
-          <w:p>
-            <w:pPr>
-              <w:pStyle w:val="TableContents"/>
-              <w:widowControl w:val="false"/>
-              <w:bidi w:val="0"/>
-              <w:jc w:val="left"/>
-              <w:rPr/>
-            </w:pPr>
-            <w:r>
-              <w:rPr/>
-              <w:t>View:transactions</w:t>
-            </w:r>
-          </w:p>
-        </w:tc>
-        <w:tc>
-          <w:tcPr>
-            <w:tcW w:w="3516" w:type="dxa"/>
-            <w:tcBorders>
-              <w:left w:val="single" w:sz="2" w:space="0" w:color="000000"/>
-              <w:bottom w:val="single" w:sz="2" w:space="0" w:color="000000"/>
-            </w:tcBorders>
-          </w:tcPr>
-          <w:p>
-            <w:pPr>
-              <w:pStyle w:val="TableContents"/>
-              <w:widowControl w:val="false"/>
-              <w:bidi w:val="0"/>
-              <w:jc w:val="left"/>
-              <w:rPr/>
-            </w:pPr>
-            <w:r>
-              <w:rPr/>
-              <w:t>GET /transactions/:transactionid</w:t>
-            </w:r>
-          </w:p>
-        </w:tc>
-        <w:tc>
-          <w:tcPr>
-            <w:tcW w:w="3377" w:type="dxa"/>
+            <w:tcW w:w="450" w:type="dxa"/>
+            <w:vMerge w:val="restart"/>
+            <w:tcBorders>
+              <w:left w:val="single" w:sz="2" w:space="0" w:color="000000"/>
+              <w:bottom w:val="single" w:sz="2" w:space="0" w:color="000000"/>
+            </w:tcBorders>
+          </w:tcPr>
+          <w:p>
+            <w:pPr>
+              <w:pStyle w:val="TableContents"/>
+              <w:widowControl w:val="false"/>
+              <w:bidi w:val="0"/>
+              <w:jc w:val="center"/>
+              <w:rPr/>
+            </w:pPr>
+            <w:r>
+              <w:rPr/>
+            </w:r>
+          </w:p>
+        </w:tc>
+        <w:tc>
+          <w:tcPr>
+            <w:tcW w:w="450" w:type="dxa"/>
+            <w:vMerge w:val="restart"/>
+            <w:tcBorders>
+              <w:left w:val="single" w:sz="2" w:space="0" w:color="000000"/>
+              <w:bottom w:val="single" w:sz="2" w:space="0" w:color="000000"/>
+            </w:tcBorders>
+          </w:tcPr>
+          <w:p>
+            <w:pPr>
+              <w:pStyle w:val="TableContents"/>
+              <w:widowControl w:val="false"/>
+              <w:bidi w:val="0"/>
+              <w:jc w:val="center"/>
+              <w:rPr/>
+            </w:pPr>
+            <w:r>
+              <w:rPr/>
+            </w:r>
+          </w:p>
+        </w:tc>
+        <w:tc>
+          <w:tcPr>
+            <w:tcW w:w="450" w:type="dxa"/>
+            <w:vMerge w:val="restart"/>
+            <w:tcBorders>
+              <w:left w:val="single" w:sz="2" w:space="0" w:color="000000"/>
+              <w:bottom w:val="single" w:sz="2" w:space="0" w:color="000000"/>
+            </w:tcBorders>
+          </w:tcPr>
+          <w:p>
+            <w:pPr>
+              <w:pStyle w:val="TableContents"/>
+              <w:widowControl w:val="false"/>
+              <w:bidi w:val="0"/>
+              <w:jc w:val="center"/>
+              <w:rPr/>
+            </w:pPr>
+            <w:r>
+              <w:rPr/>
+            </w:r>
+          </w:p>
+        </w:tc>
+        <w:tc>
+          <w:tcPr>
+            <w:tcW w:w="2700" w:type="dxa"/>
+            <w:vMerge w:val="restart"/>
+            <w:tcBorders>
+              <w:left w:val="single" w:sz="2" w:space="0" w:color="000000"/>
+              <w:bottom w:val="single" w:sz="2" w:space="0" w:color="000000"/>
+            </w:tcBorders>
+          </w:tcPr>
+          <w:p>
+            <w:pPr>
+              <w:pStyle w:val="TableContents"/>
+              <w:widowControl w:val="false"/>
+              <w:bidi w:val="0"/>
+              <w:jc w:val="left"/>
+              <w:rPr/>
+            </w:pPr>
+            <w:r>
+              <w:rPr/>
+              <w:t>Update:transactions</w:t>
+            </w:r>
+          </w:p>
+        </w:tc>
+        <w:tc>
+          <w:tcPr>
+            <w:tcW w:w="4500" w:type="dxa"/>
+            <w:tcBorders>
+              <w:left w:val="single" w:sz="2" w:space="0" w:color="000000"/>
+              <w:bottom w:val="single" w:sz="2" w:space="0" w:color="000000"/>
+            </w:tcBorders>
+          </w:tcPr>
+          <w:p>
+            <w:pPr>
+              <w:pStyle w:val="TableContents"/>
+              <w:widowControl w:val="false"/>
+              <w:bidi w:val="0"/>
+              <w:jc w:val="left"/>
+              <w:rPr/>
+            </w:pPr>
+            <w:r>
+              <w:rPr/>
+              <w:t>GET /transactions/:transactionid/update</w:t>
+            </w:r>
+          </w:p>
+        </w:tc>
+        <w:tc>
+          <w:tcPr>
+            <w:tcW w:w="2836" w:type="dxa"/>
             <w:vMerge w:val="continue"/>
             <w:tcBorders>
               <w:left w:val="single" w:sz="2" w:space="0" w:color="000000"/>
@@ -4466,7 +4706,365 @@
         <w:trPr/>
         <w:tc>
           <w:tcPr>
-            <w:tcW w:w="3445" w:type="dxa"/>
+            <w:tcW w:w="2732" w:type="dxa"/>
+            <w:vMerge w:val="continue"/>
+            <w:tcBorders>
+              <w:left w:val="single" w:sz="2" w:space="0" w:color="000000"/>
+              <w:bottom w:val="single" w:sz="2" w:space="0" w:color="000000"/>
+            </w:tcBorders>
+          </w:tcPr>
+          <w:p>
+            <w:pPr>
+              <w:pStyle w:val="TableContents"/>
+              <w:widowControl w:val="false"/>
+              <w:bidi w:val="0"/>
+              <w:jc w:val="left"/>
+              <w:rPr/>
+            </w:pPr>
+            <w:r>
+              <w:rPr/>
+            </w:r>
+          </w:p>
+        </w:tc>
+        <w:tc>
+          <w:tcPr>
+            <w:tcW w:w="450" w:type="dxa"/>
+            <w:vMerge w:val="continue"/>
+            <w:tcBorders>
+              <w:left w:val="single" w:sz="2" w:space="0" w:color="000000"/>
+              <w:bottom w:val="single" w:sz="2" w:space="0" w:color="000000"/>
+            </w:tcBorders>
+          </w:tcPr>
+          <w:p>
+            <w:pPr>
+              <w:pStyle w:val="TableContents"/>
+              <w:widowControl w:val="false"/>
+              <w:bidi w:val="0"/>
+              <w:jc w:val="center"/>
+              <w:rPr/>
+            </w:pPr>
+            <w:r>
+              <w:rPr/>
+            </w:r>
+          </w:p>
+        </w:tc>
+        <w:tc>
+          <w:tcPr>
+            <w:tcW w:w="450" w:type="dxa"/>
+            <w:vMerge w:val="continue"/>
+            <w:tcBorders>
+              <w:left w:val="single" w:sz="2" w:space="0" w:color="000000"/>
+              <w:bottom w:val="single" w:sz="2" w:space="0" w:color="000000"/>
+            </w:tcBorders>
+          </w:tcPr>
+          <w:p>
+            <w:pPr>
+              <w:pStyle w:val="TableContents"/>
+              <w:widowControl w:val="false"/>
+              <w:bidi w:val="0"/>
+              <w:jc w:val="center"/>
+              <w:rPr/>
+            </w:pPr>
+            <w:r>
+              <w:rPr/>
+            </w:r>
+          </w:p>
+        </w:tc>
+        <w:tc>
+          <w:tcPr>
+            <w:tcW w:w="450" w:type="dxa"/>
+            <w:vMerge w:val="continue"/>
+            <w:tcBorders>
+              <w:left w:val="single" w:sz="2" w:space="0" w:color="000000"/>
+              <w:bottom w:val="single" w:sz="2" w:space="0" w:color="000000"/>
+            </w:tcBorders>
+          </w:tcPr>
+          <w:p>
+            <w:pPr>
+              <w:pStyle w:val="TableContents"/>
+              <w:widowControl w:val="false"/>
+              <w:bidi w:val="0"/>
+              <w:jc w:val="center"/>
+              <w:rPr/>
+            </w:pPr>
+            <w:r>
+              <w:rPr/>
+            </w:r>
+          </w:p>
+        </w:tc>
+        <w:tc>
+          <w:tcPr>
+            <w:tcW w:w="450" w:type="dxa"/>
+            <w:vMerge w:val="continue"/>
+            <w:tcBorders>
+              <w:left w:val="single" w:sz="2" w:space="0" w:color="000000"/>
+              <w:bottom w:val="single" w:sz="2" w:space="0" w:color="000000"/>
+            </w:tcBorders>
+          </w:tcPr>
+          <w:p>
+            <w:pPr>
+              <w:pStyle w:val="TableContents"/>
+              <w:widowControl w:val="false"/>
+              <w:bidi w:val="0"/>
+              <w:jc w:val="center"/>
+              <w:rPr/>
+            </w:pPr>
+            <w:r>
+              <w:rPr/>
+            </w:r>
+          </w:p>
+        </w:tc>
+        <w:tc>
+          <w:tcPr>
+            <w:tcW w:w="2700" w:type="dxa"/>
+            <w:vMerge w:val="continue"/>
+            <w:tcBorders>
+              <w:left w:val="single" w:sz="2" w:space="0" w:color="000000"/>
+              <w:bottom w:val="single" w:sz="2" w:space="0" w:color="000000"/>
+            </w:tcBorders>
+          </w:tcPr>
+          <w:p>
+            <w:pPr>
+              <w:pStyle w:val="TableContents"/>
+              <w:widowControl w:val="false"/>
+              <w:bidi w:val="0"/>
+              <w:jc w:val="left"/>
+              <w:rPr/>
+            </w:pPr>
+            <w:r>
+              <w:rPr/>
+            </w:r>
+          </w:p>
+        </w:tc>
+        <w:tc>
+          <w:tcPr>
+            <w:tcW w:w="4500" w:type="dxa"/>
+            <w:tcBorders>
+              <w:left w:val="single" w:sz="2" w:space="0" w:color="000000"/>
+              <w:bottom w:val="single" w:sz="2" w:space="0" w:color="000000"/>
+            </w:tcBorders>
+          </w:tcPr>
+          <w:p>
+            <w:pPr>
+              <w:pStyle w:val="TableContents"/>
+              <w:widowControl w:val="false"/>
+              <w:bidi w:val="0"/>
+              <w:jc w:val="left"/>
+              <w:rPr/>
+            </w:pPr>
+            <w:r>
+              <w:rPr/>
+              <w:t>POST /transactions/:transactionid/update</w:t>
+            </w:r>
+          </w:p>
+        </w:tc>
+        <w:tc>
+          <w:tcPr>
+            <w:tcW w:w="2836" w:type="dxa"/>
+            <w:vMerge w:val="continue"/>
+            <w:tcBorders>
+              <w:left w:val="single" w:sz="2" w:space="0" w:color="000000"/>
+              <w:bottom w:val="single" w:sz="2" w:space="0" w:color="000000"/>
+              <w:right w:val="single" w:sz="2" w:space="0" w:color="000000"/>
+            </w:tcBorders>
+          </w:tcPr>
+          <w:p>
+            <w:pPr>
+              <w:pStyle w:val="TableContents"/>
+              <w:widowControl w:val="false"/>
+              <w:bidi w:val="0"/>
+              <w:jc w:val="left"/>
+              <w:rPr/>
+            </w:pPr>
+            <w:r>
+              <w:rPr/>
+            </w:r>
+          </w:p>
+        </w:tc>
+      </w:tr>
+      <w:tr>
+        <w:trPr/>
+        <w:tc>
+          <w:tcPr>
+            <w:tcW w:w="2732" w:type="dxa"/>
+            <w:tcBorders>
+              <w:left w:val="single" w:sz="2" w:space="0" w:color="000000"/>
+              <w:bottom w:val="single" w:sz="2" w:space="0" w:color="000000"/>
+            </w:tcBorders>
+          </w:tcPr>
+          <w:p>
+            <w:pPr>
+              <w:pStyle w:val="TableContents"/>
+              <w:widowControl w:val="false"/>
+              <w:bidi w:val="0"/>
+              <w:jc w:val="left"/>
+              <w:rPr/>
+            </w:pPr>
+            <w:r>
+              <w:rPr/>
+              <w:t>View Transaction</w:t>
+            </w:r>
+          </w:p>
+        </w:tc>
+        <w:tc>
+          <w:tcPr>
+            <w:tcW w:w="450" w:type="dxa"/>
+            <w:tcBorders>
+              <w:left w:val="single" w:sz="2" w:space="0" w:color="000000"/>
+              <w:bottom w:val="single" w:sz="2" w:space="0" w:color="000000"/>
+            </w:tcBorders>
+          </w:tcPr>
+          <w:p>
+            <w:pPr>
+              <w:pStyle w:val="TableContents"/>
+              <w:widowControl w:val="false"/>
+              <w:bidi w:val="0"/>
+              <w:jc w:val="center"/>
+              <w:rPr/>
+            </w:pPr>
+            <w:r>
+              <w:rPr/>
+              <w:t>X</w:t>
+            </w:r>
+          </w:p>
+        </w:tc>
+        <w:tc>
+          <w:tcPr>
+            <w:tcW w:w="450" w:type="dxa"/>
+            <w:tcBorders>
+              <w:left w:val="single" w:sz="2" w:space="0" w:color="000000"/>
+              <w:bottom w:val="single" w:sz="2" w:space="0" w:color="000000"/>
+            </w:tcBorders>
+          </w:tcPr>
+          <w:p>
+            <w:pPr>
+              <w:pStyle w:val="TableContents"/>
+              <w:widowControl w:val="false"/>
+              <w:bidi w:val="0"/>
+              <w:jc w:val="center"/>
+              <w:rPr/>
+            </w:pPr>
+            <w:r>
+              <w:rPr/>
+              <w:t>X</w:t>
+            </w:r>
+          </w:p>
+        </w:tc>
+        <w:tc>
+          <w:tcPr>
+            <w:tcW w:w="450" w:type="dxa"/>
+            <w:tcBorders>
+              <w:left w:val="single" w:sz="2" w:space="0" w:color="000000"/>
+              <w:bottom w:val="single" w:sz="2" w:space="0" w:color="000000"/>
+            </w:tcBorders>
+          </w:tcPr>
+          <w:p>
+            <w:pPr>
+              <w:pStyle w:val="TableContents"/>
+              <w:widowControl w:val="false"/>
+              <w:bidi w:val="0"/>
+              <w:jc w:val="center"/>
+              <w:rPr/>
+            </w:pPr>
+            <w:r>
+              <w:rPr/>
+            </w:r>
+          </w:p>
+        </w:tc>
+        <w:tc>
+          <w:tcPr>
+            <w:tcW w:w="450" w:type="dxa"/>
+            <w:tcBorders>
+              <w:left w:val="single" w:sz="2" w:space="0" w:color="000000"/>
+              <w:bottom w:val="single" w:sz="2" w:space="0" w:color="000000"/>
+            </w:tcBorders>
+          </w:tcPr>
+          <w:p>
+            <w:pPr>
+              <w:pStyle w:val="TableContents"/>
+              <w:widowControl w:val="false"/>
+              <w:bidi w:val="0"/>
+              <w:jc w:val="center"/>
+              <w:rPr/>
+            </w:pPr>
+            <w:r>
+              <w:rPr/>
+            </w:r>
+          </w:p>
+        </w:tc>
+        <w:tc>
+          <w:tcPr>
+            <w:tcW w:w="2700" w:type="dxa"/>
+            <w:tcBorders>
+              <w:left w:val="single" w:sz="2" w:space="0" w:color="000000"/>
+              <w:bottom w:val="single" w:sz="2" w:space="0" w:color="000000"/>
+            </w:tcBorders>
+          </w:tcPr>
+          <w:p>
+            <w:pPr>
+              <w:pStyle w:val="TableContents"/>
+              <w:widowControl w:val="false"/>
+              <w:bidi w:val="0"/>
+              <w:jc w:val="left"/>
+              <w:rPr/>
+            </w:pPr>
+            <w:r>
+              <w:rPr/>
+              <w:t>View:transactions</w:t>
+            </w:r>
+          </w:p>
+        </w:tc>
+        <w:tc>
+          <w:tcPr>
+            <w:tcW w:w="4500" w:type="dxa"/>
+            <w:tcBorders>
+              <w:left w:val="single" w:sz="2" w:space="0" w:color="000000"/>
+              <w:bottom w:val="single" w:sz="2" w:space="0" w:color="000000"/>
+            </w:tcBorders>
+          </w:tcPr>
+          <w:p>
+            <w:pPr>
+              <w:pStyle w:val="TableContents"/>
+              <w:widowControl w:val="false"/>
+              <w:bidi w:val="0"/>
+              <w:jc w:val="left"/>
+              <w:rPr/>
+            </w:pPr>
+            <w:r>
+              <w:rPr/>
+              <w:t>GET /transactions/:transactionid</w:t>
+            </w:r>
+          </w:p>
+        </w:tc>
+        <w:tc>
+          <w:tcPr>
+            <w:tcW w:w="2836" w:type="dxa"/>
+            <w:vMerge w:val="continue"/>
+            <w:tcBorders>
+              <w:left w:val="single" w:sz="2" w:space="0" w:color="000000"/>
+              <w:bottom w:val="single" w:sz="2" w:space="0" w:color="000000"/>
+              <w:right w:val="single" w:sz="2" w:space="0" w:color="000000"/>
+            </w:tcBorders>
+          </w:tcPr>
+          <w:p>
+            <w:pPr>
+              <w:pStyle w:val="TableContents"/>
+              <w:widowControl w:val="false"/>
+              <w:bidi w:val="0"/>
+              <w:jc w:val="left"/>
+              <w:rPr/>
+            </w:pPr>
+            <w:r>
+              <w:rPr/>
+            </w:r>
+          </w:p>
+        </w:tc>
+      </w:tr>
+      <w:tr>
+        <w:trPr/>
+        <w:tc>
+          <w:tcPr>
+            <w:tcW w:w="2732" w:type="dxa"/>
             <w:tcBorders>
               <w:left w:val="single" w:sz="2" w:space="0" w:color="000000"/>
               <w:bottom w:val="single" w:sz="2" w:space="0" w:color="000000"/>
@@ -4488,7 +5086,7 @@
         </w:tc>
         <w:tc>
           <w:tcPr>
-            <w:tcW w:w="399" w:type="dxa"/>
+            <w:tcW w:w="450" w:type="dxa"/>
             <w:tcBorders>
               <w:left w:val="single" w:sz="2" w:space="0" w:color="000000"/>
               <w:bottom w:val="single" w:sz="2" w:space="0" w:color="000000"/>
@@ -4510,7 +5108,7 @@
         </w:tc>
         <w:tc>
           <w:tcPr>
-            <w:tcW w:w="404" w:type="dxa"/>
+            <w:tcW w:w="450" w:type="dxa"/>
             <w:tcBorders>
               <w:left w:val="single" w:sz="2" w:space="0" w:color="000000"/>
               <w:bottom w:val="single" w:sz="2" w:space="0" w:color="000000"/>
@@ -4532,49 +5130,49 @@
         </w:tc>
         <w:tc>
           <w:tcPr>
-            <w:tcW w:w="402" w:type="dxa"/>
-            <w:tcBorders>
-              <w:left w:val="single" w:sz="2" w:space="0" w:color="000000"/>
-              <w:bottom w:val="single" w:sz="2" w:space="0" w:color="000000"/>
-            </w:tcBorders>
-          </w:tcPr>
-          <w:p>
-            <w:pPr>
-              <w:pStyle w:val="TableContents"/>
-              <w:widowControl w:val="false"/>
-              <w:bidi w:val="0"/>
-              <w:jc w:val="center"/>
-              <w:rPr/>
-            </w:pPr>
-            <w:r>
-              <w:rPr/>
-            </w:r>
-          </w:p>
-        </w:tc>
-        <w:tc>
-          <w:tcPr>
-            <w:tcW w:w="404" w:type="dxa"/>
-            <w:tcBorders>
-              <w:left w:val="single" w:sz="2" w:space="0" w:color="000000"/>
-              <w:bottom w:val="single" w:sz="2" w:space="0" w:color="000000"/>
-            </w:tcBorders>
-          </w:tcPr>
-          <w:p>
-            <w:pPr>
-              <w:pStyle w:val="TableContents"/>
-              <w:widowControl w:val="false"/>
-              <w:bidi w:val="0"/>
-              <w:jc w:val="center"/>
-              <w:rPr/>
-            </w:pPr>
-            <w:r>
-              <w:rPr/>
-            </w:r>
-          </w:p>
-        </w:tc>
-        <w:tc>
-          <w:tcPr>
-            <w:tcW w:w="2621" w:type="dxa"/>
+            <w:tcW w:w="450" w:type="dxa"/>
+            <w:tcBorders>
+              <w:left w:val="single" w:sz="2" w:space="0" w:color="000000"/>
+              <w:bottom w:val="single" w:sz="2" w:space="0" w:color="000000"/>
+            </w:tcBorders>
+          </w:tcPr>
+          <w:p>
+            <w:pPr>
+              <w:pStyle w:val="TableContents"/>
+              <w:widowControl w:val="false"/>
+              <w:bidi w:val="0"/>
+              <w:jc w:val="center"/>
+              <w:rPr/>
+            </w:pPr>
+            <w:r>
+              <w:rPr/>
+            </w:r>
+          </w:p>
+        </w:tc>
+        <w:tc>
+          <w:tcPr>
+            <w:tcW w:w="450" w:type="dxa"/>
+            <w:tcBorders>
+              <w:left w:val="single" w:sz="2" w:space="0" w:color="000000"/>
+              <w:bottom w:val="single" w:sz="2" w:space="0" w:color="000000"/>
+            </w:tcBorders>
+          </w:tcPr>
+          <w:p>
+            <w:pPr>
+              <w:pStyle w:val="TableContents"/>
+              <w:widowControl w:val="false"/>
+              <w:bidi w:val="0"/>
+              <w:jc w:val="center"/>
+              <w:rPr/>
+            </w:pPr>
+            <w:r>
+              <w:rPr/>
+            </w:r>
+          </w:p>
+        </w:tc>
+        <w:tc>
+          <w:tcPr>
+            <w:tcW w:w="2700" w:type="dxa"/>
             <w:tcBorders>
               <w:left w:val="single" w:sz="2" w:space="0" w:color="000000"/>
               <w:bottom w:val="single" w:sz="2" w:space="0" w:color="000000"/>
@@ -4596,7 +5194,7 @@
         </w:tc>
         <w:tc>
           <w:tcPr>
-            <w:tcW w:w="3516" w:type="dxa"/>
+            <w:tcW w:w="4500" w:type="dxa"/>
             <w:tcBorders>
               <w:left w:val="single" w:sz="2" w:space="0" w:color="000000"/>
               <w:bottom w:val="single" w:sz="2" w:space="0" w:color="000000"/>
@@ -4618,7 +5216,7 @@
         </w:tc>
         <w:tc>
           <w:tcPr>
-            <w:tcW w:w="3377" w:type="dxa"/>
+            <w:tcW w:w="2836" w:type="dxa"/>
             <w:vMerge w:val="continue"/>
             <w:tcBorders>
               <w:left w:val="single" w:sz="2" w:space="0" w:color="000000"/>
@@ -4689,7 +5287,7 @@
     <w:pPr>
       <w:widowControl/>
       <w:suppressAutoHyphens w:val="true"/>
-      <w:overflowPunct w:val="false"/>
+      <w:overflowPunct w:val="true"/>
       <w:bidi w:val="0"/>
       <w:spacing w:before="0" w:after="0"/>
       <w:jc w:val="left"/>

</xml_diff>

<commit_message>
graphic and document. completed basic request ui
</commit_message>
<xml_diff>
--- a/design/permission-role.docx
+++ b/design/permission-role.docx
@@ -16,14 +16,14 @@
         </w:tblCellMar>
       </w:tblPr>
       <w:tblGrid>
-        <w:gridCol w:w="2732"/>
+        <w:gridCol w:w="2731"/>
         <w:gridCol w:w="450"/>
-        <w:gridCol w:w="450"/>
+        <w:gridCol w:w="451"/>
         <w:gridCol w:w="450"/>
         <w:gridCol w:w="450"/>
         <w:gridCol w:w="2700"/>
-        <w:gridCol w:w="4500"/>
-        <w:gridCol w:w="2836"/>
+        <w:gridCol w:w="4501"/>
+        <w:gridCol w:w="2835"/>
       </w:tblGrid>
       <w:tr>
         <w:trPr>
@@ -31,7 +31,7 @@
         </w:trPr>
         <w:tc>
           <w:tcPr>
-            <w:tcW w:w="2732" w:type="dxa"/>
+            <w:tcW w:w="2731" w:type="dxa"/>
             <w:tcBorders>
               <w:top w:val="single" w:sz="2" w:space="0" w:color="000000"/>
               <w:left w:val="single" w:sz="2" w:space="0" w:color="000000"/>
@@ -91,7 +91,7 @@
         </w:tc>
         <w:tc>
           <w:tcPr>
-            <w:tcW w:w="450" w:type="dxa"/>
+            <w:tcW w:w="451" w:type="dxa"/>
             <w:tcBorders>
               <w:top w:val="single" w:sz="2" w:space="0" w:color="000000"/>
               <w:left w:val="single" w:sz="2" w:space="0" w:color="000000"/>
@@ -211,7 +211,7 @@
         </w:tc>
         <w:tc>
           <w:tcPr>
-            <w:tcW w:w="4500" w:type="dxa"/>
+            <w:tcW w:w="4501" w:type="dxa"/>
             <w:tcBorders>
               <w:top w:val="single" w:sz="2" w:space="0" w:color="000000"/>
               <w:left w:val="single" w:sz="2" w:space="0" w:color="000000"/>
@@ -241,7 +241,7 @@
         </w:tc>
         <w:tc>
           <w:tcPr>
-            <w:tcW w:w="2836" w:type="dxa"/>
+            <w:tcW w:w="2835" w:type="dxa"/>
             <w:tcBorders>
               <w:top w:val="single" w:sz="2" w:space="0" w:color="000000"/>
               <w:left w:val="single" w:sz="2" w:space="0" w:color="000000"/>
@@ -275,7 +275,7 @@
         <w:trPr/>
         <w:tc>
           <w:tcPr>
-            <w:tcW w:w="2732" w:type="dxa"/>
+            <w:tcW w:w="2731" w:type="dxa"/>
             <w:vMerge w:val="restart"/>
             <w:tcBorders>
               <w:left w:val="single" w:sz="2" w:space="0" w:color="000000"/>
@@ -321,7 +321,7 @@
         </w:tc>
         <w:tc>
           <w:tcPr>
-            <w:tcW w:w="450" w:type="dxa"/>
+            <w:tcW w:w="451" w:type="dxa"/>
             <w:vMerge w:val="restart"/>
             <w:tcBorders>
               <w:left w:val="single" w:sz="2" w:space="0" w:color="000000"/>
@@ -411,7 +411,7 @@
         </w:tc>
         <w:tc>
           <w:tcPr>
-            <w:tcW w:w="4500" w:type="dxa"/>
+            <w:tcW w:w="4501" w:type="dxa"/>
             <w:tcBorders>
               <w:left w:val="single" w:sz="2" w:space="0" w:color="000000"/>
               <w:bottom w:val="single" w:sz="2" w:space="0" w:color="000000"/>
@@ -433,7 +433,7 @@
         </w:tc>
         <w:tc>
           <w:tcPr>
-            <w:tcW w:w="2836" w:type="dxa"/>
+            <w:tcW w:w="2835" w:type="dxa"/>
             <w:vMerge w:val="restart"/>
             <w:tcBorders>
               <w:left w:val="single" w:sz="2" w:space="0" w:color="000000"/>
@@ -460,51 +460,51 @@
         <w:trPr/>
         <w:tc>
           <w:tcPr>
-            <w:tcW w:w="2732" w:type="dxa"/>
-            <w:vMerge w:val="continue"/>
-            <w:tcBorders>
-              <w:left w:val="single" w:sz="2" w:space="0" w:color="000000"/>
-              <w:bottom w:val="single" w:sz="2" w:space="0" w:color="000000"/>
-            </w:tcBorders>
-          </w:tcPr>
-          <w:p>
-            <w:pPr>
-              <w:pStyle w:val="TableContents"/>
-              <w:widowControl w:val="false"/>
-              <w:bidi w:val="0"/>
-              <w:jc w:val="left"/>
-              <w:rPr/>
-            </w:pPr>
-            <w:r>
-              <w:rPr/>
-            </w:r>
-          </w:p>
-        </w:tc>
-        <w:tc>
-          <w:tcPr>
-            <w:tcW w:w="450" w:type="dxa"/>
-            <w:vMerge w:val="continue"/>
-            <w:tcBorders>
-              <w:left w:val="single" w:sz="2" w:space="0" w:color="000000"/>
-              <w:bottom w:val="single" w:sz="2" w:space="0" w:color="000000"/>
-            </w:tcBorders>
-          </w:tcPr>
-          <w:p>
-            <w:pPr>
-              <w:pStyle w:val="TableContents"/>
-              <w:widowControl w:val="false"/>
-              <w:bidi w:val="0"/>
-              <w:jc w:val="center"/>
-              <w:rPr/>
-            </w:pPr>
-            <w:r>
-              <w:rPr/>
-            </w:r>
-          </w:p>
-        </w:tc>
-        <w:tc>
-          <w:tcPr>
-            <w:tcW w:w="450" w:type="dxa"/>
+            <w:tcW w:w="2731" w:type="dxa"/>
+            <w:vMerge w:val="continue"/>
+            <w:tcBorders>
+              <w:left w:val="single" w:sz="2" w:space="0" w:color="000000"/>
+              <w:bottom w:val="single" w:sz="2" w:space="0" w:color="000000"/>
+            </w:tcBorders>
+          </w:tcPr>
+          <w:p>
+            <w:pPr>
+              <w:pStyle w:val="TableContents"/>
+              <w:widowControl w:val="false"/>
+              <w:bidi w:val="0"/>
+              <w:jc w:val="left"/>
+              <w:rPr/>
+            </w:pPr>
+            <w:r>
+              <w:rPr/>
+            </w:r>
+          </w:p>
+        </w:tc>
+        <w:tc>
+          <w:tcPr>
+            <w:tcW w:w="450" w:type="dxa"/>
+            <w:vMerge w:val="continue"/>
+            <w:tcBorders>
+              <w:left w:val="single" w:sz="2" w:space="0" w:color="000000"/>
+              <w:bottom w:val="single" w:sz="2" w:space="0" w:color="000000"/>
+            </w:tcBorders>
+          </w:tcPr>
+          <w:p>
+            <w:pPr>
+              <w:pStyle w:val="TableContents"/>
+              <w:widowControl w:val="false"/>
+              <w:bidi w:val="0"/>
+              <w:jc w:val="center"/>
+              <w:rPr/>
+            </w:pPr>
+            <w:r>
+              <w:rPr/>
+            </w:r>
+          </w:p>
+        </w:tc>
+        <w:tc>
+          <w:tcPr>
+            <w:tcW w:w="451" w:type="dxa"/>
             <w:vMerge w:val="continue"/>
             <w:tcBorders>
               <w:left w:val="single" w:sz="2" w:space="0" w:color="000000"/>
@@ -592,7 +592,7 @@
         </w:tc>
         <w:tc>
           <w:tcPr>
-            <w:tcW w:w="4500" w:type="dxa"/>
+            <w:tcW w:w="4501" w:type="dxa"/>
             <w:tcBorders>
               <w:left w:val="single" w:sz="2" w:space="0" w:color="000000"/>
               <w:bottom w:val="single" w:sz="2" w:space="0" w:color="000000"/>
@@ -614,7 +614,7 @@
         </w:tc>
         <w:tc>
           <w:tcPr>
-            <w:tcW w:w="2836" w:type="dxa"/>
+            <w:tcW w:w="2835" w:type="dxa"/>
             <w:vMerge w:val="continue"/>
             <w:tcBorders>
               <w:left w:val="single" w:sz="2" w:space="0" w:color="000000"/>
@@ -640,7 +640,7 @@
         <w:trPr/>
         <w:tc>
           <w:tcPr>
-            <w:tcW w:w="2732" w:type="dxa"/>
+            <w:tcW w:w="2731" w:type="dxa"/>
             <w:tcBorders>
               <w:left w:val="single" w:sz="2" w:space="0" w:color="000000"/>
               <w:bottom w:val="single" w:sz="2" w:space="0" w:color="000000"/>
@@ -684,7 +684,7 @@
         </w:tc>
         <w:tc>
           <w:tcPr>
-            <w:tcW w:w="450" w:type="dxa"/>
+            <w:tcW w:w="451" w:type="dxa"/>
             <w:tcBorders>
               <w:left w:val="single" w:sz="2" w:space="0" w:color="000000"/>
               <w:bottom w:val="single" w:sz="2" w:space="0" w:color="000000"/>
@@ -771,7 +771,7 @@
         </w:tc>
         <w:tc>
           <w:tcPr>
-            <w:tcW w:w="4500" w:type="dxa"/>
+            <w:tcW w:w="4501" w:type="dxa"/>
             <w:tcBorders>
               <w:left w:val="single" w:sz="2" w:space="0" w:color="000000"/>
               <w:bottom w:val="single" w:sz="2" w:space="0" w:color="000000"/>
@@ -793,7 +793,7 @@
         </w:tc>
         <w:tc>
           <w:tcPr>
-            <w:tcW w:w="2836" w:type="dxa"/>
+            <w:tcW w:w="2835" w:type="dxa"/>
             <w:vMerge w:val="continue"/>
             <w:tcBorders>
               <w:left w:val="single" w:sz="2" w:space="0" w:color="000000"/>
@@ -819,7 +819,7 @@
         <w:trPr/>
         <w:tc>
           <w:tcPr>
-            <w:tcW w:w="2732" w:type="dxa"/>
+            <w:tcW w:w="2731" w:type="dxa"/>
             <w:tcBorders>
               <w:left w:val="single" w:sz="2" w:space="0" w:color="000000"/>
               <w:bottom w:val="single" w:sz="2" w:space="0" w:color="000000"/>
@@ -863,7 +863,7 @@
         </w:tc>
         <w:tc>
           <w:tcPr>
-            <w:tcW w:w="450" w:type="dxa"/>
+            <w:tcW w:w="451" w:type="dxa"/>
             <w:tcBorders>
               <w:left w:val="single" w:sz="2" w:space="0" w:color="000000"/>
               <w:bottom w:val="single" w:sz="2" w:space="0" w:color="000000"/>
@@ -949,7 +949,7 @@
         </w:tc>
         <w:tc>
           <w:tcPr>
-            <w:tcW w:w="4500" w:type="dxa"/>
+            <w:tcW w:w="4501" w:type="dxa"/>
             <w:tcBorders>
               <w:left w:val="single" w:sz="2" w:space="0" w:color="000000"/>
               <w:bottom w:val="single" w:sz="2" w:space="0" w:color="000000"/>
@@ -971,7 +971,7 @@
         </w:tc>
         <w:tc>
           <w:tcPr>
-            <w:tcW w:w="2836" w:type="dxa"/>
+            <w:tcW w:w="2835" w:type="dxa"/>
             <w:vMerge w:val="continue"/>
             <w:tcBorders>
               <w:left w:val="single" w:sz="2" w:space="0" w:color="000000"/>
@@ -997,7 +997,7 @@
         <w:trPr/>
         <w:tc>
           <w:tcPr>
-            <w:tcW w:w="2732" w:type="dxa"/>
+            <w:tcW w:w="2731" w:type="dxa"/>
             <w:vMerge w:val="restart"/>
             <w:tcBorders>
               <w:left w:val="single" w:sz="2" w:space="0" w:color="000000"/>
@@ -1067,7 +1067,7 @@
         </w:tc>
         <w:tc>
           <w:tcPr>
-            <w:tcW w:w="450" w:type="dxa"/>
+            <w:tcW w:w="451" w:type="dxa"/>
             <w:vMerge w:val="restart"/>
             <w:tcBorders>
               <w:left w:val="single" w:sz="2" w:space="0" w:color="000000"/>
@@ -1163,26 +1163,26 @@
             </w:pPr>
             <w:r>
               <w:rPr/>
-              <w:t>Update:users</w:t>
-            </w:r>
-          </w:p>
-          <w:p>
-            <w:pPr>
-              <w:pStyle w:val="TableContents"/>
-              <w:widowControl w:val="false"/>
-              <w:bidi w:val="0"/>
-              <w:jc w:val="left"/>
-              <w:rPr/>
-            </w:pPr>
-            <w:r>
-              <w:rPr/>
-              <w:t>Update:user-roles</w:t>
-            </w:r>
-          </w:p>
-        </w:tc>
-        <w:tc>
-          <w:tcPr>
-            <w:tcW w:w="4500" w:type="dxa"/>
+              <w:t>update:users</w:t>
+            </w:r>
+          </w:p>
+          <w:p>
+            <w:pPr>
+              <w:pStyle w:val="TableContents"/>
+              <w:widowControl w:val="false"/>
+              <w:bidi w:val="0"/>
+              <w:jc w:val="left"/>
+              <w:rPr/>
+            </w:pPr>
+            <w:r>
+              <w:rPr/>
+              <w:t>update:user-roles</w:t>
+            </w:r>
+          </w:p>
+        </w:tc>
+        <w:tc>
+          <w:tcPr>
+            <w:tcW w:w="4501" w:type="dxa"/>
             <w:tcBorders>
               <w:left w:val="single" w:sz="2" w:space="0" w:color="000000"/>
               <w:bottom w:val="single" w:sz="2" w:space="0" w:color="000000"/>
@@ -1204,7 +1204,7 @@
         </w:tc>
         <w:tc>
           <w:tcPr>
-            <w:tcW w:w="2836" w:type="dxa"/>
+            <w:tcW w:w="2835" w:type="dxa"/>
             <w:vMerge w:val="continue"/>
             <w:tcBorders>
               <w:left w:val="single" w:sz="2" w:space="0" w:color="000000"/>
@@ -1230,51 +1230,51 @@
         <w:trPr/>
         <w:tc>
           <w:tcPr>
-            <w:tcW w:w="2732" w:type="dxa"/>
-            <w:vMerge w:val="continue"/>
-            <w:tcBorders>
-              <w:left w:val="single" w:sz="2" w:space="0" w:color="000000"/>
-              <w:bottom w:val="single" w:sz="2" w:space="0" w:color="000000"/>
-            </w:tcBorders>
-          </w:tcPr>
-          <w:p>
-            <w:pPr>
-              <w:pStyle w:val="TableContents"/>
-              <w:widowControl w:val="false"/>
-              <w:bidi w:val="0"/>
-              <w:jc w:val="left"/>
-              <w:rPr/>
-            </w:pPr>
-            <w:r>
-              <w:rPr/>
-            </w:r>
-          </w:p>
-        </w:tc>
-        <w:tc>
-          <w:tcPr>
-            <w:tcW w:w="450" w:type="dxa"/>
-            <w:vMerge w:val="continue"/>
-            <w:tcBorders>
-              <w:left w:val="single" w:sz="2" w:space="0" w:color="000000"/>
-              <w:bottom w:val="single" w:sz="2" w:space="0" w:color="000000"/>
-            </w:tcBorders>
-          </w:tcPr>
-          <w:p>
-            <w:pPr>
-              <w:pStyle w:val="TableContents"/>
-              <w:widowControl w:val="false"/>
-              <w:bidi w:val="0"/>
-              <w:jc w:val="center"/>
-              <w:rPr/>
-            </w:pPr>
-            <w:r>
-              <w:rPr/>
-            </w:r>
-          </w:p>
-        </w:tc>
-        <w:tc>
-          <w:tcPr>
-            <w:tcW w:w="450" w:type="dxa"/>
+            <w:tcW w:w="2731" w:type="dxa"/>
+            <w:vMerge w:val="continue"/>
+            <w:tcBorders>
+              <w:left w:val="single" w:sz="2" w:space="0" w:color="000000"/>
+              <w:bottom w:val="single" w:sz="2" w:space="0" w:color="000000"/>
+            </w:tcBorders>
+          </w:tcPr>
+          <w:p>
+            <w:pPr>
+              <w:pStyle w:val="TableContents"/>
+              <w:widowControl w:val="false"/>
+              <w:bidi w:val="0"/>
+              <w:jc w:val="left"/>
+              <w:rPr/>
+            </w:pPr>
+            <w:r>
+              <w:rPr/>
+            </w:r>
+          </w:p>
+        </w:tc>
+        <w:tc>
+          <w:tcPr>
+            <w:tcW w:w="450" w:type="dxa"/>
+            <w:vMerge w:val="continue"/>
+            <w:tcBorders>
+              <w:left w:val="single" w:sz="2" w:space="0" w:color="000000"/>
+              <w:bottom w:val="single" w:sz="2" w:space="0" w:color="000000"/>
+            </w:tcBorders>
+          </w:tcPr>
+          <w:p>
+            <w:pPr>
+              <w:pStyle w:val="TableContents"/>
+              <w:widowControl w:val="false"/>
+              <w:bidi w:val="0"/>
+              <w:jc w:val="center"/>
+              <w:rPr/>
+            </w:pPr>
+            <w:r>
+              <w:rPr/>
+            </w:r>
+          </w:p>
+        </w:tc>
+        <w:tc>
+          <w:tcPr>
+            <w:tcW w:w="451" w:type="dxa"/>
             <w:vMerge w:val="continue"/>
             <w:tcBorders>
               <w:left w:val="single" w:sz="2" w:space="0" w:color="000000"/>
@@ -1362,7 +1362,7 @@
         </w:tc>
         <w:tc>
           <w:tcPr>
-            <w:tcW w:w="4500" w:type="dxa"/>
+            <w:tcW w:w="4501" w:type="dxa"/>
             <w:tcBorders>
               <w:left w:val="single" w:sz="2" w:space="0" w:color="000000"/>
               <w:bottom w:val="single" w:sz="2" w:space="0" w:color="000000"/>
@@ -1384,7 +1384,7 @@
         </w:tc>
         <w:tc>
           <w:tcPr>
-            <w:tcW w:w="2836" w:type="dxa"/>
+            <w:tcW w:w="2835" w:type="dxa"/>
             <w:vMerge w:val="continue"/>
             <w:tcBorders>
               <w:left w:val="single" w:sz="2" w:space="0" w:color="000000"/>
@@ -1410,7 +1410,7 @@
         <w:trPr/>
         <w:tc>
           <w:tcPr>
-            <w:tcW w:w="2732" w:type="dxa"/>
+            <w:tcW w:w="2731" w:type="dxa"/>
             <w:tcBorders>
               <w:left w:val="single" w:sz="2" w:space="0" w:color="000000"/>
               <w:bottom w:val="single" w:sz="2" w:space="0" w:color="000000"/>
@@ -1458,7 +1458,7 @@
         </w:tc>
         <w:tc>
           <w:tcPr>
-            <w:tcW w:w="450" w:type="dxa"/>
+            <w:tcW w:w="451" w:type="dxa"/>
             <w:tcBorders>
               <w:left w:val="single" w:sz="2" w:space="0" w:color="000000"/>
               <w:bottom w:val="single" w:sz="2" w:space="0" w:color="000000"/>
@@ -1545,7 +1545,7 @@
         </w:tc>
         <w:tc>
           <w:tcPr>
-            <w:tcW w:w="4500" w:type="dxa"/>
+            <w:tcW w:w="4501" w:type="dxa"/>
             <w:tcBorders>
               <w:left w:val="single" w:sz="2" w:space="0" w:color="000000"/>
               <w:bottom w:val="single" w:sz="2" w:space="0" w:color="000000"/>
@@ -1567,7 +1567,7 @@
         </w:tc>
         <w:tc>
           <w:tcPr>
-            <w:tcW w:w="2836" w:type="dxa"/>
+            <w:tcW w:w="2835" w:type="dxa"/>
             <w:tcBorders>
               <w:left w:val="single" w:sz="2" w:space="0" w:color="000000"/>
               <w:bottom w:val="single" w:sz="2" w:space="0" w:color="000000"/>
@@ -1594,7 +1594,7 @@
         <w:trPr/>
         <w:tc>
           <w:tcPr>
-            <w:tcW w:w="2732" w:type="dxa"/>
+            <w:tcW w:w="2731" w:type="dxa"/>
             <w:vMerge w:val="restart"/>
             <w:tcBorders>
               <w:left w:val="single" w:sz="2" w:space="0" w:color="000000"/>
@@ -1640,7 +1640,7 @@
         </w:tc>
         <w:tc>
           <w:tcPr>
-            <w:tcW w:w="450" w:type="dxa"/>
+            <w:tcW w:w="451" w:type="dxa"/>
             <w:vMerge w:val="restart"/>
             <w:tcBorders>
               <w:left w:val="single" w:sz="2" w:space="0" w:color="000000"/>
@@ -1724,13 +1724,13 @@
             </w:pPr>
             <w:r>
               <w:rPr/>
-              <w:t>Create:assets</w:t>
-            </w:r>
-          </w:p>
-        </w:tc>
-        <w:tc>
-          <w:tcPr>
-            <w:tcW w:w="4500" w:type="dxa"/>
+              <w:t>create:assets</w:t>
+            </w:r>
+          </w:p>
+        </w:tc>
+        <w:tc>
+          <w:tcPr>
+            <w:tcW w:w="4501" w:type="dxa"/>
             <w:tcBorders>
               <w:left w:val="single" w:sz="2" w:space="0" w:color="000000"/>
               <w:bottom w:val="single" w:sz="2" w:space="0" w:color="000000"/>
@@ -1752,7 +1752,7 @@
         </w:tc>
         <w:tc>
           <w:tcPr>
-            <w:tcW w:w="2836" w:type="dxa"/>
+            <w:tcW w:w="2835" w:type="dxa"/>
             <w:vMerge w:val="restart"/>
             <w:tcBorders>
               <w:left w:val="single" w:sz="2" w:space="0" w:color="000000"/>
@@ -1779,51 +1779,51 @@
         <w:trPr/>
         <w:tc>
           <w:tcPr>
-            <w:tcW w:w="2732" w:type="dxa"/>
-            <w:vMerge w:val="continue"/>
-            <w:tcBorders>
-              <w:left w:val="single" w:sz="2" w:space="0" w:color="000000"/>
-              <w:bottom w:val="single" w:sz="2" w:space="0" w:color="000000"/>
-            </w:tcBorders>
-          </w:tcPr>
-          <w:p>
-            <w:pPr>
-              <w:pStyle w:val="TableContents"/>
-              <w:widowControl w:val="false"/>
-              <w:bidi w:val="0"/>
-              <w:jc w:val="left"/>
-              <w:rPr/>
-            </w:pPr>
-            <w:r>
-              <w:rPr/>
-            </w:r>
-          </w:p>
-        </w:tc>
-        <w:tc>
-          <w:tcPr>
-            <w:tcW w:w="450" w:type="dxa"/>
-            <w:vMerge w:val="continue"/>
-            <w:tcBorders>
-              <w:left w:val="single" w:sz="2" w:space="0" w:color="000000"/>
-              <w:bottom w:val="single" w:sz="2" w:space="0" w:color="000000"/>
-            </w:tcBorders>
-          </w:tcPr>
-          <w:p>
-            <w:pPr>
-              <w:pStyle w:val="TableContents"/>
-              <w:widowControl w:val="false"/>
-              <w:bidi w:val="0"/>
-              <w:jc w:val="center"/>
-              <w:rPr/>
-            </w:pPr>
-            <w:r>
-              <w:rPr/>
-            </w:r>
-          </w:p>
-        </w:tc>
-        <w:tc>
-          <w:tcPr>
-            <w:tcW w:w="450" w:type="dxa"/>
+            <w:tcW w:w="2731" w:type="dxa"/>
+            <w:vMerge w:val="continue"/>
+            <w:tcBorders>
+              <w:left w:val="single" w:sz="2" w:space="0" w:color="000000"/>
+              <w:bottom w:val="single" w:sz="2" w:space="0" w:color="000000"/>
+            </w:tcBorders>
+          </w:tcPr>
+          <w:p>
+            <w:pPr>
+              <w:pStyle w:val="TableContents"/>
+              <w:widowControl w:val="false"/>
+              <w:bidi w:val="0"/>
+              <w:jc w:val="left"/>
+              <w:rPr/>
+            </w:pPr>
+            <w:r>
+              <w:rPr/>
+            </w:r>
+          </w:p>
+        </w:tc>
+        <w:tc>
+          <w:tcPr>
+            <w:tcW w:w="450" w:type="dxa"/>
+            <w:vMerge w:val="continue"/>
+            <w:tcBorders>
+              <w:left w:val="single" w:sz="2" w:space="0" w:color="000000"/>
+              <w:bottom w:val="single" w:sz="2" w:space="0" w:color="000000"/>
+            </w:tcBorders>
+          </w:tcPr>
+          <w:p>
+            <w:pPr>
+              <w:pStyle w:val="TableContents"/>
+              <w:widowControl w:val="false"/>
+              <w:bidi w:val="0"/>
+              <w:jc w:val="center"/>
+              <w:rPr/>
+            </w:pPr>
+            <w:r>
+              <w:rPr/>
+            </w:r>
+          </w:p>
+        </w:tc>
+        <w:tc>
+          <w:tcPr>
+            <w:tcW w:w="451" w:type="dxa"/>
             <w:vMerge w:val="continue"/>
             <w:tcBorders>
               <w:left w:val="single" w:sz="2" w:space="0" w:color="000000"/>
@@ -1911,7 +1911,7 @@
         </w:tc>
         <w:tc>
           <w:tcPr>
-            <w:tcW w:w="4500" w:type="dxa"/>
+            <w:tcW w:w="4501" w:type="dxa"/>
             <w:tcBorders>
               <w:left w:val="single" w:sz="2" w:space="0" w:color="000000"/>
               <w:bottom w:val="single" w:sz="2" w:space="0" w:color="000000"/>
@@ -1933,7 +1933,7 @@
         </w:tc>
         <w:tc>
           <w:tcPr>
-            <w:tcW w:w="2836" w:type="dxa"/>
+            <w:tcW w:w="2835" w:type="dxa"/>
             <w:vMerge w:val="continue"/>
             <w:tcBorders>
               <w:left w:val="single" w:sz="2" w:space="0" w:color="000000"/>
@@ -1959,7 +1959,7 @@
         <w:trPr/>
         <w:tc>
           <w:tcPr>
-            <w:tcW w:w="2732" w:type="dxa"/>
+            <w:tcW w:w="2731" w:type="dxa"/>
             <w:tcBorders>
               <w:left w:val="single" w:sz="2" w:space="0" w:color="000000"/>
               <w:bottom w:val="single" w:sz="2" w:space="0" w:color="000000"/>
@@ -2003,7 +2003,7 @@
         </w:tc>
         <w:tc>
           <w:tcPr>
-            <w:tcW w:w="450" w:type="dxa"/>
+            <w:tcW w:w="451" w:type="dxa"/>
             <w:tcBorders>
               <w:left w:val="single" w:sz="2" w:space="0" w:color="000000"/>
               <w:bottom w:val="single" w:sz="2" w:space="0" w:color="000000"/>
@@ -2083,13 +2083,13 @@
             </w:pPr>
             <w:r>
               <w:rPr/>
-              <w:t>View:assets</w:t>
-            </w:r>
-          </w:p>
-        </w:tc>
-        <w:tc>
-          <w:tcPr>
-            <w:tcW w:w="4500" w:type="dxa"/>
+              <w:t>view:assets</w:t>
+            </w:r>
+          </w:p>
+        </w:tc>
+        <w:tc>
+          <w:tcPr>
+            <w:tcW w:w="4501" w:type="dxa"/>
             <w:tcBorders>
               <w:left w:val="single" w:sz="2" w:space="0" w:color="000000"/>
               <w:bottom w:val="single" w:sz="2" w:space="0" w:color="000000"/>
@@ -2111,7 +2111,7 @@
         </w:tc>
         <w:tc>
           <w:tcPr>
-            <w:tcW w:w="2836" w:type="dxa"/>
+            <w:tcW w:w="2835" w:type="dxa"/>
             <w:vMerge w:val="continue"/>
             <w:tcBorders>
               <w:left w:val="single" w:sz="2" w:space="0" w:color="000000"/>
@@ -2137,7 +2137,7 @@
         <w:trPr/>
         <w:tc>
           <w:tcPr>
-            <w:tcW w:w="2732" w:type="dxa"/>
+            <w:tcW w:w="2731" w:type="dxa"/>
             <w:tcBorders>
               <w:left w:val="single" w:sz="2" w:space="0" w:color="000000"/>
               <w:bottom w:val="single" w:sz="2" w:space="0" w:color="000000"/>
@@ -2181,7 +2181,7 @@
         </w:tc>
         <w:tc>
           <w:tcPr>
-            <w:tcW w:w="450" w:type="dxa"/>
+            <w:tcW w:w="451" w:type="dxa"/>
             <w:tcBorders>
               <w:left w:val="single" w:sz="2" w:space="0" w:color="000000"/>
               <w:bottom w:val="single" w:sz="2" w:space="0" w:color="000000"/>
@@ -2261,13 +2261,13 @@
             </w:pPr>
             <w:r>
               <w:rPr/>
-              <w:t>View-any:assets</w:t>
-            </w:r>
-          </w:p>
-        </w:tc>
-        <w:tc>
-          <w:tcPr>
-            <w:tcW w:w="4500" w:type="dxa"/>
+              <w:t>view-any:assets</w:t>
+            </w:r>
+          </w:p>
+        </w:tc>
+        <w:tc>
+          <w:tcPr>
+            <w:tcW w:w="4501" w:type="dxa"/>
             <w:tcBorders>
               <w:left w:val="single" w:sz="2" w:space="0" w:color="000000"/>
               <w:bottom w:val="single" w:sz="2" w:space="0" w:color="000000"/>
@@ -2289,7 +2289,7 @@
         </w:tc>
         <w:tc>
           <w:tcPr>
-            <w:tcW w:w="2836" w:type="dxa"/>
+            <w:tcW w:w="2835" w:type="dxa"/>
             <w:vMerge w:val="continue"/>
             <w:tcBorders>
               <w:left w:val="single" w:sz="2" w:space="0" w:color="000000"/>
@@ -2315,7 +2315,7 @@
         <w:trPr/>
         <w:tc>
           <w:tcPr>
-            <w:tcW w:w="2732" w:type="dxa"/>
+            <w:tcW w:w="2731" w:type="dxa"/>
             <w:vMerge w:val="restart"/>
             <w:tcBorders>
               <w:left w:val="single" w:sz="2" w:space="0" w:color="000000"/>
@@ -2361,7 +2361,7 @@
         </w:tc>
         <w:tc>
           <w:tcPr>
-            <w:tcW w:w="450" w:type="dxa"/>
+            <w:tcW w:w="451" w:type="dxa"/>
             <w:vMerge w:val="restart"/>
             <w:tcBorders>
               <w:left w:val="single" w:sz="2" w:space="0" w:color="000000"/>
@@ -2445,13 +2445,13 @@
             </w:pPr>
             <w:r>
               <w:rPr/>
-              <w:t>Update:assets</w:t>
-            </w:r>
-          </w:p>
-        </w:tc>
-        <w:tc>
-          <w:tcPr>
-            <w:tcW w:w="4500" w:type="dxa"/>
+              <w:t>update:assets</w:t>
+            </w:r>
+          </w:p>
+        </w:tc>
+        <w:tc>
+          <w:tcPr>
+            <w:tcW w:w="4501" w:type="dxa"/>
             <w:tcBorders>
               <w:left w:val="single" w:sz="2" w:space="0" w:color="000000"/>
               <w:bottom w:val="single" w:sz="2" w:space="0" w:color="000000"/>
@@ -2473,7 +2473,7 @@
         </w:tc>
         <w:tc>
           <w:tcPr>
-            <w:tcW w:w="2836" w:type="dxa"/>
+            <w:tcW w:w="2835" w:type="dxa"/>
             <w:vMerge w:val="continue"/>
             <w:tcBorders>
               <w:left w:val="single" w:sz="2" w:space="0" w:color="000000"/>
@@ -2499,51 +2499,51 @@
         <w:trPr/>
         <w:tc>
           <w:tcPr>
-            <w:tcW w:w="2732" w:type="dxa"/>
-            <w:vMerge w:val="continue"/>
-            <w:tcBorders>
-              <w:left w:val="single" w:sz="2" w:space="0" w:color="000000"/>
-              <w:bottom w:val="single" w:sz="2" w:space="0" w:color="000000"/>
-            </w:tcBorders>
-          </w:tcPr>
-          <w:p>
-            <w:pPr>
-              <w:pStyle w:val="TableContents"/>
-              <w:widowControl w:val="false"/>
-              <w:bidi w:val="0"/>
-              <w:jc w:val="left"/>
-              <w:rPr/>
-            </w:pPr>
-            <w:r>
-              <w:rPr/>
-            </w:r>
-          </w:p>
-        </w:tc>
-        <w:tc>
-          <w:tcPr>
-            <w:tcW w:w="450" w:type="dxa"/>
-            <w:vMerge w:val="continue"/>
-            <w:tcBorders>
-              <w:left w:val="single" w:sz="2" w:space="0" w:color="000000"/>
-              <w:bottom w:val="single" w:sz="2" w:space="0" w:color="000000"/>
-            </w:tcBorders>
-          </w:tcPr>
-          <w:p>
-            <w:pPr>
-              <w:pStyle w:val="TableContents"/>
-              <w:widowControl w:val="false"/>
-              <w:bidi w:val="0"/>
-              <w:jc w:val="center"/>
-              <w:rPr/>
-            </w:pPr>
-            <w:r>
-              <w:rPr/>
-            </w:r>
-          </w:p>
-        </w:tc>
-        <w:tc>
-          <w:tcPr>
-            <w:tcW w:w="450" w:type="dxa"/>
+            <w:tcW w:w="2731" w:type="dxa"/>
+            <w:vMerge w:val="continue"/>
+            <w:tcBorders>
+              <w:left w:val="single" w:sz="2" w:space="0" w:color="000000"/>
+              <w:bottom w:val="single" w:sz="2" w:space="0" w:color="000000"/>
+            </w:tcBorders>
+          </w:tcPr>
+          <w:p>
+            <w:pPr>
+              <w:pStyle w:val="TableContents"/>
+              <w:widowControl w:val="false"/>
+              <w:bidi w:val="0"/>
+              <w:jc w:val="left"/>
+              <w:rPr/>
+            </w:pPr>
+            <w:r>
+              <w:rPr/>
+            </w:r>
+          </w:p>
+        </w:tc>
+        <w:tc>
+          <w:tcPr>
+            <w:tcW w:w="450" w:type="dxa"/>
+            <w:vMerge w:val="continue"/>
+            <w:tcBorders>
+              <w:left w:val="single" w:sz="2" w:space="0" w:color="000000"/>
+              <w:bottom w:val="single" w:sz="2" w:space="0" w:color="000000"/>
+            </w:tcBorders>
+          </w:tcPr>
+          <w:p>
+            <w:pPr>
+              <w:pStyle w:val="TableContents"/>
+              <w:widowControl w:val="false"/>
+              <w:bidi w:val="0"/>
+              <w:jc w:val="center"/>
+              <w:rPr/>
+            </w:pPr>
+            <w:r>
+              <w:rPr/>
+            </w:r>
+          </w:p>
+        </w:tc>
+        <w:tc>
+          <w:tcPr>
+            <w:tcW w:w="451" w:type="dxa"/>
             <w:vMerge w:val="continue"/>
             <w:tcBorders>
               <w:left w:val="single" w:sz="2" w:space="0" w:color="000000"/>
@@ -2631,7 +2631,7 @@
         </w:tc>
         <w:tc>
           <w:tcPr>
-            <w:tcW w:w="4500" w:type="dxa"/>
+            <w:tcW w:w="4501" w:type="dxa"/>
             <w:tcBorders>
               <w:left w:val="single" w:sz="2" w:space="0" w:color="000000"/>
               <w:bottom w:val="single" w:sz="2" w:space="0" w:color="000000"/>
@@ -2653,7 +2653,7 @@
         </w:tc>
         <w:tc>
           <w:tcPr>
-            <w:tcW w:w="2836" w:type="dxa"/>
+            <w:tcW w:w="2835" w:type="dxa"/>
             <w:vMerge w:val="continue"/>
             <w:tcBorders>
               <w:left w:val="single" w:sz="2" w:space="0" w:color="000000"/>
@@ -2679,7 +2679,7 @@
         <w:trPr/>
         <w:tc>
           <w:tcPr>
-            <w:tcW w:w="2732" w:type="dxa"/>
+            <w:tcW w:w="2731" w:type="dxa"/>
             <w:tcBorders>
               <w:left w:val="single" w:sz="2" w:space="0" w:color="000000"/>
               <w:bottom w:val="single" w:sz="2" w:space="0" w:color="000000"/>
@@ -2722,7 +2722,7 @@
         </w:tc>
         <w:tc>
           <w:tcPr>
-            <w:tcW w:w="450" w:type="dxa"/>
+            <w:tcW w:w="451" w:type="dxa"/>
             <w:tcBorders>
               <w:left w:val="single" w:sz="2" w:space="0" w:color="000000"/>
               <w:bottom w:val="single" w:sz="2" w:space="0" w:color="000000"/>
@@ -2802,13 +2802,13 @@
             </w:pPr>
             <w:r>
               <w:rPr/>
-              <w:t>Create:requests</w:t>
-            </w:r>
-          </w:p>
-        </w:tc>
-        <w:tc>
-          <w:tcPr>
-            <w:tcW w:w="4500" w:type="dxa"/>
+              <w:t>create:requests</w:t>
+            </w:r>
+          </w:p>
+        </w:tc>
+        <w:tc>
+          <w:tcPr>
+            <w:tcW w:w="4501" w:type="dxa"/>
             <w:tcBorders>
               <w:left w:val="single" w:sz="2" w:space="0" w:color="000000"/>
               <w:bottom w:val="single" w:sz="2" w:space="0" w:color="000000"/>
@@ -2843,7 +2843,7 @@
         </w:tc>
         <w:tc>
           <w:tcPr>
-            <w:tcW w:w="2836" w:type="dxa"/>
+            <w:tcW w:w="2835" w:type="dxa"/>
             <w:vMerge w:val="restart"/>
             <w:tcBorders>
               <w:left w:val="single" w:sz="2" w:space="0" w:color="000000"/>
@@ -2870,7 +2870,7 @@
         <w:trPr/>
         <w:tc>
           <w:tcPr>
-            <w:tcW w:w="2732" w:type="dxa"/>
+            <w:tcW w:w="2731" w:type="dxa"/>
             <w:tcBorders>
               <w:left w:val="single" w:sz="2" w:space="0" w:color="000000"/>
               <w:bottom w:val="single" w:sz="2" w:space="0" w:color="000000"/>
@@ -2914,7 +2914,7 @@
         </w:tc>
         <w:tc>
           <w:tcPr>
-            <w:tcW w:w="450" w:type="dxa"/>
+            <w:tcW w:w="451" w:type="dxa"/>
             <w:tcBorders>
               <w:left w:val="single" w:sz="2" w:space="0" w:color="000000"/>
               <w:bottom w:val="single" w:sz="2" w:space="0" w:color="000000"/>
@@ -2995,13 +2995,13 @@
             </w:pPr>
             <w:r>
               <w:rPr/>
-              <w:t>View:requests</w:t>
-            </w:r>
-          </w:p>
-        </w:tc>
-        <w:tc>
-          <w:tcPr>
-            <w:tcW w:w="4500" w:type="dxa"/>
+              <w:t>view:requests</w:t>
+            </w:r>
+          </w:p>
+        </w:tc>
+        <w:tc>
+          <w:tcPr>
+            <w:tcW w:w="4501" w:type="dxa"/>
             <w:tcBorders>
               <w:left w:val="single" w:sz="2" w:space="0" w:color="000000"/>
               <w:bottom w:val="single" w:sz="2" w:space="0" w:color="000000"/>
@@ -3023,7 +3023,7 @@
         </w:tc>
         <w:tc>
           <w:tcPr>
-            <w:tcW w:w="2836" w:type="dxa"/>
+            <w:tcW w:w="2835" w:type="dxa"/>
             <w:vMerge w:val="continue"/>
             <w:tcBorders>
               <w:left w:val="single" w:sz="2" w:space="0" w:color="000000"/>
@@ -3049,7 +3049,7 @@
         <w:trPr/>
         <w:tc>
           <w:tcPr>
-            <w:tcW w:w="2732" w:type="dxa"/>
+            <w:tcW w:w="2731" w:type="dxa"/>
             <w:tcBorders>
               <w:left w:val="single" w:sz="2" w:space="0" w:color="000000"/>
               <w:bottom w:val="single" w:sz="2" w:space="0" w:color="000000"/>
@@ -3093,7 +3093,7 @@
         </w:tc>
         <w:tc>
           <w:tcPr>
-            <w:tcW w:w="450" w:type="dxa"/>
+            <w:tcW w:w="451" w:type="dxa"/>
             <w:tcBorders>
               <w:left w:val="single" w:sz="2" w:space="0" w:color="000000"/>
               <w:bottom w:val="single" w:sz="2" w:space="0" w:color="000000"/>
@@ -3173,13 +3173,13 @@
             </w:pPr>
             <w:r>
               <w:rPr/>
-              <w:t>View-any:requests</w:t>
-            </w:r>
-          </w:p>
-        </w:tc>
-        <w:tc>
-          <w:tcPr>
-            <w:tcW w:w="4500" w:type="dxa"/>
+              <w:t>view-any:requests</w:t>
+            </w:r>
+          </w:p>
+        </w:tc>
+        <w:tc>
+          <w:tcPr>
+            <w:tcW w:w="4501" w:type="dxa"/>
             <w:tcBorders>
               <w:left w:val="single" w:sz="2" w:space="0" w:color="000000"/>
               <w:bottom w:val="single" w:sz="2" w:space="0" w:color="000000"/>
@@ -3201,7 +3201,7 @@
         </w:tc>
         <w:tc>
           <w:tcPr>
-            <w:tcW w:w="2836" w:type="dxa"/>
+            <w:tcW w:w="2835" w:type="dxa"/>
             <w:vMerge w:val="continue"/>
             <w:tcBorders>
               <w:left w:val="single" w:sz="2" w:space="0" w:color="000000"/>
@@ -3227,7 +3227,7 @@
         <w:trPr/>
         <w:tc>
           <w:tcPr>
-            <w:tcW w:w="2732" w:type="dxa"/>
+            <w:tcW w:w="2731" w:type="dxa"/>
             <w:vMerge w:val="restart"/>
             <w:tcBorders>
               <w:left w:val="single" w:sz="2" w:space="0" w:color="000000"/>
@@ -3272,7 +3272,7 @@
         </w:tc>
         <w:tc>
           <w:tcPr>
-            <w:tcW w:w="450" w:type="dxa"/>
+            <w:tcW w:w="451" w:type="dxa"/>
             <w:vMerge w:val="restart"/>
             <w:tcBorders>
               <w:left w:val="single" w:sz="2" w:space="0" w:color="000000"/>
@@ -3356,13 +3356,13 @@
             </w:pPr>
             <w:r>
               <w:rPr/>
-              <w:t>Update:support-requests</w:t>
-            </w:r>
-          </w:p>
-        </w:tc>
-        <w:tc>
-          <w:tcPr>
-            <w:tcW w:w="4500" w:type="dxa"/>
+              <w:t>update:support-requests</w:t>
+            </w:r>
+          </w:p>
+        </w:tc>
+        <w:tc>
+          <w:tcPr>
+            <w:tcW w:w="4501" w:type="dxa"/>
             <w:tcBorders>
               <w:left w:val="single" w:sz="2" w:space="0" w:color="000000"/>
               <w:bottom w:val="single" w:sz="2" w:space="0" w:color="000000"/>
@@ -3384,7 +3384,7 @@
         </w:tc>
         <w:tc>
           <w:tcPr>
-            <w:tcW w:w="2836" w:type="dxa"/>
+            <w:tcW w:w="2835" w:type="dxa"/>
             <w:vMerge w:val="continue"/>
             <w:tcBorders>
               <w:left w:val="single" w:sz="2" w:space="0" w:color="000000"/>
@@ -3410,51 +3410,51 @@
         <w:trPr/>
         <w:tc>
           <w:tcPr>
-            <w:tcW w:w="2732" w:type="dxa"/>
-            <w:vMerge w:val="continue"/>
-            <w:tcBorders>
-              <w:left w:val="single" w:sz="2" w:space="0" w:color="000000"/>
-              <w:bottom w:val="single" w:sz="2" w:space="0" w:color="000000"/>
-            </w:tcBorders>
-          </w:tcPr>
-          <w:p>
-            <w:pPr>
-              <w:pStyle w:val="TableContents"/>
-              <w:widowControl w:val="false"/>
-              <w:bidi w:val="0"/>
-              <w:jc w:val="left"/>
-              <w:rPr/>
-            </w:pPr>
-            <w:r>
-              <w:rPr/>
-            </w:r>
-          </w:p>
-        </w:tc>
-        <w:tc>
-          <w:tcPr>
-            <w:tcW w:w="450" w:type="dxa"/>
-            <w:vMerge w:val="continue"/>
-            <w:tcBorders>
-              <w:left w:val="single" w:sz="2" w:space="0" w:color="000000"/>
-              <w:bottom w:val="single" w:sz="2" w:space="0" w:color="000000"/>
-            </w:tcBorders>
-          </w:tcPr>
-          <w:p>
-            <w:pPr>
-              <w:pStyle w:val="TableContents"/>
-              <w:widowControl w:val="false"/>
-              <w:bidi w:val="0"/>
-              <w:jc w:val="center"/>
-              <w:rPr/>
-            </w:pPr>
-            <w:r>
-              <w:rPr/>
-            </w:r>
-          </w:p>
-        </w:tc>
-        <w:tc>
-          <w:tcPr>
-            <w:tcW w:w="450" w:type="dxa"/>
+            <w:tcW w:w="2731" w:type="dxa"/>
+            <w:vMerge w:val="continue"/>
+            <w:tcBorders>
+              <w:left w:val="single" w:sz="2" w:space="0" w:color="000000"/>
+              <w:bottom w:val="single" w:sz="2" w:space="0" w:color="000000"/>
+            </w:tcBorders>
+          </w:tcPr>
+          <w:p>
+            <w:pPr>
+              <w:pStyle w:val="TableContents"/>
+              <w:widowControl w:val="false"/>
+              <w:bidi w:val="0"/>
+              <w:jc w:val="left"/>
+              <w:rPr/>
+            </w:pPr>
+            <w:r>
+              <w:rPr/>
+            </w:r>
+          </w:p>
+        </w:tc>
+        <w:tc>
+          <w:tcPr>
+            <w:tcW w:w="450" w:type="dxa"/>
+            <w:vMerge w:val="continue"/>
+            <w:tcBorders>
+              <w:left w:val="single" w:sz="2" w:space="0" w:color="000000"/>
+              <w:bottom w:val="single" w:sz="2" w:space="0" w:color="000000"/>
+            </w:tcBorders>
+          </w:tcPr>
+          <w:p>
+            <w:pPr>
+              <w:pStyle w:val="TableContents"/>
+              <w:widowControl w:val="false"/>
+              <w:bidi w:val="0"/>
+              <w:jc w:val="center"/>
+              <w:rPr/>
+            </w:pPr>
+            <w:r>
+              <w:rPr/>
+            </w:r>
+          </w:p>
+        </w:tc>
+        <w:tc>
+          <w:tcPr>
+            <w:tcW w:w="451" w:type="dxa"/>
             <w:vMerge w:val="continue"/>
             <w:tcBorders>
               <w:left w:val="single" w:sz="2" w:space="0" w:color="000000"/>
@@ -3542,7 +3542,7 @@
         </w:tc>
         <w:tc>
           <w:tcPr>
-            <w:tcW w:w="4500" w:type="dxa"/>
+            <w:tcW w:w="4501" w:type="dxa"/>
             <w:tcBorders>
               <w:left w:val="single" w:sz="2" w:space="0" w:color="000000"/>
               <w:bottom w:val="single" w:sz="2" w:space="0" w:color="000000"/>
@@ -3564,7 +3564,7 @@
         </w:tc>
         <w:tc>
           <w:tcPr>
-            <w:tcW w:w="2836" w:type="dxa"/>
+            <w:tcW w:w="2835" w:type="dxa"/>
             <w:vMerge w:val="continue"/>
             <w:tcBorders>
               <w:left w:val="single" w:sz="2" w:space="0" w:color="000000"/>
@@ -3590,7 +3590,7 @@
         <w:trPr/>
         <w:tc>
           <w:tcPr>
-            <w:tcW w:w="2732" w:type="dxa"/>
+            <w:tcW w:w="2731" w:type="dxa"/>
             <w:vMerge w:val="restart"/>
             <w:tcBorders>
               <w:left w:val="single" w:sz="2" w:space="0" w:color="000000"/>
@@ -3636,7 +3636,7 @@
         </w:tc>
         <w:tc>
           <w:tcPr>
-            <w:tcW w:w="450" w:type="dxa"/>
+            <w:tcW w:w="451" w:type="dxa"/>
             <w:vMerge w:val="restart"/>
             <w:tcBorders>
               <w:left w:val="single" w:sz="2" w:space="0" w:color="000000"/>
@@ -3720,13 +3720,13 @@
             </w:pPr>
             <w:r>
               <w:rPr/>
-              <w:t>Update:approve-requests</w:t>
-            </w:r>
-          </w:p>
-        </w:tc>
-        <w:tc>
-          <w:tcPr>
-            <w:tcW w:w="4500" w:type="dxa"/>
+              <w:t>update:approve-requests</w:t>
+            </w:r>
+          </w:p>
+        </w:tc>
+        <w:tc>
+          <w:tcPr>
+            <w:tcW w:w="4501" w:type="dxa"/>
             <w:tcBorders>
               <w:left w:val="single" w:sz="2" w:space="0" w:color="000000"/>
               <w:bottom w:val="single" w:sz="2" w:space="0" w:color="000000"/>
@@ -3748,7 +3748,7 @@
         </w:tc>
         <w:tc>
           <w:tcPr>
-            <w:tcW w:w="2836" w:type="dxa"/>
+            <w:tcW w:w="2835" w:type="dxa"/>
             <w:vMerge w:val="continue"/>
             <w:tcBorders>
               <w:left w:val="single" w:sz="2" w:space="0" w:color="000000"/>
@@ -3774,51 +3774,51 @@
         <w:trPr/>
         <w:tc>
           <w:tcPr>
-            <w:tcW w:w="2732" w:type="dxa"/>
-            <w:vMerge w:val="continue"/>
-            <w:tcBorders>
-              <w:left w:val="single" w:sz="2" w:space="0" w:color="000000"/>
-              <w:bottom w:val="single" w:sz="2" w:space="0" w:color="000000"/>
-            </w:tcBorders>
-          </w:tcPr>
-          <w:p>
-            <w:pPr>
-              <w:pStyle w:val="TableContents"/>
-              <w:widowControl w:val="false"/>
-              <w:bidi w:val="0"/>
-              <w:jc w:val="left"/>
-              <w:rPr/>
-            </w:pPr>
-            <w:r>
-              <w:rPr/>
-            </w:r>
-          </w:p>
-        </w:tc>
-        <w:tc>
-          <w:tcPr>
-            <w:tcW w:w="450" w:type="dxa"/>
-            <w:vMerge w:val="continue"/>
-            <w:tcBorders>
-              <w:left w:val="single" w:sz="2" w:space="0" w:color="000000"/>
-              <w:bottom w:val="single" w:sz="2" w:space="0" w:color="000000"/>
-            </w:tcBorders>
-          </w:tcPr>
-          <w:p>
-            <w:pPr>
-              <w:pStyle w:val="TableContents"/>
-              <w:widowControl w:val="false"/>
-              <w:bidi w:val="0"/>
-              <w:jc w:val="center"/>
-              <w:rPr/>
-            </w:pPr>
-            <w:r>
-              <w:rPr/>
-            </w:r>
-          </w:p>
-        </w:tc>
-        <w:tc>
-          <w:tcPr>
-            <w:tcW w:w="450" w:type="dxa"/>
+            <w:tcW w:w="2731" w:type="dxa"/>
+            <w:vMerge w:val="continue"/>
+            <w:tcBorders>
+              <w:left w:val="single" w:sz="2" w:space="0" w:color="000000"/>
+              <w:bottom w:val="single" w:sz="2" w:space="0" w:color="000000"/>
+            </w:tcBorders>
+          </w:tcPr>
+          <w:p>
+            <w:pPr>
+              <w:pStyle w:val="TableContents"/>
+              <w:widowControl w:val="false"/>
+              <w:bidi w:val="0"/>
+              <w:jc w:val="left"/>
+              <w:rPr/>
+            </w:pPr>
+            <w:r>
+              <w:rPr/>
+            </w:r>
+          </w:p>
+        </w:tc>
+        <w:tc>
+          <w:tcPr>
+            <w:tcW w:w="450" w:type="dxa"/>
+            <w:vMerge w:val="continue"/>
+            <w:tcBorders>
+              <w:left w:val="single" w:sz="2" w:space="0" w:color="000000"/>
+              <w:bottom w:val="single" w:sz="2" w:space="0" w:color="000000"/>
+            </w:tcBorders>
+          </w:tcPr>
+          <w:p>
+            <w:pPr>
+              <w:pStyle w:val="TableContents"/>
+              <w:widowControl w:val="false"/>
+              <w:bidi w:val="0"/>
+              <w:jc w:val="center"/>
+              <w:rPr/>
+            </w:pPr>
+            <w:r>
+              <w:rPr/>
+            </w:r>
+          </w:p>
+        </w:tc>
+        <w:tc>
+          <w:tcPr>
+            <w:tcW w:w="451" w:type="dxa"/>
             <w:vMerge w:val="continue"/>
             <w:tcBorders>
               <w:left w:val="single" w:sz="2" w:space="0" w:color="000000"/>
@@ -3906,7 +3906,7 @@
         </w:tc>
         <w:tc>
           <w:tcPr>
-            <w:tcW w:w="4500" w:type="dxa"/>
+            <w:tcW w:w="4501" w:type="dxa"/>
             <w:tcBorders>
               <w:left w:val="single" w:sz="2" w:space="0" w:color="000000"/>
               <w:bottom w:val="single" w:sz="2" w:space="0" w:color="000000"/>
@@ -3928,7 +3928,7 @@
         </w:tc>
         <w:tc>
           <w:tcPr>
-            <w:tcW w:w="2836" w:type="dxa"/>
+            <w:tcW w:w="2835" w:type="dxa"/>
             <w:vMerge w:val="continue"/>
             <w:tcBorders>
               <w:left w:val="single" w:sz="2" w:space="0" w:color="000000"/>
@@ -3954,7 +3954,7 @@
         <w:trPr/>
         <w:tc>
           <w:tcPr>
-            <w:tcW w:w="2732" w:type="dxa"/>
+            <w:tcW w:w="2731" w:type="dxa"/>
             <w:vMerge w:val="restart"/>
             <w:tcBorders>
               <w:left w:val="single" w:sz="2" w:space="0" w:color="000000"/>
@@ -4000,7 +4000,7 @@
         </w:tc>
         <w:tc>
           <w:tcPr>
-            <w:tcW w:w="450" w:type="dxa"/>
+            <w:tcW w:w="451" w:type="dxa"/>
             <w:vMerge w:val="restart"/>
             <w:tcBorders>
               <w:left w:val="single" w:sz="2" w:space="0" w:color="000000"/>
@@ -4084,47 +4084,35 @@
             </w:pPr>
             <w:r>
               <w:rPr/>
-              <w:t>create</w:t>
-            </w:r>
-            <w:r>
-              <w:rPr/>
-              <w:t>:transactions</w:t>
-            </w:r>
-          </w:p>
-        </w:tc>
-        <w:tc>
-          <w:tcPr>
-            <w:tcW w:w="4500" w:type="dxa"/>
-            <w:tcBorders>
-              <w:left w:val="single" w:sz="2" w:space="0" w:color="000000"/>
-              <w:bottom w:val="single" w:sz="2" w:space="0" w:color="000000"/>
-            </w:tcBorders>
-          </w:tcPr>
-          <w:p>
-            <w:pPr>
-              <w:pStyle w:val="TableContents"/>
-              <w:widowControl w:val="false"/>
-              <w:bidi w:val="0"/>
-              <w:jc w:val="left"/>
-              <w:rPr/>
-            </w:pPr>
-            <w:r>
-              <w:rPr/>
-              <w:t>GET /transactions/:</w:t>
-            </w:r>
-            <w:r>
-              <w:rPr/>
-              <w:t>requestid</w:t>
-            </w:r>
-            <w:r>
-              <w:rPr/>
-              <w:t>/in</w:t>
-            </w:r>
-          </w:p>
-        </w:tc>
-        <w:tc>
-          <w:tcPr>
-            <w:tcW w:w="2836" w:type="dxa"/>
+              <w:t>create:transactions</w:t>
+            </w:r>
+          </w:p>
+        </w:tc>
+        <w:tc>
+          <w:tcPr>
+            <w:tcW w:w="4501" w:type="dxa"/>
+            <w:tcBorders>
+              <w:left w:val="single" w:sz="2" w:space="0" w:color="000000"/>
+              <w:bottom w:val="single" w:sz="2" w:space="0" w:color="000000"/>
+            </w:tcBorders>
+          </w:tcPr>
+          <w:p>
+            <w:pPr>
+              <w:pStyle w:val="TableContents"/>
+              <w:widowControl w:val="false"/>
+              <w:bidi w:val="0"/>
+              <w:jc w:val="left"/>
+              <w:rPr/>
+            </w:pPr>
+            <w:r>
+              <w:rPr/>
+              <w:t>GET /transactions/:requestid/in</w:t>
+            </w:r>
+          </w:p>
+        </w:tc>
+        <w:tc>
+          <w:tcPr>
+            <w:tcW w:w="2835" w:type="dxa"/>
             <w:vMerge w:val="restart"/>
             <w:tcBorders>
               <w:left w:val="single" w:sz="2" w:space="0" w:color="000000"/>
@@ -4151,51 +4139,51 @@
         <w:trPr/>
         <w:tc>
           <w:tcPr>
-            <w:tcW w:w="2732" w:type="dxa"/>
-            <w:vMerge w:val="continue"/>
-            <w:tcBorders>
-              <w:left w:val="single" w:sz="2" w:space="0" w:color="000000"/>
-              <w:bottom w:val="single" w:sz="2" w:space="0" w:color="000000"/>
-            </w:tcBorders>
-          </w:tcPr>
-          <w:p>
-            <w:pPr>
-              <w:pStyle w:val="TableContents"/>
-              <w:widowControl w:val="false"/>
-              <w:bidi w:val="0"/>
-              <w:jc w:val="left"/>
-              <w:rPr/>
-            </w:pPr>
-            <w:r>
-              <w:rPr/>
-            </w:r>
-          </w:p>
-        </w:tc>
-        <w:tc>
-          <w:tcPr>
-            <w:tcW w:w="450" w:type="dxa"/>
-            <w:vMerge w:val="continue"/>
-            <w:tcBorders>
-              <w:left w:val="single" w:sz="2" w:space="0" w:color="000000"/>
-              <w:bottom w:val="single" w:sz="2" w:space="0" w:color="000000"/>
-            </w:tcBorders>
-          </w:tcPr>
-          <w:p>
-            <w:pPr>
-              <w:pStyle w:val="TableContents"/>
-              <w:widowControl w:val="false"/>
-              <w:bidi w:val="0"/>
-              <w:jc w:val="center"/>
-              <w:rPr/>
-            </w:pPr>
-            <w:r>
-              <w:rPr/>
-            </w:r>
-          </w:p>
-        </w:tc>
-        <w:tc>
-          <w:tcPr>
-            <w:tcW w:w="450" w:type="dxa"/>
+            <w:tcW w:w="2731" w:type="dxa"/>
+            <w:vMerge w:val="continue"/>
+            <w:tcBorders>
+              <w:left w:val="single" w:sz="2" w:space="0" w:color="000000"/>
+              <w:bottom w:val="single" w:sz="2" w:space="0" w:color="000000"/>
+            </w:tcBorders>
+          </w:tcPr>
+          <w:p>
+            <w:pPr>
+              <w:pStyle w:val="TableContents"/>
+              <w:widowControl w:val="false"/>
+              <w:bidi w:val="0"/>
+              <w:jc w:val="left"/>
+              <w:rPr/>
+            </w:pPr>
+            <w:r>
+              <w:rPr/>
+            </w:r>
+          </w:p>
+        </w:tc>
+        <w:tc>
+          <w:tcPr>
+            <w:tcW w:w="450" w:type="dxa"/>
+            <w:vMerge w:val="continue"/>
+            <w:tcBorders>
+              <w:left w:val="single" w:sz="2" w:space="0" w:color="000000"/>
+              <w:bottom w:val="single" w:sz="2" w:space="0" w:color="000000"/>
+            </w:tcBorders>
+          </w:tcPr>
+          <w:p>
+            <w:pPr>
+              <w:pStyle w:val="TableContents"/>
+              <w:widowControl w:val="false"/>
+              <w:bidi w:val="0"/>
+              <w:jc w:val="center"/>
+              <w:rPr/>
+            </w:pPr>
+            <w:r>
+              <w:rPr/>
+            </w:r>
+          </w:p>
+        </w:tc>
+        <w:tc>
+          <w:tcPr>
+            <w:tcW w:w="451" w:type="dxa"/>
             <w:vMerge w:val="continue"/>
             <w:tcBorders>
               <w:left w:val="single" w:sz="2" w:space="0" w:color="000000"/>
@@ -4283,37 +4271,29 @@
         </w:tc>
         <w:tc>
           <w:tcPr>
-            <w:tcW w:w="4500" w:type="dxa"/>
-            <w:tcBorders>
-              <w:left w:val="single" w:sz="2" w:space="0" w:color="000000"/>
-              <w:bottom w:val="single" w:sz="2" w:space="0" w:color="000000"/>
-            </w:tcBorders>
-          </w:tcPr>
-          <w:p>
-            <w:pPr>
-              <w:pStyle w:val="TableContents"/>
-              <w:widowControl w:val="false"/>
-              <w:bidi w:val="0"/>
-              <w:jc w:val="left"/>
-              <w:rPr/>
-            </w:pPr>
-            <w:r>
-              <w:rPr/>
-              <w:t>GET /transactions/:</w:t>
-            </w:r>
-            <w:r>
-              <w:rPr/>
-              <w:t>requestid</w:t>
-            </w:r>
-            <w:r>
-              <w:rPr/>
-              <w:t>/out</w:t>
-            </w:r>
-          </w:p>
-        </w:tc>
-        <w:tc>
-          <w:tcPr>
-            <w:tcW w:w="2836" w:type="dxa"/>
+            <w:tcW w:w="4501" w:type="dxa"/>
+            <w:tcBorders>
+              <w:left w:val="single" w:sz="2" w:space="0" w:color="000000"/>
+              <w:bottom w:val="single" w:sz="2" w:space="0" w:color="000000"/>
+            </w:tcBorders>
+          </w:tcPr>
+          <w:p>
+            <w:pPr>
+              <w:pStyle w:val="TableContents"/>
+              <w:widowControl w:val="false"/>
+              <w:bidi w:val="0"/>
+              <w:jc w:val="left"/>
+              <w:rPr/>
+            </w:pPr>
+            <w:r>
+              <w:rPr/>
+              <w:t>GET /transactions/:requestid/out</w:t>
+            </w:r>
+          </w:p>
+        </w:tc>
+        <w:tc>
+          <w:tcPr>
+            <w:tcW w:w="2835" w:type="dxa"/>
             <w:vMerge w:val="continue"/>
             <w:tcBorders>
               <w:left w:val="single" w:sz="2" w:space="0" w:color="000000"/>
@@ -4339,51 +4319,51 @@
         <w:trPr/>
         <w:tc>
           <w:tcPr>
-            <w:tcW w:w="2732" w:type="dxa"/>
-            <w:vMerge w:val="continue"/>
-            <w:tcBorders>
-              <w:left w:val="single" w:sz="2" w:space="0" w:color="000000"/>
-              <w:bottom w:val="single" w:sz="2" w:space="0" w:color="000000"/>
-            </w:tcBorders>
-          </w:tcPr>
-          <w:p>
-            <w:pPr>
-              <w:pStyle w:val="TableContents"/>
-              <w:widowControl w:val="false"/>
-              <w:bidi w:val="0"/>
-              <w:jc w:val="left"/>
-              <w:rPr/>
-            </w:pPr>
-            <w:r>
-              <w:rPr/>
-            </w:r>
-          </w:p>
-        </w:tc>
-        <w:tc>
-          <w:tcPr>
-            <w:tcW w:w="450" w:type="dxa"/>
-            <w:vMerge w:val="continue"/>
-            <w:tcBorders>
-              <w:left w:val="single" w:sz="2" w:space="0" w:color="000000"/>
-              <w:bottom w:val="single" w:sz="2" w:space="0" w:color="000000"/>
-            </w:tcBorders>
-          </w:tcPr>
-          <w:p>
-            <w:pPr>
-              <w:pStyle w:val="TableContents"/>
-              <w:widowControl w:val="false"/>
-              <w:bidi w:val="0"/>
-              <w:jc w:val="center"/>
-              <w:rPr/>
-            </w:pPr>
-            <w:r>
-              <w:rPr/>
-            </w:r>
-          </w:p>
-        </w:tc>
-        <w:tc>
-          <w:tcPr>
-            <w:tcW w:w="450" w:type="dxa"/>
+            <w:tcW w:w="2731" w:type="dxa"/>
+            <w:vMerge w:val="continue"/>
+            <w:tcBorders>
+              <w:left w:val="single" w:sz="2" w:space="0" w:color="000000"/>
+              <w:bottom w:val="single" w:sz="2" w:space="0" w:color="000000"/>
+            </w:tcBorders>
+          </w:tcPr>
+          <w:p>
+            <w:pPr>
+              <w:pStyle w:val="TableContents"/>
+              <w:widowControl w:val="false"/>
+              <w:bidi w:val="0"/>
+              <w:jc w:val="left"/>
+              <w:rPr/>
+            </w:pPr>
+            <w:r>
+              <w:rPr/>
+            </w:r>
+          </w:p>
+        </w:tc>
+        <w:tc>
+          <w:tcPr>
+            <w:tcW w:w="450" w:type="dxa"/>
+            <w:vMerge w:val="continue"/>
+            <w:tcBorders>
+              <w:left w:val="single" w:sz="2" w:space="0" w:color="000000"/>
+              <w:bottom w:val="single" w:sz="2" w:space="0" w:color="000000"/>
+            </w:tcBorders>
+          </w:tcPr>
+          <w:p>
+            <w:pPr>
+              <w:pStyle w:val="TableContents"/>
+              <w:widowControl w:val="false"/>
+              <w:bidi w:val="0"/>
+              <w:jc w:val="center"/>
+              <w:rPr/>
+            </w:pPr>
+            <w:r>
+              <w:rPr/>
+            </w:r>
+          </w:p>
+        </w:tc>
+        <w:tc>
+          <w:tcPr>
+            <w:tcW w:w="451" w:type="dxa"/>
             <w:vMerge w:val="continue"/>
             <w:tcBorders>
               <w:left w:val="single" w:sz="2" w:space="0" w:color="000000"/>
@@ -4471,33 +4451,29 @@
         </w:tc>
         <w:tc>
           <w:tcPr>
-            <w:tcW w:w="4500" w:type="dxa"/>
-            <w:tcBorders>
-              <w:left w:val="single" w:sz="2" w:space="0" w:color="000000"/>
-              <w:bottom w:val="single" w:sz="2" w:space="0" w:color="000000"/>
-            </w:tcBorders>
-          </w:tcPr>
-          <w:p>
-            <w:pPr>
-              <w:pStyle w:val="TableContents"/>
-              <w:widowControl w:val="false"/>
-              <w:bidi w:val="0"/>
-              <w:jc w:val="left"/>
-              <w:rPr/>
-            </w:pPr>
-            <w:r>
-              <w:rPr/>
-              <w:t>POST /transactions/:</w:t>
-            </w:r>
-            <w:r>
-              <w:rPr/>
-              <w:t>requestid</w:t>
-            </w:r>
-          </w:p>
-        </w:tc>
-        <w:tc>
-          <w:tcPr>
-            <w:tcW w:w="2836" w:type="dxa"/>
+            <w:tcW w:w="4501" w:type="dxa"/>
+            <w:tcBorders>
+              <w:left w:val="single" w:sz="2" w:space="0" w:color="000000"/>
+              <w:bottom w:val="single" w:sz="2" w:space="0" w:color="000000"/>
+            </w:tcBorders>
+          </w:tcPr>
+          <w:p>
+            <w:pPr>
+              <w:pStyle w:val="TableContents"/>
+              <w:widowControl w:val="false"/>
+              <w:bidi w:val="0"/>
+              <w:jc w:val="left"/>
+              <w:rPr/>
+            </w:pPr>
+            <w:r>
+              <w:rPr/>
+              <w:t>POST /transactions/:requestid</w:t>
+            </w:r>
+          </w:p>
+        </w:tc>
+        <w:tc>
+          <w:tcPr>
+            <w:tcW w:w="2835" w:type="dxa"/>
             <w:vMerge w:val="continue"/>
             <w:tcBorders>
               <w:left w:val="single" w:sz="2" w:space="0" w:color="000000"/>
@@ -4523,7 +4499,7 @@
         <w:trPr/>
         <w:tc>
           <w:tcPr>
-            <w:tcW w:w="2732" w:type="dxa"/>
+            <w:tcW w:w="2731" w:type="dxa"/>
             <w:vMerge w:val="restart"/>
             <w:tcBorders>
               <w:left w:val="single" w:sz="2" w:space="0" w:color="000000"/>
@@ -4569,7 +4545,7 @@
         </w:tc>
         <w:tc>
           <w:tcPr>
-            <w:tcW w:w="450" w:type="dxa"/>
+            <w:tcW w:w="451" w:type="dxa"/>
             <w:vMerge w:val="restart"/>
             <w:tcBorders>
               <w:left w:val="single" w:sz="2" w:space="0" w:color="000000"/>
@@ -4652,13 +4628,13 @@
             </w:pPr>
             <w:r>
               <w:rPr/>
-              <w:t>Update:transactions</w:t>
-            </w:r>
-          </w:p>
-        </w:tc>
-        <w:tc>
-          <w:tcPr>
-            <w:tcW w:w="4500" w:type="dxa"/>
+              <w:t>update:transactions</w:t>
+            </w:r>
+          </w:p>
+        </w:tc>
+        <w:tc>
+          <w:tcPr>
+            <w:tcW w:w="4501" w:type="dxa"/>
             <w:tcBorders>
               <w:left w:val="single" w:sz="2" w:space="0" w:color="000000"/>
               <w:bottom w:val="single" w:sz="2" w:space="0" w:color="000000"/>
@@ -4680,7 +4656,7 @@
         </w:tc>
         <w:tc>
           <w:tcPr>
-            <w:tcW w:w="2836" w:type="dxa"/>
+            <w:tcW w:w="2835" w:type="dxa"/>
             <w:vMerge w:val="continue"/>
             <w:tcBorders>
               <w:left w:val="single" w:sz="2" w:space="0" w:color="000000"/>
@@ -4706,51 +4682,51 @@
         <w:trPr/>
         <w:tc>
           <w:tcPr>
-            <w:tcW w:w="2732" w:type="dxa"/>
-            <w:vMerge w:val="continue"/>
-            <w:tcBorders>
-              <w:left w:val="single" w:sz="2" w:space="0" w:color="000000"/>
-              <w:bottom w:val="single" w:sz="2" w:space="0" w:color="000000"/>
-            </w:tcBorders>
-          </w:tcPr>
-          <w:p>
-            <w:pPr>
-              <w:pStyle w:val="TableContents"/>
-              <w:widowControl w:val="false"/>
-              <w:bidi w:val="0"/>
-              <w:jc w:val="left"/>
-              <w:rPr/>
-            </w:pPr>
-            <w:r>
-              <w:rPr/>
-            </w:r>
-          </w:p>
-        </w:tc>
-        <w:tc>
-          <w:tcPr>
-            <w:tcW w:w="450" w:type="dxa"/>
-            <w:vMerge w:val="continue"/>
-            <w:tcBorders>
-              <w:left w:val="single" w:sz="2" w:space="0" w:color="000000"/>
-              <w:bottom w:val="single" w:sz="2" w:space="0" w:color="000000"/>
-            </w:tcBorders>
-          </w:tcPr>
-          <w:p>
-            <w:pPr>
-              <w:pStyle w:val="TableContents"/>
-              <w:widowControl w:val="false"/>
-              <w:bidi w:val="0"/>
-              <w:jc w:val="center"/>
-              <w:rPr/>
-            </w:pPr>
-            <w:r>
-              <w:rPr/>
-            </w:r>
-          </w:p>
-        </w:tc>
-        <w:tc>
-          <w:tcPr>
-            <w:tcW w:w="450" w:type="dxa"/>
+            <w:tcW w:w="2731" w:type="dxa"/>
+            <w:vMerge w:val="continue"/>
+            <w:tcBorders>
+              <w:left w:val="single" w:sz="2" w:space="0" w:color="000000"/>
+              <w:bottom w:val="single" w:sz="2" w:space="0" w:color="000000"/>
+            </w:tcBorders>
+          </w:tcPr>
+          <w:p>
+            <w:pPr>
+              <w:pStyle w:val="TableContents"/>
+              <w:widowControl w:val="false"/>
+              <w:bidi w:val="0"/>
+              <w:jc w:val="left"/>
+              <w:rPr/>
+            </w:pPr>
+            <w:r>
+              <w:rPr/>
+            </w:r>
+          </w:p>
+        </w:tc>
+        <w:tc>
+          <w:tcPr>
+            <w:tcW w:w="450" w:type="dxa"/>
+            <w:vMerge w:val="continue"/>
+            <w:tcBorders>
+              <w:left w:val="single" w:sz="2" w:space="0" w:color="000000"/>
+              <w:bottom w:val="single" w:sz="2" w:space="0" w:color="000000"/>
+            </w:tcBorders>
+          </w:tcPr>
+          <w:p>
+            <w:pPr>
+              <w:pStyle w:val="TableContents"/>
+              <w:widowControl w:val="false"/>
+              <w:bidi w:val="0"/>
+              <w:jc w:val="center"/>
+              <w:rPr/>
+            </w:pPr>
+            <w:r>
+              <w:rPr/>
+            </w:r>
+          </w:p>
+        </w:tc>
+        <w:tc>
+          <w:tcPr>
+            <w:tcW w:w="451" w:type="dxa"/>
             <w:vMerge w:val="continue"/>
             <w:tcBorders>
               <w:left w:val="single" w:sz="2" w:space="0" w:color="000000"/>
@@ -4838,7 +4814,7 @@
         </w:tc>
         <w:tc>
           <w:tcPr>
-            <w:tcW w:w="4500" w:type="dxa"/>
+            <w:tcW w:w="4501" w:type="dxa"/>
             <w:tcBorders>
               <w:left w:val="single" w:sz="2" w:space="0" w:color="000000"/>
               <w:bottom w:val="single" w:sz="2" w:space="0" w:color="000000"/>
@@ -4860,7 +4836,7 @@
         </w:tc>
         <w:tc>
           <w:tcPr>
-            <w:tcW w:w="2836" w:type="dxa"/>
+            <w:tcW w:w="2835" w:type="dxa"/>
             <w:vMerge w:val="continue"/>
             <w:tcBorders>
               <w:left w:val="single" w:sz="2" w:space="0" w:color="000000"/>
@@ -4886,7 +4862,7 @@
         <w:trPr/>
         <w:tc>
           <w:tcPr>
-            <w:tcW w:w="2732" w:type="dxa"/>
+            <w:tcW w:w="2731" w:type="dxa"/>
             <w:tcBorders>
               <w:left w:val="single" w:sz="2" w:space="0" w:color="000000"/>
               <w:bottom w:val="single" w:sz="2" w:space="0" w:color="000000"/>
@@ -4930,7 +4906,7 @@
         </w:tc>
         <w:tc>
           <w:tcPr>
-            <w:tcW w:w="450" w:type="dxa"/>
+            <w:tcW w:w="451" w:type="dxa"/>
             <w:tcBorders>
               <w:left w:val="single" w:sz="2" w:space="0" w:color="000000"/>
               <w:bottom w:val="single" w:sz="2" w:space="0" w:color="000000"/>
@@ -5010,13 +4986,13 @@
             </w:pPr>
             <w:r>
               <w:rPr/>
-              <w:t>View:transactions</w:t>
-            </w:r>
-          </w:p>
-        </w:tc>
-        <w:tc>
-          <w:tcPr>
-            <w:tcW w:w="4500" w:type="dxa"/>
+              <w:t>view:transactions</w:t>
+            </w:r>
+          </w:p>
+        </w:tc>
+        <w:tc>
+          <w:tcPr>
+            <w:tcW w:w="4501" w:type="dxa"/>
             <w:tcBorders>
               <w:left w:val="single" w:sz="2" w:space="0" w:color="000000"/>
               <w:bottom w:val="single" w:sz="2" w:space="0" w:color="000000"/>
@@ -5038,7 +5014,7 @@
         </w:tc>
         <w:tc>
           <w:tcPr>
-            <w:tcW w:w="2836" w:type="dxa"/>
+            <w:tcW w:w="2835" w:type="dxa"/>
             <w:vMerge w:val="continue"/>
             <w:tcBorders>
               <w:left w:val="single" w:sz="2" w:space="0" w:color="000000"/>
@@ -5064,7 +5040,7 @@
         <w:trPr/>
         <w:tc>
           <w:tcPr>
-            <w:tcW w:w="2732" w:type="dxa"/>
+            <w:tcW w:w="2731" w:type="dxa"/>
             <w:tcBorders>
               <w:left w:val="single" w:sz="2" w:space="0" w:color="000000"/>
               <w:bottom w:val="single" w:sz="2" w:space="0" w:color="000000"/>
@@ -5108,7 +5084,7 @@
         </w:tc>
         <w:tc>
           <w:tcPr>
-            <w:tcW w:w="450" w:type="dxa"/>
+            <w:tcW w:w="451" w:type="dxa"/>
             <w:tcBorders>
               <w:left w:val="single" w:sz="2" w:space="0" w:color="000000"/>
               <w:bottom w:val="single" w:sz="2" w:space="0" w:color="000000"/>
@@ -5188,13 +5164,13 @@
             </w:pPr>
             <w:r>
               <w:rPr/>
-              <w:t>View-any:transactions</w:t>
-            </w:r>
-          </w:p>
-        </w:tc>
-        <w:tc>
-          <w:tcPr>
-            <w:tcW w:w="4500" w:type="dxa"/>
+              <w:t>view-any:transactions</w:t>
+            </w:r>
+          </w:p>
+        </w:tc>
+        <w:tc>
+          <w:tcPr>
+            <w:tcW w:w="4501" w:type="dxa"/>
             <w:tcBorders>
               <w:left w:val="single" w:sz="2" w:space="0" w:color="000000"/>
               <w:bottom w:val="single" w:sz="2" w:space="0" w:color="000000"/>
@@ -5216,7 +5192,7 @@
         </w:tc>
         <w:tc>
           <w:tcPr>
-            <w:tcW w:w="2836" w:type="dxa"/>
+            <w:tcW w:w="2835" w:type="dxa"/>
             <w:vMerge w:val="continue"/>
             <w:tcBorders>
               <w:left w:val="single" w:sz="2" w:space="0" w:color="000000"/>
@@ -5287,7 +5263,7 @@
     <w:pPr>
       <w:widowControl/>
       <w:suppressAutoHyphens w:val="true"/>
-      <w:overflowPunct w:val="true"/>
+      <w:overflowPunct w:val="false"/>
       <w:bidi w:val="0"/>
       <w:spacing w:before="0" w:after="0"/>
       <w:jc w:val="left"/>

</xml_diff>